<commit_message>
belajar: sinkronisasi otomatis memori neuron dan pengetahuan (2026-08-27 08:33:05)
</commit_message>
<xml_diff>
--- a/Panduan Struktur Prompt AI.docx
+++ b/Panduan Struktur Prompt AI.docx
@@ -30,7 +30,7 @@
     </w:p>
     <w:p>
       <w:pPr>
-        <w:spacing w:before="160" w:after="80"/>
+        <w:spacing w:before="120" w:after="80"/>
       </w:pPr>
       <w:r>
         <w:rPr>
@@ -47,15 +47,15 @@
         <w:tblLook w:firstColumn="1" w:firstRow="1" w:lastColumn="0" w:lastRow="0" w:noHBand="0" w:noVBand="1" w:val="04A0"/>
       </w:tblPr>
       <w:tblGrid>
-        <w:gridCol w:w="2484"/>
-        <w:gridCol w:w="2484"/>
-        <w:gridCol w:w="2484"/>
-        <w:gridCol w:w="2484"/>
+        <w:gridCol w:w="2409"/>
+        <w:gridCol w:w="2409"/>
+        <w:gridCol w:w="2409"/>
+        <w:gridCol w:w="2409"/>
       </w:tblGrid>
       <w:tr>
         <w:tc>
           <w:tcPr>
-            <w:tcW w:type="dxa" w:w="576"/>
+            <w:tcW w:type="dxa" w:w="567"/>
             <w:vAlign w:val="top"/>
             <w:tcBorders>
               <w:top w:val="single" w:sz="4" w:space="0" w:color="000000"/>
@@ -86,7 +86,7 @@
         </w:tc>
         <w:tc>
           <w:tcPr>
-            <w:tcW w:type="dxa" w:w="1872"/>
+            <w:tcW w:type="dxa" w:w="1814"/>
             <w:vAlign w:val="top"/>
             <w:tcBorders>
               <w:top w:val="single" w:sz="4" w:space="0" w:color="000000"/>
@@ -116,7 +116,7 @@
         </w:tc>
         <w:tc>
           <w:tcPr>
-            <w:tcW w:type="dxa" w:w="3600"/>
+            <w:tcW w:type="dxa" w:w="3572"/>
             <w:vAlign w:val="top"/>
             <w:tcBorders>
               <w:top w:val="single" w:sz="4" w:space="0" w:color="000000"/>
@@ -146,7 +146,7 @@
         </w:tc>
         <w:tc>
           <w:tcPr>
-            <w:tcW w:type="dxa" w:w="3744"/>
+            <w:tcW w:type="dxa" w:w="3685"/>
             <w:vAlign w:val="top"/>
             <w:tcBorders>
               <w:top w:val="single" w:sz="4" w:space="0" w:color="000000"/>
@@ -178,7 +178,7 @@
       <w:tr>
         <w:tc>
           <w:tcPr>
-            <w:tcW w:type="dxa" w:w="576"/>
+            <w:tcW w:type="dxa" w:w="567"/>
             <w:vAlign w:val="top"/>
             <w:tcBorders>
               <w:top w:val="single" w:sz="4" w:space="0" w:color="000000"/>
@@ -208,7 +208,7 @@
         </w:tc>
         <w:tc>
           <w:tcPr>
-            <w:tcW w:type="dxa" w:w="1872"/>
+            <w:tcW w:type="dxa" w:w="1814"/>
             <w:vAlign w:val="top"/>
             <w:tcBorders>
               <w:top w:val="single" w:sz="4" w:space="0" w:color="000000"/>
@@ -238,7 +238,7 @@
         </w:tc>
         <w:tc>
           <w:tcPr>
-            <w:tcW w:type="dxa" w:w="3600"/>
+            <w:tcW w:type="dxa" w:w="3572"/>
             <w:vAlign w:val="top"/>
             <w:tcBorders>
               <w:top w:val="single" w:sz="4" w:space="0" w:color="000000"/>
@@ -267,7 +267,7 @@
         </w:tc>
         <w:tc>
           <w:tcPr>
-            <w:tcW w:type="dxa" w:w="3744"/>
+            <w:tcW w:type="dxa" w:w="3685"/>
             <w:vAlign w:val="top"/>
             <w:tcBorders>
               <w:top w:val="single" w:sz="4" w:space="0" w:color="000000"/>
@@ -298,7 +298,7 @@
       <w:tr>
         <w:tc>
           <w:tcPr>
-            <w:tcW w:type="dxa" w:w="576"/>
+            <w:tcW w:type="dxa" w:w="567"/>
             <w:vAlign w:val="top"/>
             <w:tcBorders>
               <w:top w:val="single" w:sz="4" w:space="0" w:color="000000"/>
@@ -328,7 +328,7 @@
         </w:tc>
         <w:tc>
           <w:tcPr>
-            <w:tcW w:type="dxa" w:w="1872"/>
+            <w:tcW w:type="dxa" w:w="1814"/>
             <w:vAlign w:val="top"/>
             <w:tcBorders>
               <w:top w:val="single" w:sz="4" w:space="0" w:color="000000"/>
@@ -358,7 +358,7 @@
         </w:tc>
         <w:tc>
           <w:tcPr>
-            <w:tcW w:type="dxa" w:w="3600"/>
+            <w:tcW w:type="dxa" w:w="3572"/>
             <w:vAlign w:val="top"/>
             <w:tcBorders>
               <w:top w:val="single" w:sz="4" w:space="0" w:color="000000"/>
@@ -387,7 +387,7 @@
         </w:tc>
         <w:tc>
           <w:tcPr>
-            <w:tcW w:type="dxa" w:w="3744"/>
+            <w:tcW w:type="dxa" w:w="3685"/>
             <w:vAlign w:val="top"/>
             <w:tcBorders>
               <w:top w:val="single" w:sz="4" w:space="0" w:color="000000"/>
@@ -418,7 +418,7 @@
       <w:tr>
         <w:tc>
           <w:tcPr>
-            <w:tcW w:type="dxa" w:w="576"/>
+            <w:tcW w:type="dxa" w:w="567"/>
             <w:vAlign w:val="top"/>
             <w:tcBorders>
               <w:top w:val="single" w:sz="4" w:space="0" w:color="000000"/>
@@ -448,7 +448,7 @@
         </w:tc>
         <w:tc>
           <w:tcPr>
-            <w:tcW w:type="dxa" w:w="1872"/>
+            <w:tcW w:type="dxa" w:w="1814"/>
             <w:vAlign w:val="top"/>
             <w:tcBorders>
               <w:top w:val="single" w:sz="4" w:space="0" w:color="000000"/>
@@ -478,7 +478,7 @@
         </w:tc>
         <w:tc>
           <w:tcPr>
-            <w:tcW w:type="dxa" w:w="3600"/>
+            <w:tcW w:type="dxa" w:w="3572"/>
             <w:vAlign w:val="top"/>
             <w:tcBorders>
               <w:top w:val="single" w:sz="4" w:space="0" w:color="000000"/>
@@ -507,7 +507,7 @@
         </w:tc>
         <w:tc>
           <w:tcPr>
-            <w:tcW w:type="dxa" w:w="3744"/>
+            <w:tcW w:type="dxa" w:w="3685"/>
             <w:vAlign w:val="top"/>
             <w:tcBorders>
               <w:top w:val="single" w:sz="4" w:space="0" w:color="000000"/>
@@ -538,7 +538,7 @@
       <w:tr>
         <w:tc>
           <w:tcPr>
-            <w:tcW w:type="dxa" w:w="576"/>
+            <w:tcW w:type="dxa" w:w="567"/>
             <w:vAlign w:val="top"/>
             <w:tcBorders>
               <w:top w:val="single" w:sz="4" w:space="0" w:color="000000"/>
@@ -568,7 +568,7 @@
         </w:tc>
         <w:tc>
           <w:tcPr>
-            <w:tcW w:type="dxa" w:w="1872"/>
+            <w:tcW w:type="dxa" w:w="1814"/>
             <w:vAlign w:val="top"/>
             <w:tcBorders>
               <w:top w:val="single" w:sz="4" w:space="0" w:color="000000"/>
@@ -598,7 +598,7 @@
         </w:tc>
         <w:tc>
           <w:tcPr>
-            <w:tcW w:type="dxa" w:w="3600"/>
+            <w:tcW w:type="dxa" w:w="3572"/>
             <w:vAlign w:val="top"/>
             <w:tcBorders>
               <w:top w:val="single" w:sz="4" w:space="0" w:color="000000"/>
@@ -627,7 +627,7 @@
         </w:tc>
         <w:tc>
           <w:tcPr>
-            <w:tcW w:type="dxa" w:w="3744"/>
+            <w:tcW w:type="dxa" w:w="3685"/>
             <w:vAlign w:val="top"/>
             <w:tcBorders>
               <w:top w:val="single" w:sz="4" w:space="0" w:color="000000"/>
@@ -658,7 +658,7 @@
       <w:tr>
         <w:tc>
           <w:tcPr>
-            <w:tcW w:type="dxa" w:w="576"/>
+            <w:tcW w:type="dxa" w:w="567"/>
             <w:vAlign w:val="top"/>
             <w:tcBorders>
               <w:top w:val="single" w:sz="4" w:space="0" w:color="000000"/>
@@ -688,7 +688,7 @@
         </w:tc>
         <w:tc>
           <w:tcPr>
-            <w:tcW w:type="dxa" w:w="1872"/>
+            <w:tcW w:type="dxa" w:w="1814"/>
             <w:vAlign w:val="top"/>
             <w:tcBorders>
               <w:top w:val="single" w:sz="4" w:space="0" w:color="000000"/>
@@ -718,7 +718,7 @@
         </w:tc>
         <w:tc>
           <w:tcPr>
-            <w:tcW w:type="dxa" w:w="3600"/>
+            <w:tcW w:type="dxa" w:w="3572"/>
             <w:vAlign w:val="top"/>
             <w:tcBorders>
               <w:top w:val="single" w:sz="4" w:space="0" w:color="000000"/>
@@ -747,7 +747,7 @@
         </w:tc>
         <w:tc>
           <w:tcPr>
-            <w:tcW w:type="dxa" w:w="3744"/>
+            <w:tcW w:type="dxa" w:w="3685"/>
             <w:vAlign w:val="top"/>
             <w:tcBorders>
               <w:top w:val="single" w:sz="4" w:space="0" w:color="000000"/>
@@ -778,7 +778,7 @@
       <w:tr>
         <w:tc>
           <w:tcPr>
-            <w:tcW w:type="dxa" w:w="576"/>
+            <w:tcW w:type="dxa" w:w="567"/>
             <w:vAlign w:val="top"/>
             <w:tcBorders>
               <w:top w:val="single" w:sz="4" w:space="0" w:color="000000"/>
@@ -808,7 +808,7 @@
         </w:tc>
         <w:tc>
           <w:tcPr>
-            <w:tcW w:type="dxa" w:w="1872"/>
+            <w:tcW w:type="dxa" w:w="1814"/>
             <w:vAlign w:val="top"/>
             <w:tcBorders>
               <w:top w:val="single" w:sz="4" w:space="0" w:color="000000"/>
@@ -838,7 +838,7 @@
         </w:tc>
         <w:tc>
           <w:tcPr>
-            <w:tcW w:type="dxa" w:w="3600"/>
+            <w:tcW w:type="dxa" w:w="3572"/>
             <w:vAlign w:val="top"/>
             <w:tcBorders>
               <w:top w:val="single" w:sz="4" w:space="0" w:color="000000"/>
@@ -867,7 +867,7 @@
         </w:tc>
         <w:tc>
           <w:tcPr>
-            <w:tcW w:type="dxa" w:w="3744"/>
+            <w:tcW w:type="dxa" w:w="3685"/>
             <w:vAlign w:val="top"/>
             <w:tcBorders>
               <w:top w:val="single" w:sz="4" w:space="0" w:color="000000"/>
@@ -898,7 +898,7 @@
       <w:tr>
         <w:tc>
           <w:tcPr>
-            <w:tcW w:type="dxa" w:w="576"/>
+            <w:tcW w:type="dxa" w:w="567"/>
             <w:vAlign w:val="top"/>
             <w:tcBorders>
               <w:top w:val="single" w:sz="4" w:space="0" w:color="000000"/>
@@ -928,7 +928,7 @@
         </w:tc>
         <w:tc>
           <w:tcPr>
-            <w:tcW w:type="dxa" w:w="1872"/>
+            <w:tcW w:type="dxa" w:w="1814"/>
             <w:vAlign w:val="top"/>
             <w:tcBorders>
               <w:top w:val="single" w:sz="4" w:space="0" w:color="000000"/>
@@ -958,7 +958,7 @@
         </w:tc>
         <w:tc>
           <w:tcPr>
-            <w:tcW w:type="dxa" w:w="3600"/>
+            <w:tcW w:type="dxa" w:w="3572"/>
             <w:vAlign w:val="top"/>
             <w:tcBorders>
               <w:top w:val="single" w:sz="4" w:space="0" w:color="000000"/>
@@ -987,7 +987,7 @@
         </w:tc>
         <w:tc>
           <w:tcPr>
-            <w:tcW w:type="dxa" w:w="3744"/>
+            <w:tcW w:type="dxa" w:w="3685"/>
             <w:vAlign w:val="top"/>
             <w:tcBorders>
               <w:top w:val="single" w:sz="4" w:space="0" w:color="000000"/>
@@ -1018,7 +1018,7 @@
     </w:tbl>
     <w:p>
       <w:pPr>
-        <w:spacing w:before="280" w:after="80"/>
+        <w:spacing w:before="240" w:after="80"/>
       </w:pPr>
       <w:r>
         <w:rPr>
@@ -1035,12 +1035,12 @@
         <w:tblLook w:firstColumn="1" w:firstRow="1" w:lastColumn="0" w:lastRow="0" w:noHBand="0" w:noVBand="1" w:val="04A0"/>
       </w:tblPr>
       <w:tblGrid>
-        <w:gridCol w:w="9936"/>
+        <w:gridCol w:w="9638"/>
       </w:tblGrid>
       <w:tr>
         <w:tc>
           <w:tcPr>
-            <w:tcW w:type="dxa" w:w="9792"/>
+            <w:tcW w:type="dxa" w:w="9638"/>
             <w:tcBorders>
               <w:top w:val="single" w:sz="6" w:space="0" w:color="000000"/>
               <w:left w:val="single" w:sz="6" w:space="0" w:color="000000"/>
@@ -1048,15 +1048,15 @@
               <w:right w:val="single" w:sz="6" w:space="0" w:color="000000"/>
             </w:tcBorders>
             <w:tcMar>
-              <w:top w:w="140" w:type="dxa"/>
-              <w:left w:w="160" w:type="dxa"/>
-              <w:bottom w:w="140" w:type="dxa"/>
-              <w:right w:w="160" w:type="dxa"/>
+              <w:top w:w="130" w:type="dxa"/>
+              <w:left w:w="150" w:type="dxa"/>
+              <w:bottom w:w="130" w:type="dxa"/>
+              <w:right w:w="150" w:type="dxa"/>
             </w:tcMar>
           </w:tcPr>
           <w:p>
             <w:pPr>
-              <w:spacing w:before="0" w:after="60" w:line="288" w:lineRule="auto"/>
+              <w:spacing w:before="0" w:after="40" w:line="288" w:lineRule="auto"/>
             </w:pPr>
             <w:r>
               <w:rPr>
@@ -1074,7 +1074,7 @@
           </w:p>
           <w:p>
             <w:pPr>
-              <w:spacing w:before="40" w:after="60" w:line="288" w:lineRule="auto"/>
+              <w:spacing w:before="40" w:after="40" w:line="288" w:lineRule="auto"/>
             </w:pPr>
             <w:r>
               <w:rPr>
@@ -1092,7 +1092,7 @@
           </w:p>
           <w:p>
             <w:pPr>
-              <w:spacing w:before="40" w:after="60" w:line="288" w:lineRule="auto"/>
+              <w:spacing w:before="40" w:after="40" w:line="288" w:lineRule="auto"/>
             </w:pPr>
             <w:r>
               <w:rPr>
@@ -1110,7 +1110,7 @@
           </w:p>
           <w:p>
             <w:pPr>
-              <w:spacing w:before="40" w:after="60" w:line="288" w:lineRule="auto"/>
+              <w:spacing w:before="40" w:after="40" w:line="288" w:lineRule="auto"/>
             </w:pPr>
             <w:r>
               <w:rPr>
@@ -1128,7 +1128,7 @@
           </w:p>
           <w:p>
             <w:pPr>
-              <w:spacing w:before="40" w:after="60" w:line="288" w:lineRule="auto"/>
+              <w:spacing w:before="40" w:after="40" w:line="288" w:lineRule="auto"/>
             </w:pPr>
             <w:r>
               <w:rPr>
@@ -1146,7 +1146,7 @@
           </w:p>
           <w:p>
             <w:pPr>
-              <w:spacing w:before="40" w:after="60" w:line="288" w:lineRule="auto"/>
+              <w:spacing w:before="40" w:after="40" w:line="288" w:lineRule="auto"/>
             </w:pPr>
             <w:r>
               <w:rPr>
@@ -1164,7 +1164,7 @@
           </w:p>
           <w:p>
             <w:pPr>
-              <w:spacing w:before="40" w:after="60" w:line="288" w:lineRule="auto"/>
+              <w:spacing w:before="40" w:after="40" w:line="288" w:lineRule="auto"/>
             </w:pPr>
             <w:r>
               <w:rPr>
@@ -1233,12 +1233,12 @@
         <w:tblLook w:firstColumn="1" w:firstRow="1" w:lastColumn="0" w:lastRow="0" w:noHBand="0" w:noVBand="1" w:val="04A0"/>
       </w:tblPr>
       <w:tblGrid>
-        <w:gridCol w:w="9936"/>
+        <w:gridCol w:w="9638"/>
       </w:tblGrid>
       <w:tr>
         <w:tc>
           <w:tcPr>
-            <w:tcW w:type="dxa" w:w="9792"/>
+            <w:tcW w:type="dxa" w:w="9638"/>
             <w:tcBorders>
               <w:top w:val="single" w:sz="4" w:space="0" w:color="000000"/>
               <w:left w:val="single" w:sz="4" w:space="0" w:color="000000"/>
@@ -1407,12 +1407,12 @@
         <w:tblLook w:firstColumn="1" w:firstRow="1" w:lastColumn="0" w:lastRow="0" w:noHBand="0" w:noVBand="1" w:val="04A0"/>
       </w:tblPr>
       <w:tblGrid>
-        <w:gridCol w:w="9936"/>
+        <w:gridCol w:w="9638"/>
       </w:tblGrid>
       <w:tr>
         <w:tc>
           <w:tcPr>
-            <w:tcW w:type="dxa" w:w="9792"/>
+            <w:tcW w:type="dxa" w:w="9638"/>
             <w:tcBorders>
               <w:top w:val="single" w:sz="4" w:space="0" w:color="000000"/>
               <w:left w:val="single" w:sz="4" w:space="0" w:color="000000"/>
@@ -1605,12 +1605,12 @@
         <w:tblLook w:firstColumn="1" w:firstRow="1" w:lastColumn="0" w:lastRow="0" w:noHBand="0" w:noVBand="1" w:val="04A0"/>
       </w:tblPr>
       <w:tblGrid>
-        <w:gridCol w:w="9936"/>
+        <w:gridCol w:w="9638"/>
       </w:tblGrid>
       <w:tr>
         <w:tc>
           <w:tcPr>
-            <w:tcW w:type="dxa" w:w="9792"/>
+            <w:tcW w:type="dxa" w:w="9638"/>
             <w:tcBorders>
               <w:top w:val="single" w:sz="4" w:space="0" w:color="000000"/>
               <w:left w:val="single" w:sz="4" w:space="0" w:color="000000"/>
@@ -1781,8 +1781,8 @@
       </w:tr>
     </w:tbl>
     <w:sectPr>
-      <w:pgSz w:w="12240" w:h="15840"/>
-      <w:pgMar w:top="1152" w:right="1152" w:bottom="1152" w:left="1152" w:header="720" w:footer="720" w:gutter="0"/>
+      <w:pgSz w:w="11906" w:h="16838"/>
+      <w:pgMar w:top="1134" w:right="1134" w:bottom="1134" w:left="1134" w:header="720" w:footer="720" w:gutter="0"/>
       <w:cols w:space="720"/>
       <w:docGrid w:linePitch="360"/>
     </w:sectPr>

</xml_diff>

<commit_message>
belajar: sinkronisasi otomatis memori neuron dan pengetahuan (2026-08-27 08:34:06)
</commit_message>
<xml_diff>
--- a/Panduan Struktur Prompt AI.docx
+++ b/Panduan Struktur Prompt AI.docx
@@ -17,12 +17,12 @@
     </w:p>
     <w:p>
       <w:pPr>
-        <w:spacing w:after="240"/>
+        <w:spacing w:after="280"/>
         <w:jc w:val="center"/>
       </w:pPr>
       <w:r>
         <w:rPr>
-          <w:color w:val="505050"/>
+          <w:color w:val="464646"/>
           <w:sz w:val="19"/>
         </w:rPr>
         <w:t>Format Baku dan Panduan Komponen Prompt Sederhana hingga Kompleks</w:t>
@@ -65,14 +65,14 @@
             </w:tcBorders>
             <w:tcMar>
               <w:top w:w="100" w:type="dxa"/>
-              <w:left w:w="120" w:type="dxa"/>
+              <w:left w:w="130" w:type="dxa"/>
               <w:bottom w:w="100" w:type="dxa"/>
-              <w:right w:w="120" w:type="dxa"/>
+              <w:right w:w="130" w:type="dxa"/>
             </w:tcMar>
           </w:tcPr>
           <w:p>
             <w:pPr>
-              <w:spacing w:before="20" w:after="20" w:line="276" w:lineRule="auto"/>
+              <w:spacing w:before="20" w:after="20" w:line="312" w:lineRule="auto"/>
               <w:jc w:val="center"/>
             </w:pPr>
             <w:r>
@@ -96,14 +96,15 @@
             </w:tcBorders>
             <w:tcMar>
               <w:top w:w="100" w:type="dxa"/>
-              <w:left w:w="120" w:type="dxa"/>
+              <w:left w:w="130" w:type="dxa"/>
               <w:bottom w:w="100" w:type="dxa"/>
-              <w:right w:w="120" w:type="dxa"/>
+              <w:right w:w="130" w:type="dxa"/>
             </w:tcMar>
           </w:tcPr>
           <w:p>
             <w:pPr>
-              <w:spacing w:before="20" w:after="20" w:line="276" w:lineRule="auto"/>
+              <w:spacing w:before="20" w:after="20" w:line="312" w:lineRule="auto"/>
+              <w:jc w:val="left"/>
             </w:pPr>
             <w:r>
               <w:rPr>
@@ -126,14 +127,15 @@
             </w:tcBorders>
             <w:tcMar>
               <w:top w:w="100" w:type="dxa"/>
-              <w:left w:w="120" w:type="dxa"/>
+              <w:left w:w="130" w:type="dxa"/>
               <w:bottom w:w="100" w:type="dxa"/>
-              <w:right w:w="120" w:type="dxa"/>
+              <w:right w:w="130" w:type="dxa"/>
             </w:tcMar>
           </w:tcPr>
           <w:p>
             <w:pPr>
-              <w:spacing w:before="20" w:after="20" w:line="276" w:lineRule="auto"/>
+              <w:spacing w:before="20" w:after="20" w:line="312" w:lineRule="auto"/>
+              <w:jc w:val="left"/>
             </w:pPr>
             <w:r>
               <w:rPr>
@@ -156,14 +158,15 @@
             </w:tcBorders>
             <w:tcMar>
               <w:top w:w="100" w:type="dxa"/>
-              <w:left w:w="120" w:type="dxa"/>
+              <w:left w:w="130" w:type="dxa"/>
               <w:bottom w:w="100" w:type="dxa"/>
-              <w:right w:w="120" w:type="dxa"/>
+              <w:right w:w="130" w:type="dxa"/>
             </w:tcMar>
           </w:tcPr>
           <w:p>
             <w:pPr>
-              <w:spacing w:before="20" w:after="20" w:line="276" w:lineRule="auto"/>
+              <w:spacing w:before="20" w:after="20" w:line="312" w:lineRule="auto"/>
+              <w:jc w:val="left"/>
             </w:pPr>
             <w:r>
               <w:rPr>
@@ -188,14 +191,14 @@
             </w:tcBorders>
             <w:tcMar>
               <w:top w:w="100" w:type="dxa"/>
-              <w:left w:w="120" w:type="dxa"/>
+              <w:left w:w="130" w:type="dxa"/>
               <w:bottom w:w="100" w:type="dxa"/>
-              <w:right w:w="120" w:type="dxa"/>
+              <w:right w:w="130" w:type="dxa"/>
             </w:tcMar>
           </w:tcPr>
           <w:p>
             <w:pPr>
-              <w:spacing w:before="20" w:after="20" w:line="276" w:lineRule="auto"/>
+              <w:spacing w:before="20" w:after="20" w:line="312" w:lineRule="auto"/>
               <w:jc w:val="center"/>
             </w:pPr>
             <w:r>
@@ -218,14 +221,15 @@
             </w:tcBorders>
             <w:tcMar>
               <w:top w:w="100" w:type="dxa"/>
-              <w:left w:w="120" w:type="dxa"/>
+              <w:left w:w="130" w:type="dxa"/>
               <w:bottom w:w="100" w:type="dxa"/>
-              <w:right w:w="120" w:type="dxa"/>
+              <w:right w:w="130" w:type="dxa"/>
             </w:tcMar>
           </w:tcPr>
           <w:p>
             <w:pPr>
-              <w:spacing w:before="20" w:after="20" w:line="276" w:lineRule="auto"/>
+              <w:spacing w:before="20" w:after="20" w:line="312" w:lineRule="auto"/>
+              <w:jc w:val="left"/>
             </w:pPr>
             <w:r>
               <w:rPr>
@@ -248,14 +252,15 @@
             </w:tcBorders>
             <w:tcMar>
               <w:top w:w="100" w:type="dxa"/>
-              <w:left w:w="120" w:type="dxa"/>
+              <w:left w:w="130" w:type="dxa"/>
               <w:bottom w:w="100" w:type="dxa"/>
-              <w:right w:w="120" w:type="dxa"/>
+              <w:right w:w="130" w:type="dxa"/>
             </w:tcMar>
           </w:tcPr>
           <w:p>
             <w:pPr>
-              <w:spacing w:before="20" w:after="20" w:line="276" w:lineRule="auto"/>
+              <w:spacing w:before="20" w:after="20" w:line="312" w:lineRule="auto"/>
+              <w:jc w:val="both"/>
             </w:pPr>
             <w:r>
               <w:rPr>
@@ -277,14 +282,15 @@
             </w:tcBorders>
             <w:tcMar>
               <w:top w:w="100" w:type="dxa"/>
-              <w:left w:w="120" w:type="dxa"/>
+              <w:left w:w="130" w:type="dxa"/>
               <w:bottom w:w="100" w:type="dxa"/>
-              <w:right w:w="120" w:type="dxa"/>
+              <w:right w:w="130" w:type="dxa"/>
             </w:tcMar>
           </w:tcPr>
           <w:p>
             <w:pPr>
-              <w:spacing w:before="20" w:after="20" w:line="276" w:lineRule="auto"/>
+              <w:spacing w:before="20" w:after="20" w:line="312" w:lineRule="auto"/>
+              <w:jc w:val="both"/>
             </w:pPr>
             <w:r>
               <w:rPr>
@@ -308,14 +314,14 @@
             </w:tcBorders>
             <w:tcMar>
               <w:top w:w="100" w:type="dxa"/>
-              <w:left w:w="120" w:type="dxa"/>
+              <w:left w:w="130" w:type="dxa"/>
               <w:bottom w:w="100" w:type="dxa"/>
-              <w:right w:w="120" w:type="dxa"/>
+              <w:right w:w="130" w:type="dxa"/>
             </w:tcMar>
           </w:tcPr>
           <w:p>
             <w:pPr>
-              <w:spacing w:before="20" w:after="20" w:line="276" w:lineRule="auto"/>
+              <w:spacing w:before="20" w:after="20" w:line="312" w:lineRule="auto"/>
               <w:jc w:val="center"/>
             </w:pPr>
             <w:r>
@@ -338,14 +344,15 @@
             </w:tcBorders>
             <w:tcMar>
               <w:top w:w="100" w:type="dxa"/>
-              <w:left w:w="120" w:type="dxa"/>
+              <w:left w:w="130" w:type="dxa"/>
               <w:bottom w:w="100" w:type="dxa"/>
-              <w:right w:w="120" w:type="dxa"/>
+              <w:right w:w="130" w:type="dxa"/>
             </w:tcMar>
           </w:tcPr>
           <w:p>
             <w:pPr>
-              <w:spacing w:before="20" w:after="20" w:line="276" w:lineRule="auto"/>
+              <w:spacing w:before="20" w:after="20" w:line="312" w:lineRule="auto"/>
+              <w:jc w:val="left"/>
             </w:pPr>
             <w:r>
               <w:rPr>
@@ -368,14 +375,15 @@
             </w:tcBorders>
             <w:tcMar>
               <w:top w:w="100" w:type="dxa"/>
-              <w:left w:w="120" w:type="dxa"/>
+              <w:left w:w="130" w:type="dxa"/>
               <w:bottom w:w="100" w:type="dxa"/>
-              <w:right w:w="120" w:type="dxa"/>
+              <w:right w:w="130" w:type="dxa"/>
             </w:tcMar>
           </w:tcPr>
           <w:p>
             <w:pPr>
-              <w:spacing w:before="20" w:after="20" w:line="276" w:lineRule="auto"/>
+              <w:spacing w:before="20" w:after="20" w:line="312" w:lineRule="auto"/>
+              <w:jc w:val="both"/>
             </w:pPr>
             <w:r>
               <w:rPr>
@@ -397,14 +405,15 @@
             </w:tcBorders>
             <w:tcMar>
               <w:top w:w="100" w:type="dxa"/>
-              <w:left w:w="120" w:type="dxa"/>
+              <w:left w:w="130" w:type="dxa"/>
               <w:bottom w:w="100" w:type="dxa"/>
-              <w:right w:w="120" w:type="dxa"/>
+              <w:right w:w="130" w:type="dxa"/>
             </w:tcMar>
           </w:tcPr>
           <w:p>
             <w:pPr>
-              <w:spacing w:before="20" w:after="20" w:line="276" w:lineRule="auto"/>
+              <w:spacing w:before="20" w:after="20" w:line="312" w:lineRule="auto"/>
+              <w:jc w:val="both"/>
             </w:pPr>
             <w:r>
               <w:rPr>
@@ -428,14 +437,14 @@
             </w:tcBorders>
             <w:tcMar>
               <w:top w:w="100" w:type="dxa"/>
-              <w:left w:w="120" w:type="dxa"/>
+              <w:left w:w="130" w:type="dxa"/>
               <w:bottom w:w="100" w:type="dxa"/>
-              <w:right w:w="120" w:type="dxa"/>
+              <w:right w:w="130" w:type="dxa"/>
             </w:tcMar>
           </w:tcPr>
           <w:p>
             <w:pPr>
-              <w:spacing w:before="20" w:after="20" w:line="276" w:lineRule="auto"/>
+              <w:spacing w:before="20" w:after="20" w:line="312" w:lineRule="auto"/>
               <w:jc w:val="center"/>
             </w:pPr>
             <w:r>
@@ -458,14 +467,15 @@
             </w:tcBorders>
             <w:tcMar>
               <w:top w:w="100" w:type="dxa"/>
-              <w:left w:w="120" w:type="dxa"/>
+              <w:left w:w="130" w:type="dxa"/>
               <w:bottom w:w="100" w:type="dxa"/>
-              <w:right w:w="120" w:type="dxa"/>
+              <w:right w:w="130" w:type="dxa"/>
             </w:tcMar>
           </w:tcPr>
           <w:p>
             <w:pPr>
-              <w:spacing w:before="20" w:after="20" w:line="276" w:lineRule="auto"/>
+              <w:spacing w:before="20" w:after="20" w:line="312" w:lineRule="auto"/>
+              <w:jc w:val="left"/>
             </w:pPr>
             <w:r>
               <w:rPr>
@@ -488,14 +498,15 @@
             </w:tcBorders>
             <w:tcMar>
               <w:top w:w="100" w:type="dxa"/>
-              <w:left w:w="120" w:type="dxa"/>
+              <w:left w:w="130" w:type="dxa"/>
               <w:bottom w:w="100" w:type="dxa"/>
-              <w:right w:w="120" w:type="dxa"/>
+              <w:right w:w="130" w:type="dxa"/>
             </w:tcMar>
           </w:tcPr>
           <w:p>
             <w:pPr>
-              <w:spacing w:before="20" w:after="20" w:line="276" w:lineRule="auto"/>
+              <w:spacing w:before="20" w:after="20" w:line="312" w:lineRule="auto"/>
+              <w:jc w:val="both"/>
             </w:pPr>
             <w:r>
               <w:rPr>
@@ -517,14 +528,15 @@
             </w:tcBorders>
             <w:tcMar>
               <w:top w:w="100" w:type="dxa"/>
-              <w:left w:w="120" w:type="dxa"/>
+              <w:left w:w="130" w:type="dxa"/>
               <w:bottom w:w="100" w:type="dxa"/>
-              <w:right w:w="120" w:type="dxa"/>
+              <w:right w:w="130" w:type="dxa"/>
             </w:tcMar>
           </w:tcPr>
           <w:p>
             <w:pPr>
-              <w:spacing w:before="20" w:after="20" w:line="276" w:lineRule="auto"/>
+              <w:spacing w:before="20" w:after="20" w:line="312" w:lineRule="auto"/>
+              <w:jc w:val="both"/>
             </w:pPr>
             <w:r>
               <w:rPr>
@@ -548,14 +560,14 @@
             </w:tcBorders>
             <w:tcMar>
               <w:top w:w="100" w:type="dxa"/>
-              <w:left w:w="120" w:type="dxa"/>
+              <w:left w:w="130" w:type="dxa"/>
               <w:bottom w:w="100" w:type="dxa"/>
-              <w:right w:w="120" w:type="dxa"/>
+              <w:right w:w="130" w:type="dxa"/>
             </w:tcMar>
           </w:tcPr>
           <w:p>
             <w:pPr>
-              <w:spacing w:before="20" w:after="20" w:line="276" w:lineRule="auto"/>
+              <w:spacing w:before="20" w:after="20" w:line="312" w:lineRule="auto"/>
               <w:jc w:val="center"/>
             </w:pPr>
             <w:r>
@@ -578,14 +590,15 @@
             </w:tcBorders>
             <w:tcMar>
               <w:top w:w="100" w:type="dxa"/>
-              <w:left w:w="120" w:type="dxa"/>
+              <w:left w:w="130" w:type="dxa"/>
               <w:bottom w:w="100" w:type="dxa"/>
-              <w:right w:w="120" w:type="dxa"/>
+              <w:right w:w="130" w:type="dxa"/>
             </w:tcMar>
           </w:tcPr>
           <w:p>
             <w:pPr>
-              <w:spacing w:before="20" w:after="20" w:line="276" w:lineRule="auto"/>
+              <w:spacing w:before="20" w:after="20" w:line="312" w:lineRule="auto"/>
+              <w:jc w:val="left"/>
             </w:pPr>
             <w:r>
               <w:rPr>
@@ -608,14 +621,15 @@
             </w:tcBorders>
             <w:tcMar>
               <w:top w:w="100" w:type="dxa"/>
-              <w:left w:w="120" w:type="dxa"/>
+              <w:left w:w="130" w:type="dxa"/>
               <w:bottom w:w="100" w:type="dxa"/>
-              <w:right w:w="120" w:type="dxa"/>
+              <w:right w:w="130" w:type="dxa"/>
             </w:tcMar>
           </w:tcPr>
           <w:p>
             <w:pPr>
-              <w:spacing w:before="20" w:after="20" w:line="276" w:lineRule="auto"/>
+              <w:spacing w:before="20" w:after="20" w:line="312" w:lineRule="auto"/>
+              <w:jc w:val="both"/>
             </w:pPr>
             <w:r>
               <w:rPr>
@@ -637,14 +651,15 @@
             </w:tcBorders>
             <w:tcMar>
               <w:top w:w="100" w:type="dxa"/>
-              <w:left w:w="120" w:type="dxa"/>
+              <w:left w:w="130" w:type="dxa"/>
               <w:bottom w:w="100" w:type="dxa"/>
-              <w:right w:w="120" w:type="dxa"/>
+              <w:right w:w="130" w:type="dxa"/>
             </w:tcMar>
           </w:tcPr>
           <w:p>
             <w:pPr>
-              <w:spacing w:before="20" w:after="20" w:line="276" w:lineRule="auto"/>
+              <w:spacing w:before="20" w:after="20" w:line="312" w:lineRule="auto"/>
+              <w:jc w:val="both"/>
             </w:pPr>
             <w:r>
               <w:rPr>
@@ -668,14 +683,14 @@
             </w:tcBorders>
             <w:tcMar>
               <w:top w:w="100" w:type="dxa"/>
-              <w:left w:w="120" w:type="dxa"/>
+              <w:left w:w="130" w:type="dxa"/>
               <w:bottom w:w="100" w:type="dxa"/>
-              <w:right w:w="120" w:type="dxa"/>
+              <w:right w:w="130" w:type="dxa"/>
             </w:tcMar>
           </w:tcPr>
           <w:p>
             <w:pPr>
-              <w:spacing w:before="20" w:after="20" w:line="276" w:lineRule="auto"/>
+              <w:spacing w:before="20" w:after="20" w:line="312" w:lineRule="auto"/>
               <w:jc w:val="center"/>
             </w:pPr>
             <w:r>
@@ -698,14 +713,15 @@
             </w:tcBorders>
             <w:tcMar>
               <w:top w:w="100" w:type="dxa"/>
-              <w:left w:w="120" w:type="dxa"/>
+              <w:left w:w="130" w:type="dxa"/>
               <w:bottom w:w="100" w:type="dxa"/>
-              <w:right w:w="120" w:type="dxa"/>
+              <w:right w:w="130" w:type="dxa"/>
             </w:tcMar>
           </w:tcPr>
           <w:p>
             <w:pPr>
-              <w:spacing w:before="20" w:after="20" w:line="276" w:lineRule="auto"/>
+              <w:spacing w:before="20" w:after="20" w:line="312" w:lineRule="auto"/>
+              <w:jc w:val="left"/>
             </w:pPr>
             <w:r>
               <w:rPr>
@@ -728,14 +744,15 @@
             </w:tcBorders>
             <w:tcMar>
               <w:top w:w="100" w:type="dxa"/>
-              <w:left w:w="120" w:type="dxa"/>
+              <w:left w:w="130" w:type="dxa"/>
               <w:bottom w:w="100" w:type="dxa"/>
-              <w:right w:w="120" w:type="dxa"/>
+              <w:right w:w="130" w:type="dxa"/>
             </w:tcMar>
           </w:tcPr>
           <w:p>
             <w:pPr>
-              <w:spacing w:before="20" w:after="20" w:line="276" w:lineRule="auto"/>
+              <w:spacing w:before="20" w:after="20" w:line="312" w:lineRule="auto"/>
+              <w:jc w:val="both"/>
             </w:pPr>
             <w:r>
               <w:rPr>
@@ -757,14 +774,15 @@
             </w:tcBorders>
             <w:tcMar>
               <w:top w:w="100" w:type="dxa"/>
-              <w:left w:w="120" w:type="dxa"/>
+              <w:left w:w="130" w:type="dxa"/>
               <w:bottom w:w="100" w:type="dxa"/>
-              <w:right w:w="120" w:type="dxa"/>
+              <w:right w:w="130" w:type="dxa"/>
             </w:tcMar>
           </w:tcPr>
           <w:p>
             <w:pPr>
-              <w:spacing w:before="20" w:after="20" w:line="276" w:lineRule="auto"/>
+              <w:spacing w:before="20" w:after="20" w:line="312" w:lineRule="auto"/>
+              <w:jc w:val="both"/>
             </w:pPr>
             <w:r>
               <w:rPr>
@@ -788,14 +806,14 @@
             </w:tcBorders>
             <w:tcMar>
               <w:top w:w="100" w:type="dxa"/>
-              <w:left w:w="120" w:type="dxa"/>
+              <w:left w:w="130" w:type="dxa"/>
               <w:bottom w:w="100" w:type="dxa"/>
-              <w:right w:w="120" w:type="dxa"/>
+              <w:right w:w="130" w:type="dxa"/>
             </w:tcMar>
           </w:tcPr>
           <w:p>
             <w:pPr>
-              <w:spacing w:before="20" w:after="20" w:line="276" w:lineRule="auto"/>
+              <w:spacing w:before="20" w:after="20" w:line="312" w:lineRule="auto"/>
               <w:jc w:val="center"/>
             </w:pPr>
             <w:r>
@@ -818,14 +836,15 @@
             </w:tcBorders>
             <w:tcMar>
               <w:top w:w="100" w:type="dxa"/>
-              <w:left w:w="120" w:type="dxa"/>
+              <w:left w:w="130" w:type="dxa"/>
               <w:bottom w:w="100" w:type="dxa"/>
-              <w:right w:w="120" w:type="dxa"/>
+              <w:right w:w="130" w:type="dxa"/>
             </w:tcMar>
           </w:tcPr>
           <w:p>
             <w:pPr>
-              <w:spacing w:before="20" w:after="20" w:line="276" w:lineRule="auto"/>
+              <w:spacing w:before="20" w:after="20" w:line="312" w:lineRule="auto"/>
+              <w:jc w:val="left"/>
             </w:pPr>
             <w:r>
               <w:rPr>
@@ -848,14 +867,15 @@
             </w:tcBorders>
             <w:tcMar>
               <w:top w:w="100" w:type="dxa"/>
-              <w:left w:w="120" w:type="dxa"/>
+              <w:left w:w="130" w:type="dxa"/>
               <w:bottom w:w="100" w:type="dxa"/>
-              <w:right w:w="120" w:type="dxa"/>
+              <w:right w:w="130" w:type="dxa"/>
             </w:tcMar>
           </w:tcPr>
           <w:p>
             <w:pPr>
-              <w:spacing w:before="20" w:after="20" w:line="276" w:lineRule="auto"/>
+              <w:spacing w:before="20" w:after="20" w:line="312" w:lineRule="auto"/>
+              <w:jc w:val="both"/>
             </w:pPr>
             <w:r>
               <w:rPr>
@@ -877,14 +897,15 @@
             </w:tcBorders>
             <w:tcMar>
               <w:top w:w="100" w:type="dxa"/>
-              <w:left w:w="120" w:type="dxa"/>
+              <w:left w:w="130" w:type="dxa"/>
               <w:bottom w:w="100" w:type="dxa"/>
-              <w:right w:w="120" w:type="dxa"/>
+              <w:right w:w="130" w:type="dxa"/>
             </w:tcMar>
           </w:tcPr>
           <w:p>
             <w:pPr>
-              <w:spacing w:before="20" w:after="20" w:line="276" w:lineRule="auto"/>
+              <w:spacing w:before="20" w:after="20" w:line="312" w:lineRule="auto"/>
+              <w:jc w:val="both"/>
             </w:pPr>
             <w:r>
               <w:rPr>
@@ -908,14 +929,14 @@
             </w:tcBorders>
             <w:tcMar>
               <w:top w:w="100" w:type="dxa"/>
-              <w:left w:w="120" w:type="dxa"/>
+              <w:left w:w="130" w:type="dxa"/>
               <w:bottom w:w="100" w:type="dxa"/>
-              <w:right w:w="120" w:type="dxa"/>
+              <w:right w:w="130" w:type="dxa"/>
             </w:tcMar>
           </w:tcPr>
           <w:p>
             <w:pPr>
-              <w:spacing w:before="20" w:after="20" w:line="276" w:lineRule="auto"/>
+              <w:spacing w:before="20" w:after="20" w:line="312" w:lineRule="auto"/>
               <w:jc w:val="center"/>
             </w:pPr>
             <w:r>
@@ -938,14 +959,15 @@
             </w:tcBorders>
             <w:tcMar>
               <w:top w:w="100" w:type="dxa"/>
-              <w:left w:w="120" w:type="dxa"/>
+              <w:left w:w="130" w:type="dxa"/>
               <w:bottom w:w="100" w:type="dxa"/>
-              <w:right w:w="120" w:type="dxa"/>
+              <w:right w:w="130" w:type="dxa"/>
             </w:tcMar>
           </w:tcPr>
           <w:p>
             <w:pPr>
-              <w:spacing w:before="20" w:after="20" w:line="276" w:lineRule="auto"/>
+              <w:spacing w:before="20" w:after="20" w:line="312" w:lineRule="auto"/>
+              <w:jc w:val="left"/>
             </w:pPr>
             <w:r>
               <w:rPr>
@@ -968,14 +990,15 @@
             </w:tcBorders>
             <w:tcMar>
               <w:top w:w="100" w:type="dxa"/>
-              <w:left w:w="120" w:type="dxa"/>
+              <w:left w:w="130" w:type="dxa"/>
               <w:bottom w:w="100" w:type="dxa"/>
-              <w:right w:w="120" w:type="dxa"/>
+              <w:right w:w="130" w:type="dxa"/>
             </w:tcMar>
           </w:tcPr>
           <w:p>
             <w:pPr>
-              <w:spacing w:before="20" w:after="20" w:line="276" w:lineRule="auto"/>
+              <w:spacing w:before="20" w:after="20" w:line="312" w:lineRule="auto"/>
+              <w:jc w:val="both"/>
             </w:pPr>
             <w:r>
               <w:rPr>
@@ -997,14 +1020,15 @@
             </w:tcBorders>
             <w:tcMar>
               <w:top w:w="100" w:type="dxa"/>
-              <w:left w:w="120" w:type="dxa"/>
+              <w:left w:w="130" w:type="dxa"/>
               <w:bottom w:w="100" w:type="dxa"/>
-              <w:right w:w="120" w:type="dxa"/>
+              <w:right w:w="130" w:type="dxa"/>
             </w:tcMar>
           </w:tcPr>
           <w:p>
             <w:pPr>
-              <w:spacing w:before="20" w:after="20" w:line="276" w:lineRule="auto"/>
+              <w:spacing w:before="20" w:after="20" w:line="312" w:lineRule="auto"/>
+              <w:jc w:val="both"/>
             </w:pPr>
             <w:r>
               <w:rPr>
@@ -1018,7 +1042,7 @@
     </w:tbl>
     <w:p>
       <w:pPr>
-        <w:spacing w:before="240" w:after="80"/>
+        <w:spacing w:before="280" w:after="80"/>
       </w:pPr>
       <w:r>
         <w:rPr>
@@ -1048,15 +1072,16 @@
               <w:right w:val="single" w:sz="6" w:space="0" w:color="000000"/>
             </w:tcBorders>
             <w:tcMar>
-              <w:top w:w="130" w:type="dxa"/>
-              <w:left w:w="150" w:type="dxa"/>
-              <w:bottom w:w="130" w:type="dxa"/>
-              <w:right w:w="150" w:type="dxa"/>
+              <w:top w:w="140" w:type="dxa"/>
+              <w:left w:w="160" w:type="dxa"/>
+              <w:bottom w:w="140" w:type="dxa"/>
+              <w:right w:w="160" w:type="dxa"/>
             </w:tcMar>
           </w:tcPr>
           <w:p>
             <w:pPr>
-              <w:spacing w:before="0" w:after="40" w:line="288" w:lineRule="auto"/>
+              <w:spacing w:before="0" w:after="60" w:line="360" w:lineRule="auto"/>
+              <w:jc w:val="both"/>
             </w:pPr>
             <w:r>
               <w:rPr>
@@ -1074,7 +1099,8 @@
           </w:p>
           <w:p>
             <w:pPr>
-              <w:spacing w:before="40" w:after="40" w:line="288" w:lineRule="auto"/>
+              <w:spacing w:before="60" w:after="60" w:line="360" w:lineRule="auto"/>
+              <w:jc w:val="both"/>
             </w:pPr>
             <w:r>
               <w:rPr>
@@ -1092,7 +1118,8 @@
           </w:p>
           <w:p>
             <w:pPr>
-              <w:spacing w:before="40" w:after="40" w:line="288" w:lineRule="auto"/>
+              <w:spacing w:before="60" w:after="60" w:line="360" w:lineRule="auto"/>
+              <w:jc w:val="both"/>
             </w:pPr>
             <w:r>
               <w:rPr>
@@ -1110,7 +1137,8 @@
           </w:p>
           <w:p>
             <w:pPr>
-              <w:spacing w:before="40" w:after="40" w:line="288" w:lineRule="auto"/>
+              <w:spacing w:before="60" w:after="60" w:line="360" w:lineRule="auto"/>
+              <w:jc w:val="both"/>
             </w:pPr>
             <w:r>
               <w:rPr>
@@ -1128,7 +1156,8 @@
           </w:p>
           <w:p>
             <w:pPr>
-              <w:spacing w:before="40" w:after="40" w:line="288" w:lineRule="auto"/>
+              <w:spacing w:before="60" w:after="60" w:line="360" w:lineRule="auto"/>
+              <w:jc w:val="both"/>
             </w:pPr>
             <w:r>
               <w:rPr>
@@ -1146,7 +1175,8 @@
           </w:p>
           <w:p>
             <w:pPr>
-              <w:spacing w:before="40" w:after="40" w:line="288" w:lineRule="auto"/>
+              <w:spacing w:before="60" w:after="60" w:line="360" w:lineRule="auto"/>
+              <w:jc w:val="both"/>
             </w:pPr>
             <w:r>
               <w:rPr>
@@ -1164,7 +1194,8 @@
           </w:p>
           <w:p>
             <w:pPr>
-              <w:spacing w:before="40" w:after="40" w:line="288" w:lineRule="auto"/>
+              <w:spacing w:before="60" w:after="60" w:line="360" w:lineRule="auto"/>
+              <w:jc w:val="both"/>
             </w:pPr>
             <w:r>
               <w:rPr>
@@ -1203,12 +1234,12 @@
     </w:p>
     <w:p>
       <w:pPr>
-        <w:spacing w:after="200"/>
+        <w:spacing w:after="240"/>
         <w:jc w:val="center"/>
       </w:pPr>
       <w:r>
         <w:rPr>
-          <w:color w:val="505050"/>
+          <w:color w:val="464646"/>
           <w:sz w:val="18"/>
         </w:rPr>
         <w:t>Kasus Sehari-hari yang Mudah Dipahami dan Dipraktikkan</w:t>
@@ -1246,15 +1277,16 @@
               <w:right w:val="single" w:sz="4" w:space="0" w:color="000000"/>
             </w:tcBorders>
             <w:tcMar>
-              <w:top w:w="120" w:type="dxa"/>
-              <w:left w:w="140" w:type="dxa"/>
-              <w:bottom w:w="120" w:type="dxa"/>
-              <w:right w:w="140" w:type="dxa"/>
+              <w:top w:w="130" w:type="dxa"/>
+              <w:left w:w="150" w:type="dxa"/>
+              <w:bottom w:w="130" w:type="dxa"/>
+              <w:right w:w="150" w:type="dxa"/>
             </w:tcMar>
           </w:tcPr>
           <w:p>
             <w:pPr>
-              <w:spacing w:before="20" w:after="40" w:line="276" w:lineRule="auto"/>
+              <w:spacing w:before="40" w:after="40" w:line="360" w:lineRule="auto"/>
+              <w:jc w:val="both"/>
             </w:pPr>
             <w:r>
               <w:rPr>
@@ -1272,7 +1304,8 @@
           </w:p>
           <w:p>
             <w:pPr>
-              <w:spacing w:before="20" w:after="40" w:line="276" w:lineRule="auto"/>
+              <w:spacing w:before="40" w:after="40" w:line="360" w:lineRule="auto"/>
+              <w:jc w:val="both"/>
             </w:pPr>
             <w:r>
               <w:rPr>
@@ -1290,7 +1323,8 @@
           </w:p>
           <w:p>
             <w:pPr>
-              <w:spacing w:before="20" w:after="40" w:line="276" w:lineRule="auto"/>
+              <w:spacing w:before="40" w:after="40" w:line="360" w:lineRule="auto"/>
+              <w:jc w:val="both"/>
             </w:pPr>
             <w:r>
               <w:rPr>
@@ -1308,7 +1342,8 @@
           </w:p>
           <w:p>
             <w:pPr>
-              <w:spacing w:before="20" w:after="40" w:line="276" w:lineRule="auto"/>
+              <w:spacing w:before="40" w:after="40" w:line="360" w:lineRule="auto"/>
+              <w:jc w:val="both"/>
             </w:pPr>
             <w:r>
               <w:rPr>
@@ -1333,7 +1368,8 @@
           </w:p>
           <w:p>
             <w:pPr>
-              <w:spacing w:before="20" w:after="40" w:line="276" w:lineRule="auto"/>
+              <w:spacing w:before="40" w:after="40" w:line="360" w:lineRule="auto"/>
+              <w:jc w:val="both"/>
             </w:pPr>
             <w:r>
               <w:rPr>
@@ -1351,7 +1387,8 @@
           </w:p>
           <w:p>
             <w:pPr>
-              <w:spacing w:before="20" w:after="40" w:line="276" w:lineRule="auto"/>
+              <w:spacing w:before="40" w:after="40" w:line="360" w:lineRule="auto"/>
+              <w:jc w:val="both"/>
             </w:pPr>
             <w:r>
               <w:rPr>
@@ -1369,7 +1406,8 @@
           </w:p>
           <w:p>
             <w:pPr>
-              <w:spacing w:before="20" w:after="40" w:line="276" w:lineRule="auto"/>
+              <w:spacing w:before="40" w:after="40" w:line="360" w:lineRule="auto"/>
+              <w:jc w:val="both"/>
             </w:pPr>
             <w:r>
               <w:rPr>
@@ -1390,7 +1428,7 @@
     </w:tbl>
     <w:p>
       <w:pPr>
-        <w:spacing w:before="200" w:after="80"/>
+        <w:spacing w:before="240" w:after="80"/>
       </w:pPr>
       <w:r>
         <w:rPr>
@@ -1420,15 +1458,16 @@
               <w:right w:val="single" w:sz="4" w:space="0" w:color="000000"/>
             </w:tcBorders>
             <w:tcMar>
-              <w:top w:w="120" w:type="dxa"/>
-              <w:left w:w="140" w:type="dxa"/>
-              <w:bottom w:w="120" w:type="dxa"/>
-              <w:right w:w="140" w:type="dxa"/>
+              <w:top w:w="130" w:type="dxa"/>
+              <w:left w:w="150" w:type="dxa"/>
+              <w:bottom w:w="130" w:type="dxa"/>
+              <w:right w:w="150" w:type="dxa"/>
             </w:tcMar>
           </w:tcPr>
           <w:p>
             <w:pPr>
-              <w:spacing w:before="20" w:after="40" w:line="276" w:lineRule="auto"/>
+              <w:spacing w:before="40" w:after="40" w:line="360" w:lineRule="auto"/>
+              <w:jc w:val="both"/>
             </w:pPr>
             <w:r>
               <w:rPr>
@@ -1446,7 +1485,8 @@
           </w:p>
           <w:p>
             <w:pPr>
-              <w:spacing w:before="20" w:after="40" w:line="276" w:lineRule="auto"/>
+              <w:spacing w:before="40" w:after="40" w:line="360" w:lineRule="auto"/>
+              <w:jc w:val="both"/>
             </w:pPr>
             <w:r>
               <w:rPr>
@@ -1464,7 +1504,8 @@
           </w:p>
           <w:p>
             <w:pPr>
-              <w:spacing w:before="20" w:after="40" w:line="276" w:lineRule="auto"/>
+              <w:spacing w:before="40" w:after="40" w:line="360" w:lineRule="auto"/>
+              <w:jc w:val="both"/>
             </w:pPr>
             <w:r>
               <w:rPr>
@@ -1482,7 +1523,8 @@
           </w:p>
           <w:p>
             <w:pPr>
-              <w:spacing w:before="20" w:after="40" w:line="276" w:lineRule="auto"/>
+              <w:spacing w:before="40" w:after="40" w:line="360" w:lineRule="auto"/>
+              <w:jc w:val="both"/>
             </w:pPr>
             <w:r>
               <w:rPr>
@@ -1500,7 +1542,8 @@
           </w:p>
           <w:p>
             <w:pPr>
-              <w:spacing w:before="20" w:after="40" w:line="276" w:lineRule="auto"/>
+              <w:spacing w:before="40" w:after="40" w:line="360" w:lineRule="auto"/>
+              <w:jc w:val="both"/>
             </w:pPr>
             <w:r>
               <w:rPr>
@@ -1518,7 +1561,8 @@
           </w:p>
           <w:p>
             <w:pPr>
-              <w:spacing w:before="20" w:after="40" w:line="276" w:lineRule="auto"/>
+              <w:spacing w:before="40" w:after="40" w:line="360" w:lineRule="auto"/>
+              <w:jc w:val="both"/>
             </w:pPr>
             <w:r>
               <w:rPr>
@@ -1536,7 +1580,8 @@
           </w:p>
           <w:p>
             <w:pPr>
-              <w:spacing w:before="20" w:after="40" w:line="276" w:lineRule="auto"/>
+              <w:spacing w:before="40" w:after="40" w:line="360" w:lineRule="auto"/>
+              <w:jc w:val="both"/>
             </w:pPr>
             <w:r>
               <w:rPr>
@@ -1575,12 +1620,12 @@
     </w:p>
     <w:p>
       <w:pPr>
-        <w:spacing w:after="200"/>
+        <w:spacing w:after="240"/>
         <w:jc w:val="center"/>
       </w:pPr>
       <w:r>
         <w:rPr>
-          <w:color w:val="505050"/>
+          <w:color w:val="464646"/>
           <w:sz w:val="18"/>
         </w:rPr>
         <w:t>Kasus Multi-Kriteria, Analisis Teknis, Kepatuhan Regulasi &amp; Mitigasi Risiko</w:t>
@@ -1618,15 +1663,16 @@
               <w:right w:val="single" w:sz="4" w:space="0" w:color="000000"/>
             </w:tcBorders>
             <w:tcMar>
-              <w:top w:w="120" w:type="dxa"/>
-              <w:left w:w="140" w:type="dxa"/>
-              <w:bottom w:w="120" w:type="dxa"/>
-              <w:right w:w="140" w:type="dxa"/>
+              <w:top w:w="130" w:type="dxa"/>
+              <w:left w:w="150" w:type="dxa"/>
+              <w:bottom w:w="130" w:type="dxa"/>
+              <w:right w:w="150" w:type="dxa"/>
             </w:tcMar>
           </w:tcPr>
           <w:p>
             <w:pPr>
-              <w:spacing w:before="40" w:after="60" w:line="276" w:lineRule="auto"/>
+              <w:spacing w:before="40" w:after="40" w:line="360" w:lineRule="auto"/>
+              <w:jc w:val="both"/>
             </w:pPr>
             <w:r>
               <w:rPr>
@@ -1645,7 +1691,8 @@
           </w:p>
           <w:p>
             <w:pPr>
-              <w:spacing w:before="40" w:after="60" w:line="276" w:lineRule="auto"/>
+              <w:spacing w:before="40" w:after="40" w:line="360" w:lineRule="auto"/>
+              <w:jc w:val="both"/>
             </w:pPr>
             <w:r>
               <w:rPr>
@@ -1664,7 +1711,8 @@
           </w:p>
           <w:p>
             <w:pPr>
-              <w:spacing w:before="40" w:after="60" w:line="276" w:lineRule="auto"/>
+              <w:spacing w:before="40" w:after="40" w:line="360" w:lineRule="auto"/>
+              <w:jc w:val="both"/>
             </w:pPr>
             <w:r>
               <w:rPr>
@@ -1683,7 +1731,8 @@
           </w:p>
           <w:p>
             <w:pPr>
-              <w:spacing w:before="40" w:after="60" w:line="276" w:lineRule="auto"/>
+              <w:spacing w:before="40" w:after="40" w:line="360" w:lineRule="auto"/>
+              <w:jc w:val="both"/>
             </w:pPr>
             <w:r>
               <w:rPr>
@@ -1710,7 +1759,8 @@
           </w:p>
           <w:p>
             <w:pPr>
-              <w:spacing w:before="40" w:after="60" w:line="276" w:lineRule="auto"/>
+              <w:spacing w:before="40" w:after="40" w:line="360" w:lineRule="auto"/>
+              <w:jc w:val="both"/>
             </w:pPr>
             <w:r>
               <w:rPr>
@@ -1733,7 +1783,8 @@
           </w:p>
           <w:p>
             <w:pPr>
-              <w:spacing w:before="40" w:after="60" w:line="276" w:lineRule="auto"/>
+              <w:spacing w:before="40" w:after="40" w:line="360" w:lineRule="auto"/>
+              <w:jc w:val="both"/>
             </w:pPr>
             <w:r>
               <w:rPr>
@@ -1760,7 +1811,8 @@
           </w:p>
           <w:p>
             <w:pPr>
-              <w:spacing w:before="40" w:after="60" w:line="276" w:lineRule="auto"/>
+              <w:spacing w:before="40" w:after="40" w:line="360" w:lineRule="auto"/>
+              <w:jc w:val="both"/>
             </w:pPr>
             <w:r>
               <w:rPr>

</xml_diff>

<commit_message>
belajar: sinkronisasi otomatis memori neuron dan pengetahuan (2026-08-27 08:35:11)
</commit_message>
<xml_diff>
--- a/Panduan Struktur Prompt AI.docx
+++ b/Panduan Struktur Prompt AI.docx
@@ -10,32 +10,32 @@
       <w:r>
         <w:rPr>
           <w:b/>
-          <w:sz w:val="32"/>
+          <w:sz w:val="30"/>
         </w:rPr>
         <w:t>PANDUAN STRUKTUR PROMPT AI</w:t>
       </w:r>
     </w:p>
     <w:p>
       <w:pPr>
-        <w:spacing w:after="280"/>
+        <w:spacing w:after="240"/>
         <w:jc w:val="center"/>
       </w:pPr>
       <w:r>
         <w:rPr>
-          <w:color w:val="464646"/>
-          <w:sz w:val="19"/>
+          <w:color w:val="505050"/>
+          <w:sz w:val="18"/>
         </w:rPr>
         <w:t>Format Baku dan Panduan Komponen Prompt Sederhana hingga Kompleks</w:t>
       </w:r>
     </w:p>
     <w:p>
       <w:pPr>
-        <w:spacing w:before="120" w:after="80"/>
+        <w:spacing w:before="80" w:after="80"/>
       </w:pPr>
       <w:r>
         <w:rPr>
           <w:b/>
-          <w:sz w:val="22"/>
+          <w:sz w:val="21"/>
         </w:rPr>
         <w:t>1. TABEL 7 ELEMEN DASAR PROMPT AI</w:t>
       </w:r>
@@ -47,10 +47,10 @@
         <w:tblLook w:firstColumn="1" w:firstRow="1" w:lastColumn="0" w:lastRow="0" w:noHBand="0" w:noVBand="1" w:val="04A0"/>
       </w:tblPr>
       <w:tblGrid>
-        <w:gridCol w:w="2409"/>
-        <w:gridCol w:w="2409"/>
-        <w:gridCol w:w="2409"/>
-        <w:gridCol w:w="2409"/>
+        <w:gridCol w:w="2466"/>
+        <w:gridCol w:w="2466"/>
+        <w:gridCol w:w="2466"/>
+        <w:gridCol w:w="2466"/>
       </w:tblGrid>
       <w:tr>
         <w:tc>
@@ -64,21 +64,21 @@
               <w:right w:val="single" w:sz="4" w:space="0" w:color="000000"/>
             </w:tcBorders>
             <w:tcMar>
-              <w:top w:w="100" w:type="dxa"/>
-              <w:left w:w="130" w:type="dxa"/>
-              <w:bottom w:w="100" w:type="dxa"/>
-              <w:right w:w="130" w:type="dxa"/>
+              <w:top w:w="80" w:type="dxa"/>
+              <w:left w:w="100" w:type="dxa"/>
+              <w:bottom w:w="80" w:type="dxa"/>
+              <w:right w:w="100" w:type="dxa"/>
             </w:tcMar>
           </w:tcPr>
           <w:p>
             <w:pPr>
-              <w:spacing w:before="20" w:after="20" w:line="312" w:lineRule="auto"/>
+              <w:spacing w:before="20" w:after="20" w:line="288" w:lineRule="auto"/>
               <w:jc w:val="center"/>
             </w:pPr>
             <w:r>
               <w:rPr>
                 <w:b/>
-                <w:sz w:val="18"/>
+                <w:sz w:val="17"/>
               </w:rPr>
               <w:t>No</w:t>
             </w:r>
@@ -95,21 +95,21 @@
               <w:right w:val="single" w:sz="4" w:space="0" w:color="000000"/>
             </w:tcBorders>
             <w:tcMar>
-              <w:top w:w="100" w:type="dxa"/>
-              <w:left w:w="130" w:type="dxa"/>
-              <w:bottom w:w="100" w:type="dxa"/>
-              <w:right w:w="130" w:type="dxa"/>
+              <w:top w:w="80" w:type="dxa"/>
+              <w:left w:w="100" w:type="dxa"/>
+              <w:bottom w:w="80" w:type="dxa"/>
+              <w:right w:w="100" w:type="dxa"/>
             </w:tcMar>
           </w:tcPr>
           <w:p>
             <w:pPr>
-              <w:spacing w:before="20" w:after="20" w:line="312" w:lineRule="auto"/>
+              <w:spacing w:before="20" w:after="20" w:line="288" w:lineRule="auto"/>
               <w:jc w:val="left"/>
             </w:pPr>
             <w:r>
               <w:rPr>
                 <w:b/>
-                <w:sz w:val="18"/>
+                <w:sz w:val="17"/>
               </w:rPr>
               <w:t>Elemen</w:t>
             </w:r>
@@ -117,7 +117,7 @@
         </w:tc>
         <w:tc>
           <w:tcPr>
-            <w:tcW w:type="dxa" w:w="3572"/>
+            <w:tcW w:type="dxa" w:w="3628"/>
             <w:vAlign w:val="top"/>
             <w:tcBorders>
               <w:top w:val="single" w:sz="4" w:space="0" w:color="000000"/>
@@ -126,21 +126,21 @@
               <w:right w:val="single" w:sz="4" w:space="0" w:color="000000"/>
             </w:tcBorders>
             <w:tcMar>
-              <w:top w:w="100" w:type="dxa"/>
-              <w:left w:w="130" w:type="dxa"/>
-              <w:bottom w:w="100" w:type="dxa"/>
-              <w:right w:w="130" w:type="dxa"/>
+              <w:top w:w="80" w:type="dxa"/>
+              <w:left w:w="100" w:type="dxa"/>
+              <w:bottom w:w="80" w:type="dxa"/>
+              <w:right w:w="100" w:type="dxa"/>
             </w:tcMar>
           </w:tcPr>
           <w:p>
             <w:pPr>
-              <w:spacing w:before="20" w:after="20" w:line="312" w:lineRule="auto"/>
+              <w:spacing w:before="20" w:after="20" w:line="288" w:lineRule="auto"/>
               <w:jc w:val="left"/>
             </w:pPr>
             <w:r>
               <w:rPr>
                 <w:b/>
-                <w:sz w:val="18"/>
+                <w:sz w:val="17"/>
               </w:rPr>
               <w:t>Fungsi &amp; Definisi</w:t>
             </w:r>
@@ -148,7 +148,7 @@
         </w:tc>
         <w:tc>
           <w:tcPr>
-            <w:tcW w:type="dxa" w:w="3685"/>
+            <w:tcW w:type="dxa" w:w="3855"/>
             <w:vAlign w:val="top"/>
             <w:tcBorders>
               <w:top w:val="single" w:sz="4" w:space="0" w:color="000000"/>
@@ -157,21 +157,21 @@
               <w:right w:val="single" w:sz="4" w:space="0" w:color="000000"/>
             </w:tcBorders>
             <w:tcMar>
-              <w:top w:w="100" w:type="dxa"/>
-              <w:left w:w="130" w:type="dxa"/>
-              <w:bottom w:w="100" w:type="dxa"/>
-              <w:right w:w="130" w:type="dxa"/>
+              <w:top w:w="80" w:type="dxa"/>
+              <w:left w:w="100" w:type="dxa"/>
+              <w:bottom w:w="80" w:type="dxa"/>
+              <w:right w:w="100" w:type="dxa"/>
             </w:tcMar>
           </w:tcPr>
           <w:p>
             <w:pPr>
-              <w:spacing w:before="20" w:after="20" w:line="312" w:lineRule="auto"/>
+              <w:spacing w:before="20" w:after="20" w:line="288" w:lineRule="auto"/>
               <w:jc w:val="left"/>
             </w:pPr>
             <w:r>
               <w:rPr>
                 <w:b/>
-                <w:sz w:val="18"/>
+                <w:sz w:val="17"/>
               </w:rPr>
               <w:t>Cara Pengisian</w:t>
             </w:r>
@@ -190,20 +190,20 @@
               <w:right w:val="single" w:sz="4" w:space="0" w:color="000000"/>
             </w:tcBorders>
             <w:tcMar>
-              <w:top w:w="100" w:type="dxa"/>
-              <w:left w:w="130" w:type="dxa"/>
-              <w:bottom w:w="100" w:type="dxa"/>
-              <w:right w:w="130" w:type="dxa"/>
+              <w:top w:w="80" w:type="dxa"/>
+              <w:left w:w="100" w:type="dxa"/>
+              <w:bottom w:w="80" w:type="dxa"/>
+              <w:right w:w="100" w:type="dxa"/>
             </w:tcMar>
           </w:tcPr>
           <w:p>
             <w:pPr>
-              <w:spacing w:before="20" w:after="20" w:line="312" w:lineRule="auto"/>
+              <w:spacing w:before="20" w:after="20" w:line="288" w:lineRule="auto"/>
               <w:jc w:val="center"/>
             </w:pPr>
             <w:r>
               <w:rPr>
-                <w:sz w:val="17"/>
+                <w:sz w:val="16"/>
               </w:rPr>
               <w:t>1</w:t>
             </w:r>
@@ -220,21 +220,21 @@
               <w:right w:val="single" w:sz="4" w:space="0" w:color="000000"/>
             </w:tcBorders>
             <w:tcMar>
-              <w:top w:w="100" w:type="dxa"/>
-              <w:left w:w="130" w:type="dxa"/>
-              <w:bottom w:w="100" w:type="dxa"/>
-              <w:right w:w="130" w:type="dxa"/>
+              <w:top w:w="80" w:type="dxa"/>
+              <w:left w:w="100" w:type="dxa"/>
+              <w:bottom w:w="80" w:type="dxa"/>
+              <w:right w:w="100" w:type="dxa"/>
             </w:tcMar>
           </w:tcPr>
           <w:p>
             <w:pPr>
-              <w:spacing w:before="20" w:after="20" w:line="312" w:lineRule="auto"/>
+              <w:spacing w:before="20" w:after="20" w:line="288" w:lineRule="auto"/>
               <w:jc w:val="left"/>
             </w:pPr>
             <w:r>
               <w:rPr>
                 <w:b/>
-                <w:sz w:val="17"/>
+                <w:sz w:val="16"/>
               </w:rPr>
               <w:t>Konteks</w:t>
             </w:r>
@@ -242,7 +242,7 @@
         </w:tc>
         <w:tc>
           <w:tcPr>
-            <w:tcW w:type="dxa" w:w="3572"/>
+            <w:tcW w:type="dxa" w:w="3628"/>
             <w:vAlign w:val="top"/>
             <w:tcBorders>
               <w:top w:val="single" w:sz="4" w:space="0" w:color="000000"/>
@@ -251,20 +251,20 @@
               <w:right w:val="single" w:sz="4" w:space="0" w:color="000000"/>
             </w:tcBorders>
             <w:tcMar>
-              <w:top w:w="100" w:type="dxa"/>
-              <w:left w:w="130" w:type="dxa"/>
-              <w:bottom w:w="100" w:type="dxa"/>
-              <w:right w:w="130" w:type="dxa"/>
+              <w:top w:w="80" w:type="dxa"/>
+              <w:left w:w="100" w:type="dxa"/>
+              <w:bottom w:w="80" w:type="dxa"/>
+              <w:right w:w="100" w:type="dxa"/>
             </w:tcMar>
           </w:tcPr>
           <w:p>
             <w:pPr>
-              <w:spacing w:before="20" w:after="20" w:line="312" w:lineRule="auto"/>
-              <w:jc w:val="both"/>
+              <w:spacing w:before="20" w:after="20" w:line="288" w:lineRule="auto"/>
+              <w:jc w:val="left"/>
             </w:pPr>
             <w:r>
               <w:rPr>
-                <w:sz w:val="17"/>
+                <w:sz w:val="16"/>
               </w:rPr>
               <w:t>Situasi kerja, latar belakang, dan tujuan spesifik yang ingin dicapai.</w:t>
             </w:r>
@@ -272,7 +272,7 @@
         </w:tc>
         <w:tc>
           <w:tcPr>
-            <w:tcW w:type="dxa" w:w="3685"/>
+            <w:tcW w:type="dxa" w:w="3855"/>
             <w:vAlign w:val="top"/>
             <w:tcBorders>
               <w:top w:val="single" w:sz="4" w:space="0" w:color="000000"/>
@@ -281,20 +281,20 @@
               <w:right w:val="single" w:sz="4" w:space="0" w:color="000000"/>
             </w:tcBorders>
             <w:tcMar>
-              <w:top w:w="100" w:type="dxa"/>
-              <w:left w:w="130" w:type="dxa"/>
-              <w:bottom w:w="100" w:type="dxa"/>
-              <w:right w:w="130" w:type="dxa"/>
+              <w:top w:w="80" w:type="dxa"/>
+              <w:left w:w="100" w:type="dxa"/>
+              <w:bottom w:w="80" w:type="dxa"/>
+              <w:right w:w="100" w:type="dxa"/>
             </w:tcMar>
           </w:tcPr>
           <w:p>
             <w:pPr>
-              <w:spacing w:before="20" w:after="20" w:line="312" w:lineRule="auto"/>
-              <w:jc w:val="both"/>
+              <w:spacing w:before="20" w:after="20" w:line="288" w:lineRule="auto"/>
+              <w:jc w:val="left"/>
             </w:pPr>
             <w:r>
               <w:rPr>
-                <w:sz w:val="17"/>
+                <w:sz w:val="16"/>
               </w:rPr>
               <w:t>Jelaskan situasi riil, batasan domain, dan target output yang dibutuhkan.</w:t>
             </w:r>
@@ -313,20 +313,20 @@
               <w:right w:val="single" w:sz="4" w:space="0" w:color="000000"/>
             </w:tcBorders>
             <w:tcMar>
-              <w:top w:w="100" w:type="dxa"/>
-              <w:left w:w="130" w:type="dxa"/>
-              <w:bottom w:w="100" w:type="dxa"/>
-              <w:right w:w="130" w:type="dxa"/>
+              <w:top w:w="80" w:type="dxa"/>
+              <w:left w:w="100" w:type="dxa"/>
+              <w:bottom w:w="80" w:type="dxa"/>
+              <w:right w:w="100" w:type="dxa"/>
             </w:tcMar>
           </w:tcPr>
           <w:p>
             <w:pPr>
-              <w:spacing w:before="20" w:after="20" w:line="312" w:lineRule="auto"/>
+              <w:spacing w:before="20" w:after="20" w:line="288" w:lineRule="auto"/>
               <w:jc w:val="center"/>
             </w:pPr>
             <w:r>
               <w:rPr>
-                <w:sz w:val="17"/>
+                <w:sz w:val="16"/>
               </w:rPr>
               <w:t>2</w:t>
             </w:r>
@@ -343,21 +343,21 @@
               <w:right w:val="single" w:sz="4" w:space="0" w:color="000000"/>
             </w:tcBorders>
             <w:tcMar>
-              <w:top w:w="100" w:type="dxa"/>
-              <w:left w:w="130" w:type="dxa"/>
-              <w:bottom w:w="100" w:type="dxa"/>
-              <w:right w:w="130" w:type="dxa"/>
+              <w:top w:w="80" w:type="dxa"/>
+              <w:left w:w="100" w:type="dxa"/>
+              <w:bottom w:w="80" w:type="dxa"/>
+              <w:right w:w="100" w:type="dxa"/>
             </w:tcMar>
           </w:tcPr>
           <w:p>
             <w:pPr>
-              <w:spacing w:before="20" w:after="20" w:line="312" w:lineRule="auto"/>
+              <w:spacing w:before="20" w:after="20" w:line="288" w:lineRule="auto"/>
               <w:jc w:val="left"/>
             </w:pPr>
             <w:r>
               <w:rPr>
                 <w:b/>
-                <w:sz w:val="17"/>
+                <w:sz w:val="16"/>
               </w:rPr>
               <w:t>Peran</w:t>
             </w:r>
@@ -365,7 +365,7 @@
         </w:tc>
         <w:tc>
           <w:tcPr>
-            <w:tcW w:type="dxa" w:w="3572"/>
+            <w:tcW w:type="dxa" w:w="3628"/>
             <w:vAlign w:val="top"/>
             <w:tcBorders>
               <w:top w:val="single" w:sz="4" w:space="0" w:color="000000"/>
@@ -374,20 +374,20 @@
               <w:right w:val="single" w:sz="4" w:space="0" w:color="000000"/>
             </w:tcBorders>
             <w:tcMar>
-              <w:top w:w="100" w:type="dxa"/>
-              <w:left w:w="130" w:type="dxa"/>
-              <w:bottom w:w="100" w:type="dxa"/>
-              <w:right w:w="130" w:type="dxa"/>
+              <w:top w:w="80" w:type="dxa"/>
+              <w:left w:w="100" w:type="dxa"/>
+              <w:bottom w:w="80" w:type="dxa"/>
+              <w:right w:w="100" w:type="dxa"/>
             </w:tcMar>
           </w:tcPr>
           <w:p>
             <w:pPr>
-              <w:spacing w:before="20" w:after="20" w:line="312" w:lineRule="auto"/>
-              <w:jc w:val="both"/>
+              <w:spacing w:before="20" w:after="20" w:line="288" w:lineRule="auto"/>
+              <w:jc w:val="left"/>
             </w:pPr>
             <w:r>
               <w:rPr>
-                <w:sz w:val="17"/>
+                <w:sz w:val="16"/>
               </w:rPr>
               <w:t>Persona, tingkat keahlian, atau sudut pandang profesional yang ditugaskan ke AI.</w:t>
             </w:r>
@@ -395,7 +395,7 @@
         </w:tc>
         <w:tc>
           <w:tcPr>
-            <w:tcW w:type="dxa" w:w="3685"/>
+            <w:tcW w:type="dxa" w:w="3855"/>
             <w:vAlign w:val="top"/>
             <w:tcBorders>
               <w:top w:val="single" w:sz="4" w:space="0" w:color="000000"/>
@@ -404,20 +404,20 @@
               <w:right w:val="single" w:sz="4" w:space="0" w:color="000000"/>
             </w:tcBorders>
             <w:tcMar>
-              <w:top w:w="100" w:type="dxa"/>
-              <w:left w:w="130" w:type="dxa"/>
-              <w:bottom w:w="100" w:type="dxa"/>
-              <w:right w:w="130" w:type="dxa"/>
+              <w:top w:w="80" w:type="dxa"/>
+              <w:left w:w="100" w:type="dxa"/>
+              <w:bottom w:w="80" w:type="dxa"/>
+              <w:right w:w="100" w:type="dxa"/>
             </w:tcMar>
           </w:tcPr>
           <w:p>
             <w:pPr>
-              <w:spacing w:before="20" w:after="20" w:line="312" w:lineRule="auto"/>
-              <w:jc w:val="both"/>
+              <w:spacing w:before="20" w:after="20" w:line="288" w:lineRule="auto"/>
+              <w:jc w:val="left"/>
             </w:pPr>
             <w:r>
               <w:rPr>
-                <w:sz w:val="17"/>
+                <w:sz w:val="16"/>
               </w:rPr>
               <w:t>Tentukan persona ahli (contoh: Principal Architect, Analis Data, Sekretaris).</w:t>
             </w:r>
@@ -436,20 +436,20 @@
               <w:right w:val="single" w:sz="4" w:space="0" w:color="000000"/>
             </w:tcBorders>
             <w:tcMar>
-              <w:top w:w="100" w:type="dxa"/>
-              <w:left w:w="130" w:type="dxa"/>
-              <w:bottom w:w="100" w:type="dxa"/>
-              <w:right w:w="130" w:type="dxa"/>
+              <w:top w:w="80" w:type="dxa"/>
+              <w:left w:w="100" w:type="dxa"/>
+              <w:bottom w:w="80" w:type="dxa"/>
+              <w:right w:w="100" w:type="dxa"/>
             </w:tcMar>
           </w:tcPr>
           <w:p>
             <w:pPr>
-              <w:spacing w:before="20" w:after="20" w:line="312" w:lineRule="auto"/>
+              <w:spacing w:before="20" w:after="20" w:line="288" w:lineRule="auto"/>
               <w:jc w:val="center"/>
             </w:pPr>
             <w:r>
               <w:rPr>
-                <w:sz w:val="17"/>
+                <w:sz w:val="16"/>
               </w:rPr>
               <w:t>3</w:t>
             </w:r>
@@ -466,21 +466,21 @@
               <w:right w:val="single" w:sz="4" w:space="0" w:color="000000"/>
             </w:tcBorders>
             <w:tcMar>
-              <w:top w:w="100" w:type="dxa"/>
-              <w:left w:w="130" w:type="dxa"/>
-              <w:bottom w:w="100" w:type="dxa"/>
-              <w:right w:w="130" w:type="dxa"/>
+              <w:top w:w="80" w:type="dxa"/>
+              <w:left w:w="100" w:type="dxa"/>
+              <w:bottom w:w="80" w:type="dxa"/>
+              <w:right w:w="100" w:type="dxa"/>
             </w:tcMar>
           </w:tcPr>
           <w:p>
             <w:pPr>
-              <w:spacing w:before="20" w:after="20" w:line="312" w:lineRule="auto"/>
+              <w:spacing w:before="20" w:after="20" w:line="288" w:lineRule="auto"/>
               <w:jc w:val="left"/>
             </w:pPr>
             <w:r>
               <w:rPr>
                 <w:b/>
-                <w:sz w:val="17"/>
+                <w:sz w:val="16"/>
               </w:rPr>
               <w:t>Tugas</w:t>
             </w:r>
@@ -488,7 +488,7 @@
         </w:tc>
         <w:tc>
           <w:tcPr>
-            <w:tcW w:type="dxa" w:w="3572"/>
+            <w:tcW w:type="dxa" w:w="3628"/>
             <w:vAlign w:val="top"/>
             <w:tcBorders>
               <w:top w:val="single" w:sz="4" w:space="0" w:color="000000"/>
@@ -497,20 +497,20 @@
               <w:right w:val="single" w:sz="4" w:space="0" w:color="000000"/>
             </w:tcBorders>
             <w:tcMar>
-              <w:top w:w="100" w:type="dxa"/>
-              <w:left w:w="130" w:type="dxa"/>
-              <w:bottom w:w="100" w:type="dxa"/>
-              <w:right w:w="130" w:type="dxa"/>
+              <w:top w:w="80" w:type="dxa"/>
+              <w:left w:w="100" w:type="dxa"/>
+              <w:bottom w:w="80" w:type="dxa"/>
+              <w:right w:w="100" w:type="dxa"/>
             </w:tcMar>
           </w:tcPr>
           <w:p>
             <w:pPr>
-              <w:spacing w:before="20" w:after="20" w:line="312" w:lineRule="auto"/>
-              <w:jc w:val="both"/>
+              <w:spacing w:before="20" w:after="20" w:line="288" w:lineRule="auto"/>
+              <w:jc w:val="left"/>
             </w:pPr>
             <w:r>
               <w:rPr>
-                <w:sz w:val="17"/>
+                <w:sz w:val="16"/>
               </w:rPr>
               <w:t>Instruksi pekerjaan spesifik yang wajib dikerjakan oleh AI.</w:t>
             </w:r>
@@ -518,7 +518,7 @@
         </w:tc>
         <w:tc>
           <w:tcPr>
-            <w:tcW w:type="dxa" w:w="3685"/>
+            <w:tcW w:type="dxa" w:w="3855"/>
             <w:vAlign w:val="top"/>
             <w:tcBorders>
               <w:top w:val="single" w:sz="4" w:space="0" w:color="000000"/>
@@ -527,20 +527,20 @@
               <w:right w:val="single" w:sz="4" w:space="0" w:color="000000"/>
             </w:tcBorders>
             <w:tcMar>
-              <w:top w:w="100" w:type="dxa"/>
-              <w:left w:w="130" w:type="dxa"/>
-              <w:bottom w:w="100" w:type="dxa"/>
-              <w:right w:w="130" w:type="dxa"/>
+              <w:top w:w="80" w:type="dxa"/>
+              <w:left w:w="100" w:type="dxa"/>
+              <w:bottom w:w="80" w:type="dxa"/>
+              <w:right w:w="100" w:type="dxa"/>
             </w:tcMar>
           </w:tcPr>
           <w:p>
             <w:pPr>
-              <w:spacing w:before="20" w:after="20" w:line="312" w:lineRule="auto"/>
-              <w:jc w:val="both"/>
+              <w:spacing w:before="20" w:after="20" w:line="288" w:lineRule="auto"/>
+              <w:jc w:val="left"/>
             </w:pPr>
             <w:r>
               <w:rPr>
-                <w:sz w:val="17"/>
+                <w:sz w:val="16"/>
               </w:rPr>
               <w:t>Gunakan kata kerja aksi operasional: analisis, bandingkan, hitung, susun.</w:t>
             </w:r>
@@ -559,20 +559,20 @@
               <w:right w:val="single" w:sz="4" w:space="0" w:color="000000"/>
             </w:tcBorders>
             <w:tcMar>
-              <w:top w:w="100" w:type="dxa"/>
-              <w:left w:w="130" w:type="dxa"/>
-              <w:bottom w:w="100" w:type="dxa"/>
-              <w:right w:w="130" w:type="dxa"/>
+              <w:top w:w="80" w:type="dxa"/>
+              <w:left w:w="100" w:type="dxa"/>
+              <w:bottom w:w="80" w:type="dxa"/>
+              <w:right w:w="100" w:type="dxa"/>
             </w:tcMar>
           </w:tcPr>
           <w:p>
             <w:pPr>
-              <w:spacing w:before="20" w:after="20" w:line="312" w:lineRule="auto"/>
+              <w:spacing w:before="20" w:after="20" w:line="288" w:lineRule="auto"/>
               <w:jc w:val="center"/>
             </w:pPr>
             <w:r>
               <w:rPr>
-                <w:sz w:val="17"/>
+                <w:sz w:val="16"/>
               </w:rPr>
               <w:t>4</w:t>
             </w:r>
@@ -589,21 +589,21 @@
               <w:right w:val="single" w:sz="4" w:space="0" w:color="000000"/>
             </w:tcBorders>
             <w:tcMar>
-              <w:top w:w="100" w:type="dxa"/>
-              <w:left w:w="130" w:type="dxa"/>
-              <w:bottom w:w="100" w:type="dxa"/>
-              <w:right w:w="130" w:type="dxa"/>
+              <w:top w:w="80" w:type="dxa"/>
+              <w:left w:w="100" w:type="dxa"/>
+              <w:bottom w:w="80" w:type="dxa"/>
+              <w:right w:w="100" w:type="dxa"/>
             </w:tcMar>
           </w:tcPr>
           <w:p>
             <w:pPr>
-              <w:spacing w:before="20" w:after="20" w:line="312" w:lineRule="auto"/>
+              <w:spacing w:before="20" w:after="20" w:line="288" w:lineRule="auto"/>
               <w:jc w:val="left"/>
             </w:pPr>
             <w:r>
               <w:rPr>
                 <w:b/>
-                <w:sz w:val="17"/>
+                <w:sz w:val="16"/>
               </w:rPr>
               <w:t>Input</w:t>
             </w:r>
@@ -611,7 +611,7 @@
         </w:tc>
         <w:tc>
           <w:tcPr>
-            <w:tcW w:type="dxa" w:w="3572"/>
+            <w:tcW w:type="dxa" w:w="3628"/>
             <w:vAlign w:val="top"/>
             <w:tcBorders>
               <w:top w:val="single" w:sz="4" w:space="0" w:color="000000"/>
@@ -620,20 +620,20 @@
               <w:right w:val="single" w:sz="4" w:space="0" w:color="000000"/>
             </w:tcBorders>
             <w:tcMar>
-              <w:top w:w="100" w:type="dxa"/>
-              <w:left w:w="130" w:type="dxa"/>
-              <w:bottom w:w="100" w:type="dxa"/>
-              <w:right w:w="130" w:type="dxa"/>
+              <w:top w:w="80" w:type="dxa"/>
+              <w:left w:w="100" w:type="dxa"/>
+              <w:bottom w:w="80" w:type="dxa"/>
+              <w:right w:w="100" w:type="dxa"/>
             </w:tcMar>
           </w:tcPr>
           <w:p>
             <w:pPr>
-              <w:spacing w:before="20" w:after="20" w:line="312" w:lineRule="auto"/>
-              <w:jc w:val="both"/>
+              <w:spacing w:before="20" w:after="20" w:line="288" w:lineRule="auto"/>
+              <w:jc w:val="left"/>
             </w:pPr>
             <w:r>
               <w:rPr>
-                <w:sz w:val="17"/>
+                <w:sz w:val="16"/>
               </w:rPr>
               <w:t>Data mentah, spesifikasi, matriks angka, atau catatan acuan.</w:t>
             </w:r>
@@ -641,7 +641,7 @@
         </w:tc>
         <w:tc>
           <w:tcPr>
-            <w:tcW w:type="dxa" w:w="3685"/>
+            <w:tcW w:type="dxa" w:w="3855"/>
             <w:vAlign w:val="top"/>
             <w:tcBorders>
               <w:top w:val="single" w:sz="4" w:space="0" w:color="000000"/>
@@ -650,20 +650,20 @@
               <w:right w:val="single" w:sz="4" w:space="0" w:color="000000"/>
             </w:tcBorders>
             <w:tcMar>
-              <w:top w:w="100" w:type="dxa"/>
-              <w:left w:w="130" w:type="dxa"/>
-              <w:bottom w:w="100" w:type="dxa"/>
-              <w:right w:w="130" w:type="dxa"/>
+              <w:top w:w="80" w:type="dxa"/>
+              <w:left w:w="100" w:type="dxa"/>
+              <w:bottom w:w="80" w:type="dxa"/>
+              <w:right w:w="100" w:type="dxa"/>
             </w:tcMar>
           </w:tcPr>
           <w:p>
             <w:pPr>
-              <w:spacing w:before="20" w:after="20" w:line="312" w:lineRule="auto"/>
-              <w:jc w:val="both"/>
+              <w:spacing w:before="20" w:after="20" w:line="288" w:lineRule="auto"/>
+              <w:jc w:val="left"/>
             </w:pPr>
             <w:r>
               <w:rPr>
-                <w:sz w:val="17"/>
+                <w:sz w:val="16"/>
               </w:rPr>
               <w:t>Sertakan seluruh data relevan; larang AI membuat data fiktif.</w:t>
             </w:r>
@@ -682,20 +682,20 @@
               <w:right w:val="single" w:sz="4" w:space="0" w:color="000000"/>
             </w:tcBorders>
             <w:tcMar>
-              <w:top w:w="100" w:type="dxa"/>
-              <w:left w:w="130" w:type="dxa"/>
-              <w:bottom w:w="100" w:type="dxa"/>
-              <w:right w:w="130" w:type="dxa"/>
+              <w:top w:w="80" w:type="dxa"/>
+              <w:left w:w="100" w:type="dxa"/>
+              <w:bottom w:w="80" w:type="dxa"/>
+              <w:right w:w="100" w:type="dxa"/>
             </w:tcMar>
           </w:tcPr>
           <w:p>
             <w:pPr>
-              <w:spacing w:before="20" w:after="20" w:line="312" w:lineRule="auto"/>
+              <w:spacing w:before="20" w:after="20" w:line="288" w:lineRule="auto"/>
               <w:jc w:val="center"/>
             </w:pPr>
             <w:r>
               <w:rPr>
-                <w:sz w:val="17"/>
+                <w:sz w:val="16"/>
               </w:rPr>
               <w:t>5</w:t>
             </w:r>
@@ -712,21 +712,21 @@
               <w:right w:val="single" w:sz="4" w:space="0" w:color="000000"/>
             </w:tcBorders>
             <w:tcMar>
-              <w:top w:w="100" w:type="dxa"/>
-              <w:left w:w="130" w:type="dxa"/>
-              <w:bottom w:w="100" w:type="dxa"/>
-              <w:right w:w="130" w:type="dxa"/>
+              <w:top w:w="80" w:type="dxa"/>
+              <w:left w:w="100" w:type="dxa"/>
+              <w:bottom w:w="80" w:type="dxa"/>
+              <w:right w:w="100" w:type="dxa"/>
             </w:tcMar>
           </w:tcPr>
           <w:p>
             <w:pPr>
-              <w:spacing w:before="20" w:after="20" w:line="312" w:lineRule="auto"/>
+              <w:spacing w:before="20" w:after="20" w:line="288" w:lineRule="auto"/>
               <w:jc w:val="left"/>
             </w:pPr>
             <w:r>
               <w:rPr>
                 <w:b/>
-                <w:sz w:val="17"/>
+                <w:sz w:val="16"/>
               </w:rPr>
               <w:t>Kriteria / Batasan</w:t>
             </w:r>
@@ -734,7 +734,7 @@
         </w:tc>
         <w:tc>
           <w:tcPr>
-            <w:tcW w:type="dxa" w:w="3572"/>
+            <w:tcW w:type="dxa" w:w="3628"/>
             <w:vAlign w:val="top"/>
             <w:tcBorders>
               <w:top w:val="single" w:sz="4" w:space="0" w:color="000000"/>
@@ -743,20 +743,20 @@
               <w:right w:val="single" w:sz="4" w:space="0" w:color="000000"/>
             </w:tcBorders>
             <w:tcMar>
-              <w:top w:w="100" w:type="dxa"/>
-              <w:left w:w="130" w:type="dxa"/>
-              <w:bottom w:w="100" w:type="dxa"/>
-              <w:right w:w="130" w:type="dxa"/>
+              <w:top w:w="80" w:type="dxa"/>
+              <w:left w:w="100" w:type="dxa"/>
+              <w:bottom w:w="80" w:type="dxa"/>
+              <w:right w:w="100" w:type="dxa"/>
             </w:tcMar>
           </w:tcPr>
           <w:p>
             <w:pPr>
-              <w:spacing w:before="20" w:after="20" w:line="312" w:lineRule="auto"/>
-              <w:jc w:val="both"/>
+              <w:spacing w:before="20" w:after="20" w:line="288" w:lineRule="auto"/>
+              <w:jc w:val="left"/>
             </w:pPr>
             <w:r>
               <w:rPr>
-                <w:sz w:val="17"/>
+                <w:sz w:val="16"/>
               </w:rPr>
               <w:t>Aturan ketat, kriteria kelayakan, batasan biaya/hukum, dan larangan halusinasi.</w:t>
             </w:r>
@@ -764,7 +764,7 @@
         </w:tc>
         <w:tc>
           <w:tcPr>
-            <w:tcW w:type="dxa" w:w="3685"/>
+            <w:tcW w:type="dxa" w:w="3855"/>
             <w:vAlign w:val="top"/>
             <w:tcBorders>
               <w:top w:val="single" w:sz="4" w:space="0" w:color="000000"/>
@@ -773,20 +773,20 @@
               <w:right w:val="single" w:sz="4" w:space="0" w:color="000000"/>
             </w:tcBorders>
             <w:tcMar>
-              <w:top w:w="100" w:type="dxa"/>
-              <w:left w:w="130" w:type="dxa"/>
-              <w:bottom w:w="100" w:type="dxa"/>
-              <w:right w:w="130" w:type="dxa"/>
+              <w:top w:w="80" w:type="dxa"/>
+              <w:left w:w="100" w:type="dxa"/>
+              <w:bottom w:w="80" w:type="dxa"/>
+              <w:right w:w="100" w:type="dxa"/>
             </w:tcMar>
           </w:tcPr>
           <w:p>
             <w:pPr>
-              <w:spacing w:before="20" w:after="20" w:line="312" w:lineRule="auto"/>
-              <w:jc w:val="both"/>
+              <w:spacing w:before="20" w:after="20" w:line="288" w:lineRule="auto"/>
+              <w:jc w:val="left"/>
             </w:pPr>
             <w:r>
               <w:rPr>
-                <w:sz w:val="17"/>
+                <w:sz w:val="16"/>
               </w:rPr>
               <w:t>Tetapkan parameter eliminasi, batas toleransi error, dan nada komunikasi.</w:t>
             </w:r>
@@ -805,20 +805,20 @@
               <w:right w:val="single" w:sz="4" w:space="0" w:color="000000"/>
             </w:tcBorders>
             <w:tcMar>
-              <w:top w:w="100" w:type="dxa"/>
-              <w:left w:w="130" w:type="dxa"/>
-              <w:bottom w:w="100" w:type="dxa"/>
-              <w:right w:w="130" w:type="dxa"/>
+              <w:top w:w="80" w:type="dxa"/>
+              <w:left w:w="100" w:type="dxa"/>
+              <w:bottom w:w="80" w:type="dxa"/>
+              <w:right w:w="100" w:type="dxa"/>
             </w:tcMar>
           </w:tcPr>
           <w:p>
             <w:pPr>
-              <w:spacing w:before="20" w:after="20" w:line="312" w:lineRule="auto"/>
+              <w:spacing w:before="20" w:after="20" w:line="288" w:lineRule="auto"/>
               <w:jc w:val="center"/>
             </w:pPr>
             <w:r>
               <w:rPr>
-                <w:sz w:val="17"/>
+                <w:sz w:val="16"/>
               </w:rPr>
               <w:t>6</w:t>
             </w:r>
@@ -835,21 +835,21 @@
               <w:right w:val="single" w:sz="4" w:space="0" w:color="000000"/>
             </w:tcBorders>
             <w:tcMar>
-              <w:top w:w="100" w:type="dxa"/>
-              <w:left w:w="130" w:type="dxa"/>
-              <w:bottom w:w="100" w:type="dxa"/>
-              <w:right w:w="130" w:type="dxa"/>
+              <w:top w:w="80" w:type="dxa"/>
+              <w:left w:w="100" w:type="dxa"/>
+              <w:bottom w:w="80" w:type="dxa"/>
+              <w:right w:w="100" w:type="dxa"/>
             </w:tcMar>
           </w:tcPr>
           <w:p>
             <w:pPr>
-              <w:spacing w:before="20" w:after="20" w:line="312" w:lineRule="auto"/>
+              <w:spacing w:before="20" w:after="20" w:line="288" w:lineRule="auto"/>
               <w:jc w:val="left"/>
             </w:pPr>
             <w:r>
               <w:rPr>
                 <w:b/>
-                <w:sz w:val="17"/>
+                <w:sz w:val="16"/>
               </w:rPr>
               <w:t>Format Output</w:t>
             </w:r>
@@ -857,7 +857,7 @@
         </w:tc>
         <w:tc>
           <w:tcPr>
-            <w:tcW w:type="dxa" w:w="3572"/>
+            <w:tcW w:type="dxa" w:w="3628"/>
             <w:vAlign w:val="top"/>
             <w:tcBorders>
               <w:top w:val="single" w:sz="4" w:space="0" w:color="000000"/>
@@ -866,20 +866,20 @@
               <w:right w:val="single" w:sz="4" w:space="0" w:color="000000"/>
             </w:tcBorders>
             <w:tcMar>
-              <w:top w:w="100" w:type="dxa"/>
-              <w:left w:w="130" w:type="dxa"/>
-              <w:bottom w:w="100" w:type="dxa"/>
-              <w:right w:w="130" w:type="dxa"/>
+              <w:top w:w="80" w:type="dxa"/>
+              <w:left w:w="100" w:type="dxa"/>
+              <w:bottom w:w="80" w:type="dxa"/>
+              <w:right w:w="100" w:type="dxa"/>
             </w:tcMar>
           </w:tcPr>
           <w:p>
             <w:pPr>
-              <w:spacing w:before="20" w:after="20" w:line="312" w:lineRule="auto"/>
-              <w:jc w:val="both"/>
+              <w:spacing w:before="20" w:after="20" w:line="288" w:lineRule="auto"/>
+              <w:jc w:val="left"/>
             </w:pPr>
             <w:r>
               <w:rPr>
-                <w:sz w:val="17"/>
+                <w:sz w:val="16"/>
               </w:rPr>
               <w:t>Susunan struktur dokumen, template tabel, urutan bab, atau format data.</w:t>
             </w:r>
@@ -887,7 +887,7 @@
         </w:tc>
         <w:tc>
           <w:tcPr>
-            <w:tcW w:type="dxa" w:w="3685"/>
+            <w:tcW w:type="dxa" w:w="3855"/>
             <w:vAlign w:val="top"/>
             <w:tcBorders>
               <w:top w:val="single" w:sz="4" w:space="0" w:color="000000"/>
@@ -896,20 +896,20 @@
               <w:right w:val="single" w:sz="4" w:space="0" w:color="000000"/>
             </w:tcBorders>
             <w:tcMar>
-              <w:top w:w="100" w:type="dxa"/>
-              <w:left w:w="130" w:type="dxa"/>
-              <w:bottom w:w="100" w:type="dxa"/>
-              <w:right w:w="130" w:type="dxa"/>
+              <w:top w:w="80" w:type="dxa"/>
+              <w:left w:w="100" w:type="dxa"/>
+              <w:bottom w:w="80" w:type="dxa"/>
+              <w:right w:w="100" w:type="dxa"/>
             </w:tcMar>
           </w:tcPr>
           <w:p>
             <w:pPr>
-              <w:spacing w:before="20" w:after="20" w:line="312" w:lineRule="auto"/>
-              <w:jc w:val="both"/>
+              <w:spacing w:before="20" w:after="20" w:line="288" w:lineRule="auto"/>
+              <w:jc w:val="left"/>
             </w:pPr>
             <w:r>
               <w:rPr>
-                <w:sz w:val="17"/>
+                <w:sz w:val="16"/>
               </w:rPr>
               <w:t>Tentukan pembagian bab, tabel komparasi, poin rekomendasi, atau format tabel.</w:t>
             </w:r>
@@ -928,20 +928,20 @@
               <w:right w:val="single" w:sz="4" w:space="0" w:color="000000"/>
             </w:tcBorders>
             <w:tcMar>
-              <w:top w:w="100" w:type="dxa"/>
-              <w:left w:w="130" w:type="dxa"/>
-              <w:bottom w:w="100" w:type="dxa"/>
-              <w:right w:w="130" w:type="dxa"/>
+              <w:top w:w="80" w:type="dxa"/>
+              <w:left w:w="100" w:type="dxa"/>
+              <w:bottom w:w="80" w:type="dxa"/>
+              <w:right w:w="100" w:type="dxa"/>
             </w:tcMar>
           </w:tcPr>
           <w:p>
             <w:pPr>
-              <w:spacing w:before="20" w:after="20" w:line="312" w:lineRule="auto"/>
+              <w:spacing w:before="20" w:after="20" w:line="288" w:lineRule="auto"/>
               <w:jc w:val="center"/>
             </w:pPr>
             <w:r>
               <w:rPr>
-                <w:sz w:val="17"/>
+                <w:sz w:val="16"/>
               </w:rPr>
               <w:t>7</w:t>
             </w:r>
@@ -958,21 +958,21 @@
               <w:right w:val="single" w:sz="4" w:space="0" w:color="000000"/>
             </w:tcBorders>
             <w:tcMar>
-              <w:top w:w="100" w:type="dxa"/>
-              <w:left w:w="130" w:type="dxa"/>
-              <w:bottom w:w="100" w:type="dxa"/>
-              <w:right w:w="130" w:type="dxa"/>
+              <w:top w:w="80" w:type="dxa"/>
+              <w:left w:w="100" w:type="dxa"/>
+              <w:bottom w:w="80" w:type="dxa"/>
+              <w:right w:w="100" w:type="dxa"/>
             </w:tcMar>
           </w:tcPr>
           <w:p>
             <w:pPr>
-              <w:spacing w:before="20" w:after="20" w:line="312" w:lineRule="auto"/>
+              <w:spacing w:before="20" w:after="20" w:line="288" w:lineRule="auto"/>
               <w:jc w:val="left"/>
             </w:pPr>
             <w:r>
               <w:rPr>
                 <w:b/>
-                <w:sz w:val="17"/>
+                <w:sz w:val="16"/>
               </w:rPr>
               <w:t>Validasi</w:t>
             </w:r>
@@ -980,7 +980,7 @@
         </w:tc>
         <w:tc>
           <w:tcPr>
-            <w:tcW w:type="dxa" w:w="3572"/>
+            <w:tcW w:type="dxa" w:w="3628"/>
             <w:vAlign w:val="top"/>
             <w:tcBorders>
               <w:top w:val="single" w:sz="4" w:space="0" w:color="000000"/>
@@ -989,20 +989,20 @@
               <w:right w:val="single" w:sz="4" w:space="0" w:color="000000"/>
             </w:tcBorders>
             <w:tcMar>
-              <w:top w:w="100" w:type="dxa"/>
-              <w:left w:w="130" w:type="dxa"/>
-              <w:bottom w:w="100" w:type="dxa"/>
-              <w:right w:w="130" w:type="dxa"/>
+              <w:top w:w="80" w:type="dxa"/>
+              <w:left w:w="100" w:type="dxa"/>
+              <w:bottom w:w="80" w:type="dxa"/>
+              <w:right w:w="100" w:type="dxa"/>
             </w:tcMar>
           </w:tcPr>
           <w:p>
             <w:pPr>
-              <w:spacing w:before="20" w:after="20" w:line="312" w:lineRule="auto"/>
-              <w:jc w:val="both"/>
+              <w:spacing w:before="20" w:after="20" w:line="288" w:lineRule="auto"/>
+              <w:jc w:val="left"/>
             </w:pPr>
             <w:r>
               <w:rPr>
-                <w:sz w:val="17"/>
+                <w:sz w:val="16"/>
               </w:rPr>
               <w:t>Perintah verifikasi mandiri agar AI mengecek kembali kepatuhan hasil terhadap input.</w:t>
             </w:r>
@@ -1010,7 +1010,7 @@
         </w:tc>
         <w:tc>
           <w:tcPr>
-            <w:tcW w:type="dxa" w:w="3685"/>
+            <w:tcW w:type="dxa" w:w="3855"/>
             <w:vAlign w:val="top"/>
             <w:tcBorders>
               <w:top w:val="single" w:sz="4" w:space="0" w:color="000000"/>
@@ -1019,20 +1019,20 @@
               <w:right w:val="single" w:sz="4" w:space="0" w:color="000000"/>
             </w:tcBorders>
             <w:tcMar>
-              <w:top w:w="100" w:type="dxa"/>
-              <w:left w:w="130" w:type="dxa"/>
-              <w:bottom w:w="100" w:type="dxa"/>
-              <w:right w:w="130" w:type="dxa"/>
+              <w:top w:w="80" w:type="dxa"/>
+              <w:left w:w="100" w:type="dxa"/>
+              <w:bottom w:w="80" w:type="dxa"/>
+              <w:right w:w="100" w:type="dxa"/>
             </w:tcMar>
           </w:tcPr>
           <w:p>
             <w:pPr>
-              <w:spacing w:before="20" w:after="20" w:line="312" w:lineRule="auto"/>
-              <w:jc w:val="both"/>
+              <w:spacing w:before="20" w:after="20" w:line="288" w:lineRule="auto"/>
+              <w:jc w:val="left"/>
             </w:pPr>
             <w:r>
               <w:rPr>
-                <w:sz w:val="17"/>
+                <w:sz w:val="16"/>
               </w:rPr>
               <w:t>Instruksikan AI memvalidasi angka, kepatuhan kriteria, dan konsistensi data.</w:t>
             </w:r>
@@ -1042,12 +1042,12 @@
     </w:tbl>
     <w:p>
       <w:pPr>
-        <w:spacing w:before="280" w:after="80"/>
+        <w:spacing w:before="240" w:after="80"/>
       </w:pPr>
       <w:r>
         <w:rPr>
           <w:b/>
-          <w:sz w:val="22"/>
+          <w:sz w:val="21"/>
         </w:rPr>
         <w:t>2. POLA / TEMPLATE BAKU PROMPT</w:t>
       </w:r>
@@ -1059,12 +1059,12 @@
         <w:tblLook w:firstColumn="1" w:firstRow="1" w:lastColumn="0" w:lastRow="0" w:noHBand="0" w:noVBand="1" w:val="04A0"/>
       </w:tblPr>
       <w:tblGrid>
-        <w:gridCol w:w="9638"/>
+        <w:gridCol w:w="9866"/>
       </w:tblGrid>
       <w:tr>
         <w:tc>
           <w:tcPr>
-            <w:tcW w:type="dxa" w:w="9638"/>
+            <w:tcW w:type="dxa" w:w="9865"/>
             <w:tcBorders>
               <w:top w:val="single" w:sz="6" w:space="0" w:color="000000"/>
               <w:left w:val="single" w:sz="6" w:space="0" w:color="000000"/>
@@ -1072,16 +1072,16 @@
               <w:right w:val="single" w:sz="6" w:space="0" w:color="000000"/>
             </w:tcBorders>
             <w:tcMar>
-              <w:top w:w="140" w:type="dxa"/>
-              <w:left w:w="160" w:type="dxa"/>
-              <w:bottom w:w="140" w:type="dxa"/>
-              <w:right w:w="160" w:type="dxa"/>
+              <w:top w:w="100" w:type="dxa"/>
+              <w:left w:w="130" w:type="dxa"/>
+              <w:bottom w:w="100" w:type="dxa"/>
+              <w:right w:w="130" w:type="dxa"/>
             </w:tcMar>
           </w:tcPr>
           <w:p>
             <w:pPr>
-              <w:spacing w:before="0" w:after="60" w:line="360" w:lineRule="auto"/>
-              <w:jc w:val="both"/>
+              <w:spacing w:before="40" w:after="40" w:line="312" w:lineRule="auto"/>
+              <w:jc w:val="left"/>
             </w:pPr>
             <w:r>
               <w:rPr>
@@ -1099,8 +1099,8 @@
           </w:p>
           <w:p>
             <w:pPr>
-              <w:spacing w:before="60" w:after="60" w:line="360" w:lineRule="auto"/>
-              <w:jc w:val="both"/>
+              <w:spacing w:before="40" w:after="40" w:line="312" w:lineRule="auto"/>
+              <w:jc w:val="left"/>
             </w:pPr>
             <w:r>
               <w:rPr>
@@ -1118,8 +1118,8 @@
           </w:p>
           <w:p>
             <w:pPr>
-              <w:spacing w:before="60" w:after="60" w:line="360" w:lineRule="auto"/>
-              <w:jc w:val="both"/>
+              <w:spacing w:before="40" w:after="40" w:line="312" w:lineRule="auto"/>
+              <w:jc w:val="left"/>
             </w:pPr>
             <w:r>
               <w:rPr>
@@ -1137,8 +1137,8 @@
           </w:p>
           <w:p>
             <w:pPr>
-              <w:spacing w:before="60" w:after="60" w:line="360" w:lineRule="auto"/>
-              <w:jc w:val="both"/>
+              <w:spacing w:before="40" w:after="40" w:line="312" w:lineRule="auto"/>
+              <w:jc w:val="left"/>
             </w:pPr>
             <w:r>
               <w:rPr>
@@ -1156,8 +1156,8 @@
           </w:p>
           <w:p>
             <w:pPr>
-              <w:spacing w:before="60" w:after="60" w:line="360" w:lineRule="auto"/>
-              <w:jc w:val="both"/>
+              <w:spacing w:before="40" w:after="40" w:line="312" w:lineRule="auto"/>
+              <w:jc w:val="left"/>
             </w:pPr>
             <w:r>
               <w:rPr>
@@ -1175,8 +1175,8 @@
           </w:p>
           <w:p>
             <w:pPr>
-              <w:spacing w:before="60" w:after="60" w:line="360" w:lineRule="auto"/>
-              <w:jc w:val="both"/>
+              <w:spacing w:before="40" w:after="40" w:line="312" w:lineRule="auto"/>
+              <w:jc w:val="left"/>
             </w:pPr>
             <w:r>
               <w:rPr>
@@ -1194,8 +1194,8 @@
           </w:p>
           <w:p>
             <w:pPr>
-              <w:spacing w:before="60" w:after="60" w:line="360" w:lineRule="auto"/>
-              <w:jc w:val="both"/>
+              <w:spacing w:before="40" w:after="40" w:line="312" w:lineRule="auto"/>
+              <w:jc w:val="left"/>
             </w:pPr>
             <w:r>
               <w:rPr>
@@ -1227,19 +1227,19 @@
       <w:r>
         <w:rPr>
           <w:b/>
-          <w:sz w:val="28"/>
+          <w:sz w:val="27"/>
         </w:rPr>
         <w:t>CONTOH PENERAPAN DASAR (SEDERHANA)</w:t>
       </w:r>
     </w:p>
     <w:p>
       <w:pPr>
-        <w:spacing w:after="240"/>
+        <w:spacing w:after="200"/>
         <w:jc w:val="center"/>
       </w:pPr>
       <w:r>
         <w:rPr>
-          <w:color w:val="464646"/>
+          <w:color w:val="505050"/>
           <w:sz w:val="18"/>
         </w:rPr>
         <w:t>Kasus Sehari-hari yang Mudah Dipahami dan Dipraktikkan</w:t>
@@ -1247,7 +1247,7 @@
     </w:p>
     <w:p>
       <w:pPr>
-        <w:spacing w:before="120" w:after="80"/>
+        <w:spacing w:before="80" w:after="80"/>
       </w:pPr>
       <w:r>
         <w:rPr>
@@ -1264,12 +1264,12 @@
         <w:tblLook w:firstColumn="1" w:firstRow="1" w:lastColumn="0" w:lastRow="0" w:noHBand="0" w:noVBand="1" w:val="04A0"/>
       </w:tblPr>
       <w:tblGrid>
-        <w:gridCol w:w="9638"/>
+        <w:gridCol w:w="9866"/>
       </w:tblGrid>
       <w:tr>
         <w:tc>
           <w:tcPr>
-            <w:tcW w:type="dxa" w:w="9638"/>
+            <w:tcW w:type="dxa" w:w="9865"/>
             <w:tcBorders>
               <w:top w:val="single" w:sz="4" w:space="0" w:color="000000"/>
               <w:left w:val="single" w:sz="4" w:space="0" w:color="000000"/>
@@ -1277,16 +1277,16 @@
               <w:right w:val="single" w:sz="4" w:space="0" w:color="000000"/>
             </w:tcBorders>
             <w:tcMar>
-              <w:top w:w="130" w:type="dxa"/>
-              <w:left w:w="150" w:type="dxa"/>
-              <w:bottom w:w="130" w:type="dxa"/>
-              <w:right w:w="150" w:type="dxa"/>
+              <w:top w:w="90" w:type="dxa"/>
+              <w:left w:w="120" w:type="dxa"/>
+              <w:bottom w:w="90" w:type="dxa"/>
+              <w:right w:w="120" w:type="dxa"/>
             </w:tcMar>
           </w:tcPr>
           <w:p>
             <w:pPr>
-              <w:spacing w:before="40" w:after="40" w:line="360" w:lineRule="auto"/>
-              <w:jc w:val="both"/>
+              <w:spacing w:before="40" w:after="40" w:line="300" w:lineRule="auto"/>
+              <w:jc w:val="left"/>
             </w:pPr>
             <w:r>
               <w:rPr>
@@ -1304,8 +1304,8 @@
           </w:p>
           <w:p>
             <w:pPr>
-              <w:spacing w:before="40" w:after="40" w:line="360" w:lineRule="auto"/>
-              <w:jc w:val="both"/>
+              <w:spacing w:before="40" w:after="40" w:line="300" w:lineRule="auto"/>
+              <w:jc w:val="left"/>
             </w:pPr>
             <w:r>
               <w:rPr>
@@ -1323,8 +1323,8 @@
           </w:p>
           <w:p>
             <w:pPr>
-              <w:spacing w:before="40" w:after="40" w:line="360" w:lineRule="auto"/>
-              <w:jc w:val="both"/>
+              <w:spacing w:before="40" w:after="40" w:line="300" w:lineRule="auto"/>
+              <w:jc w:val="left"/>
             </w:pPr>
             <w:r>
               <w:rPr>
@@ -1342,34 +1342,73 @@
           </w:p>
           <w:p>
             <w:pPr>
-              <w:spacing w:before="40" w:after="40" w:line="360" w:lineRule="auto"/>
-              <w:jc w:val="both"/>
+              <w:spacing w:before="40" w:after="40" w:line="300" w:lineRule="auto"/>
+              <w:jc w:val="left"/>
             </w:pPr>
             <w:r>
               <w:rPr>
                 <w:b/>
                 <w:sz w:val="17"/>
               </w:rPr>
-              <w:t xml:space="preserve">Input: </w:t>
-            </w:r>
-            <w:r>
-              <w:rPr>
-                <w:sz w:val="17"/>
-              </w:rPr>
-              <w:br/>
-              <w:t>• Agenda: Pembahasan progres kerja mingguan.</w:t>
-              <w:br/>
-              <w:t>• Hari/Tanggal: Senin, 31 Agustus 2026 | Jam: 09.00 - 10.00 WIB.</w:t>
-              <w:br/>
-              <w:t>• Tempat: Ruang Rapat Lt. 2 (atau link Google Meet bagi yang WFH).</w:t>
-              <w:br/>
-              <w:t>• Bawaan: Laptop dan catatan progres masing-masing.</w:t>
+              <w:t>Input:</w:t>
             </w:r>
           </w:p>
           <w:p>
             <w:pPr>
-              <w:spacing w:before="40" w:after="40" w:line="360" w:lineRule="auto"/>
-              <w:jc w:val="both"/>
+              <w:spacing w:before="20" w:after="20" w:line="288" w:lineRule="auto"/>
+              <w:ind w:left="227"/>
+              <w:jc w:val="left"/>
+            </w:pPr>
+            <w:r>
+              <w:rPr>
+                <w:sz w:val="16"/>
+              </w:rPr>
+              <w:t>•  Agenda: Pembahasan progres kerja mingguan.</w:t>
+            </w:r>
+          </w:p>
+          <w:p>
+            <w:pPr>
+              <w:spacing w:before="20" w:after="20" w:line="288" w:lineRule="auto"/>
+              <w:ind w:left="227"/>
+              <w:jc w:val="left"/>
+            </w:pPr>
+            <w:r>
+              <w:rPr>
+                <w:sz w:val="16"/>
+              </w:rPr>
+              <w:t>•  Hari/Tanggal: Senin, 31 Agustus 2026 | Jam: 09.00 - 10.00 WIB.</w:t>
+            </w:r>
+          </w:p>
+          <w:p>
+            <w:pPr>
+              <w:spacing w:before="20" w:after="20" w:line="288" w:lineRule="auto"/>
+              <w:ind w:left="227"/>
+              <w:jc w:val="left"/>
+            </w:pPr>
+            <w:r>
+              <w:rPr>
+                <w:sz w:val="16"/>
+              </w:rPr>
+              <w:t>•  Tempat: Ruang Rapat Lt. 2 (atau link Google Meet bagi yang WFH).</w:t>
+            </w:r>
+          </w:p>
+          <w:p>
+            <w:pPr>
+              <w:spacing w:before="20" w:after="20" w:line="288" w:lineRule="auto"/>
+              <w:ind w:left="227"/>
+              <w:jc w:val="left"/>
+            </w:pPr>
+            <w:r>
+              <w:rPr>
+                <w:sz w:val="16"/>
+              </w:rPr>
+              <w:t>•  Bawaan: Laptop dan catatan progres masing-masing.</w:t>
+            </w:r>
+          </w:p>
+          <w:p>
+            <w:pPr>
+              <w:spacing w:before="40" w:after="40" w:line="300" w:lineRule="auto"/>
+              <w:jc w:val="left"/>
             </w:pPr>
             <w:r>
               <w:rPr>
@@ -1387,8 +1426,8 @@
           </w:p>
           <w:p>
             <w:pPr>
-              <w:spacing w:before="40" w:after="40" w:line="360" w:lineRule="auto"/>
-              <w:jc w:val="both"/>
+              <w:spacing w:before="40" w:after="40" w:line="300" w:lineRule="auto"/>
+              <w:jc w:val="left"/>
             </w:pPr>
             <w:r>
               <w:rPr>
@@ -1406,8 +1445,8 @@
           </w:p>
           <w:p>
             <w:pPr>
-              <w:spacing w:before="40" w:after="40" w:line="360" w:lineRule="auto"/>
-              <w:jc w:val="both"/>
+              <w:spacing w:before="40" w:after="40" w:line="300" w:lineRule="auto"/>
+              <w:jc w:val="left"/>
             </w:pPr>
             <w:r>
               <w:rPr>
@@ -1428,7 +1467,7 @@
     </w:tbl>
     <w:p>
       <w:pPr>
-        <w:spacing w:before="240" w:after="80"/>
+        <w:spacing w:before="200" w:after="80"/>
       </w:pPr>
       <w:r>
         <w:rPr>
@@ -1445,12 +1484,12 @@
         <w:tblLook w:firstColumn="1" w:firstRow="1" w:lastColumn="0" w:lastRow="0" w:noHBand="0" w:noVBand="1" w:val="04A0"/>
       </w:tblPr>
       <w:tblGrid>
-        <w:gridCol w:w="9638"/>
+        <w:gridCol w:w="9866"/>
       </w:tblGrid>
       <w:tr>
         <w:tc>
           <w:tcPr>
-            <w:tcW w:type="dxa" w:w="9638"/>
+            <w:tcW w:type="dxa" w:w="9865"/>
             <w:tcBorders>
               <w:top w:val="single" w:sz="4" w:space="0" w:color="000000"/>
               <w:left w:val="single" w:sz="4" w:space="0" w:color="000000"/>
@@ -1458,16 +1497,16 @@
               <w:right w:val="single" w:sz="4" w:space="0" w:color="000000"/>
             </w:tcBorders>
             <w:tcMar>
-              <w:top w:w="130" w:type="dxa"/>
-              <w:left w:w="150" w:type="dxa"/>
-              <w:bottom w:w="130" w:type="dxa"/>
-              <w:right w:w="150" w:type="dxa"/>
+              <w:top w:w="90" w:type="dxa"/>
+              <w:left w:w="120" w:type="dxa"/>
+              <w:bottom w:w="90" w:type="dxa"/>
+              <w:right w:w="120" w:type="dxa"/>
             </w:tcMar>
           </w:tcPr>
           <w:p>
             <w:pPr>
-              <w:spacing w:before="40" w:after="40" w:line="360" w:lineRule="auto"/>
-              <w:jc w:val="both"/>
+              <w:spacing w:before="40" w:after="40" w:line="300" w:lineRule="auto"/>
+              <w:jc w:val="left"/>
             </w:pPr>
             <w:r>
               <w:rPr>
@@ -1485,8 +1524,8 @@
           </w:p>
           <w:p>
             <w:pPr>
-              <w:spacing w:before="40" w:after="40" w:line="360" w:lineRule="auto"/>
-              <w:jc w:val="both"/>
+              <w:spacing w:before="40" w:after="40" w:line="300" w:lineRule="auto"/>
+              <w:jc w:val="left"/>
             </w:pPr>
             <w:r>
               <w:rPr>
@@ -1504,8 +1543,8 @@
           </w:p>
           <w:p>
             <w:pPr>
-              <w:spacing w:before="40" w:after="40" w:line="360" w:lineRule="auto"/>
-              <w:jc w:val="both"/>
+              <w:spacing w:before="40" w:after="40" w:line="300" w:lineRule="auto"/>
+              <w:jc w:val="left"/>
             </w:pPr>
             <w:r>
               <w:rPr>
@@ -1523,8 +1562,8 @@
           </w:p>
           <w:p>
             <w:pPr>
-              <w:spacing w:before="40" w:after="40" w:line="360" w:lineRule="auto"/>
-              <w:jc w:val="both"/>
+              <w:spacing w:before="40" w:after="40" w:line="300" w:lineRule="auto"/>
+              <w:jc w:val="left"/>
             </w:pPr>
             <w:r>
               <w:rPr>
@@ -1542,8 +1581,8 @@
           </w:p>
           <w:p>
             <w:pPr>
-              <w:spacing w:before="40" w:after="40" w:line="360" w:lineRule="auto"/>
-              <w:jc w:val="both"/>
+              <w:spacing w:before="40" w:after="40" w:line="300" w:lineRule="auto"/>
+              <w:jc w:val="left"/>
             </w:pPr>
             <w:r>
               <w:rPr>
@@ -1561,8 +1600,8 @@
           </w:p>
           <w:p>
             <w:pPr>
-              <w:spacing w:before="40" w:after="40" w:line="360" w:lineRule="auto"/>
-              <w:jc w:val="both"/>
+              <w:spacing w:before="40" w:after="40" w:line="300" w:lineRule="auto"/>
+              <w:jc w:val="left"/>
             </w:pPr>
             <w:r>
               <w:rPr>
@@ -1580,8 +1619,8 @@
           </w:p>
           <w:p>
             <w:pPr>
-              <w:spacing w:before="40" w:after="40" w:line="360" w:lineRule="auto"/>
-              <w:jc w:val="both"/>
+              <w:spacing w:before="40" w:after="40" w:line="300" w:lineRule="auto"/>
+              <w:jc w:val="left"/>
             </w:pPr>
             <w:r>
               <w:rPr>
@@ -1613,19 +1652,19 @@
       <w:r>
         <w:rPr>
           <w:b/>
-          <w:sz w:val="28"/>
+          <w:sz w:val="27"/>
         </w:rPr>
         <w:t>CONTOH PENERAPAN TINGKAT LANJUT (KOMPLEKS)</w:t>
       </w:r>
     </w:p>
     <w:p>
       <w:pPr>
-        <w:spacing w:after="240"/>
+        <w:spacing w:after="200"/>
         <w:jc w:val="center"/>
       </w:pPr>
       <w:r>
         <w:rPr>
-          <w:color w:val="464646"/>
+          <w:color w:val="505050"/>
           <w:sz w:val="18"/>
         </w:rPr>
         <w:t>Kasus Multi-Kriteria, Analisis Teknis, Kepatuhan Regulasi &amp; Mitigasi Risiko</w:t>
@@ -1633,7 +1672,7 @@
     </w:p>
     <w:p>
       <w:pPr>
-        <w:spacing w:before="120" w:after="80"/>
+        <w:spacing w:before="80" w:after="80"/>
       </w:pPr>
       <w:r>
         <w:rPr>
@@ -1650,12 +1689,12 @@
         <w:tblLook w:firstColumn="1" w:firstRow="1" w:lastColumn="0" w:lastRow="0" w:noHBand="0" w:noVBand="1" w:val="04A0"/>
       </w:tblPr>
       <w:tblGrid>
-        <w:gridCol w:w="9638"/>
+        <w:gridCol w:w="9866"/>
       </w:tblGrid>
       <w:tr>
         <w:tc>
           <w:tcPr>
-            <w:tcW w:type="dxa" w:w="9638"/>
+            <w:tcW w:type="dxa" w:w="9865"/>
             <w:tcBorders>
               <w:top w:val="single" w:sz="4" w:space="0" w:color="000000"/>
               <w:left w:val="single" w:sz="4" w:space="0" w:color="000000"/>
@@ -1663,24 +1702,23 @@
               <w:right w:val="single" w:sz="4" w:space="0" w:color="000000"/>
             </w:tcBorders>
             <w:tcMar>
-              <w:top w:w="130" w:type="dxa"/>
-              <w:left w:w="150" w:type="dxa"/>
-              <w:bottom w:w="130" w:type="dxa"/>
-              <w:right w:w="150" w:type="dxa"/>
+              <w:top w:w="90" w:type="dxa"/>
+              <w:left w:w="120" w:type="dxa"/>
+              <w:bottom w:w="90" w:type="dxa"/>
+              <w:right w:w="120" w:type="dxa"/>
             </w:tcMar>
           </w:tcPr>
           <w:p>
             <w:pPr>
-              <w:spacing w:before="40" w:after="40" w:line="360" w:lineRule="auto"/>
-              <w:jc w:val="both"/>
+              <w:spacing w:before="40" w:after="40" w:line="300" w:lineRule="auto"/>
+              <w:jc w:val="left"/>
             </w:pPr>
             <w:r>
               <w:rPr>
                 <w:b/>
                 <w:sz w:val="17"/>
               </w:rPr>
-              <w:t>Konteks:</w:t>
-              <w:br/>
+              <w:t xml:space="preserve">Konteks: </w:t>
             </w:r>
             <w:r>
               <w:rPr>
@@ -1691,16 +1729,15 @@
           </w:p>
           <w:p>
             <w:pPr>
-              <w:spacing w:before="40" w:after="40" w:line="360" w:lineRule="auto"/>
-              <w:jc w:val="both"/>
+              <w:spacing w:before="40" w:after="40" w:line="300" w:lineRule="auto"/>
+              <w:jc w:val="left"/>
             </w:pPr>
             <w:r>
               <w:rPr>
                 <w:b/>
                 <w:sz w:val="17"/>
               </w:rPr>
-              <w:t>Peran:</w:t>
-              <w:br/>
+              <w:t xml:space="preserve">Peran: </w:t>
             </w:r>
             <w:r>
               <w:rPr>
@@ -1711,16 +1748,15 @@
           </w:p>
           <w:p>
             <w:pPr>
-              <w:spacing w:before="40" w:after="40" w:line="360" w:lineRule="auto"/>
-              <w:jc w:val="both"/>
+              <w:spacing w:before="40" w:after="40" w:line="300" w:lineRule="auto"/>
+              <w:jc w:val="left"/>
             </w:pPr>
             <w:r>
               <w:rPr>
                 <w:b/>
                 <w:sz w:val="17"/>
               </w:rPr>
-              <w:t>Tugas:</w:t>
-              <w:br/>
+              <w:t xml:space="preserve">Tugas: </w:t>
             </w:r>
             <w:r>
               <w:rPr>
@@ -1731,8 +1767,8 @@
           </w:p>
           <w:p>
             <w:pPr>
-              <w:spacing w:before="40" w:after="40" w:line="360" w:lineRule="auto"/>
-              <w:jc w:val="both"/>
+              <w:spacing w:before="40" w:after="40" w:line="300" w:lineRule="auto"/>
+              <w:jc w:val="left"/>
             </w:pPr>
             <w:r>
               <w:rPr>
@@ -1740,27 +1776,77 @@
                 <w:sz w:val="17"/>
               </w:rPr>
               <w:t>Input:</w:t>
-              <w:br/>
-            </w:r>
-            <w:r>
-              <w:rPr>
-                <w:sz w:val="17"/>
-              </w:rPr>
-              <w:t>• Batas Anggaran: Maksimal $1.500/bulan ($18.000/tahun).</w:t>
-              <w:br/>
-              <w:t>• Regulasi Wajib: Data nasabah finansial wajib bertempat fisik di dalam wilayah Republik Indonesia (PP PSTE).</w:t>
-              <w:br/>
-              <w:t>• Vendor A (Lokal Tier-3): Biaya $1.200/bln, Latensi 15ms (Jakarta DC), RTO 15 menit, RPO 5 menit, Lokasi Data: Indonesia, Backup: Otomatis harian, Multi-AZ: Tidak.</w:t>
-              <w:br/>
-              <w:t>• Vendor B (Global Provider X): Biaya $850/bln, Latensi 65ms (Singapura DC), RTO 1 jam, RPO 30 menit, Lokasi Data: Singapura, Backup: Manual mingguan, Multi-AZ: Ya.</w:t>
-              <w:br/>
-              <w:t>• Vendor C (Enterprise Multi-Zone): Biaya $2.100/bln, Latensi 12ms (Jakarta-Surabaya Dual DC), RTO 2 menit, RPO 0 detik (Sync Multi-AZ), Lokasi Data: Indonesia, Compliance: SOC 2 &amp; PCI-DSS.</w:t>
             </w:r>
           </w:p>
           <w:p>
             <w:pPr>
-              <w:spacing w:before="40" w:after="40" w:line="360" w:lineRule="auto"/>
-              <w:jc w:val="both"/>
+              <w:spacing w:before="20" w:after="20" w:line="288" w:lineRule="auto"/>
+              <w:ind w:left="227"/>
+              <w:jc w:val="left"/>
+            </w:pPr>
+            <w:r>
+              <w:rPr>
+                <w:sz w:val="16"/>
+              </w:rPr>
+              <w:t>•  Batas Anggaran: Maksimal $1.500/bulan ($18.000/tahun).</w:t>
+            </w:r>
+          </w:p>
+          <w:p>
+            <w:pPr>
+              <w:spacing w:before="20" w:after="20" w:line="288" w:lineRule="auto"/>
+              <w:ind w:left="227"/>
+              <w:jc w:val="left"/>
+            </w:pPr>
+            <w:r>
+              <w:rPr>
+                <w:sz w:val="16"/>
+              </w:rPr>
+              <w:t>•  Regulasi Wajib: Data nasabah finansial wajib bertempat fisik di dalam wilayah Republik Indonesia (PP PSTE).</w:t>
+            </w:r>
+          </w:p>
+          <w:p>
+            <w:pPr>
+              <w:spacing w:before="20" w:after="20" w:line="288" w:lineRule="auto"/>
+              <w:ind w:left="227"/>
+              <w:jc w:val="left"/>
+            </w:pPr>
+            <w:r>
+              <w:rPr>
+                <w:sz w:val="16"/>
+              </w:rPr>
+              <w:t>•  Vendor A (Lokal Tier-3): Biaya $1.200/bln, Latensi 15ms (Jakarta DC), RTO 15 menit, RPO 5 menit, Lokasi Data: Indonesia, Backup: Otomatis harian, Multi-AZ: Tidak.</w:t>
+            </w:r>
+          </w:p>
+          <w:p>
+            <w:pPr>
+              <w:spacing w:before="20" w:after="20" w:line="288" w:lineRule="auto"/>
+              <w:ind w:left="227"/>
+              <w:jc w:val="left"/>
+            </w:pPr>
+            <w:r>
+              <w:rPr>
+                <w:sz w:val="16"/>
+              </w:rPr>
+              <w:t>•  Vendor B (Global Provider X): Biaya $850/bln, Latensi 65ms (Singapura DC), RTO 1 jam, RPO 30 menit, Lokasi Data: Singapura, Backup: Manual mingguan, Multi-AZ: Ya.</w:t>
+            </w:r>
+          </w:p>
+          <w:p>
+            <w:pPr>
+              <w:spacing w:before="20" w:after="20" w:line="288" w:lineRule="auto"/>
+              <w:ind w:left="227"/>
+              <w:jc w:val="left"/>
+            </w:pPr>
+            <w:r>
+              <w:rPr>
+                <w:sz w:val="16"/>
+              </w:rPr>
+              <w:t>•  Vendor C (Enterprise Multi-Zone): Biaya $2.100/bln, Latensi 12ms (Jakarta-Surabaya Dual DC), RTO 2 menit, RPO 0 detik (Sync Multi-AZ), Lokasi Data: Indonesia, Compliance: SOC 2 &amp; PCI-DSS.</w:t>
+            </w:r>
+          </w:p>
+          <w:p>
+            <w:pPr>
+              <w:spacing w:before="40" w:after="40" w:line="300" w:lineRule="auto"/>
+              <w:jc w:val="left"/>
             </w:pPr>
             <w:r>
               <w:rPr>
@@ -1768,23 +1854,51 @@
                 <w:sz w:val="17"/>
               </w:rPr>
               <w:t>Kriteria/Batasan:</w:t>
-              <w:br/>
-            </w:r>
-            <w:r>
-              <w:rPr>
-                <w:sz w:val="17"/>
-              </w:rPr>
-              <w:t>• Eliminasi Mutlak: Diskualifikasi langsung vendor yang melanggar hukum data residency Indonesia tanpa pengecualian.</w:t>
-              <w:br/>
-              <w:t>• Kepatuhan Anggaran: Jika opsi terbaik melebihi anggaran $1.500/bln, rancang skema optimasi/hybrid agar pengeluaran riil masuk toleransi anggaran.</w:t>
-              <w:br/>
-              <w:t>• Objektivitas: Tuliskan perhitungan matematika TCO secara transparan tanpa angka perkiraan bebas. Hindari bahasa marketing.</w:t>
             </w:r>
           </w:p>
           <w:p>
             <w:pPr>
-              <w:spacing w:before="40" w:after="40" w:line="360" w:lineRule="auto"/>
-              <w:jc w:val="both"/>
+              <w:spacing w:before="20" w:after="20" w:line="288" w:lineRule="auto"/>
+              <w:ind w:left="227"/>
+              <w:jc w:val="left"/>
+            </w:pPr>
+            <w:r>
+              <w:rPr>
+                <w:sz w:val="16"/>
+              </w:rPr>
+              <w:t>•  Eliminasi Mutlak: Diskualifikasi langsung vendor yang melanggar hukum data residency Indonesia tanpa pengecualian.</w:t>
+            </w:r>
+          </w:p>
+          <w:p>
+            <w:pPr>
+              <w:spacing w:before="20" w:after="20" w:line="288" w:lineRule="auto"/>
+              <w:ind w:left="227"/>
+              <w:jc w:val="left"/>
+            </w:pPr>
+            <w:r>
+              <w:rPr>
+                <w:sz w:val="16"/>
+              </w:rPr>
+              <w:t>•  Kepatuhan Anggaran: Jika opsi terbaik melebihi anggaran $1.500/bln, rancang skema optimasi/hybrid agar pengeluaran riil masuk toleransi anggaran.</w:t>
+            </w:r>
+          </w:p>
+          <w:p>
+            <w:pPr>
+              <w:spacing w:before="20" w:after="20" w:line="288" w:lineRule="auto"/>
+              <w:ind w:left="227"/>
+              <w:jc w:val="left"/>
+            </w:pPr>
+            <w:r>
+              <w:rPr>
+                <w:sz w:val="16"/>
+              </w:rPr>
+              <w:t>•  Objektivitas: Tuliskan perhitungan matematika TCO secara transparan tanpa angka perkiraan bebas. Hindari bahasa marketing.</w:t>
+            </w:r>
+          </w:p>
+          <w:p>
+            <w:pPr>
+              <w:spacing w:before="40" w:after="40" w:line="300" w:lineRule="auto"/>
+              <w:jc w:val="left"/>
             </w:pPr>
             <w:r>
               <w:rPr>
@@ -1792,35 +1906,84 @@
                 <w:sz w:val="17"/>
               </w:rPr>
               <w:t>Format Output:</w:t>
-              <w:br/>
-            </w:r>
-            <w:r>
-              <w:rPr>
-                <w:sz w:val="17"/>
-              </w:rPr>
-              <w:t>1. Matriks Uji Kelayakan Awal (Tabel: Vendor, Kepatuhan Regulasi Data, Status Lolos/Diskualifikasi).</w:t>
-              <w:br/>
-              <w:t>2. Tabel Komparasi Kuantitatif &amp; TCO 1 Tahun (Kolom: Vendor, Biaya/Bulan, TCO 12 Bulan, Latensi, RTO, RPO).</w:t>
-              <w:br/>
-              <w:t>3. Analisis Trade-Off &amp; Skenario Kegagalan (Dampak downtime finansial vs penghematan biaya).</w:t>
-              <w:br/>
-              <w:t>4. Rekomendasi Arsitektur Terpilih &amp; Skema Optimasi Biaya.</w:t>
-              <w:br/>
-              <w:t>5. Rencana Mitigasi Risiko &amp; Roadmap Cutover 4 Fase (Preparation, PoC, Cutover Zero-Downtime, Post-Audit).</w:t>
             </w:r>
           </w:p>
           <w:p>
             <w:pPr>
-              <w:spacing w:before="40" w:after="40" w:line="360" w:lineRule="auto"/>
-              <w:jc w:val="both"/>
+              <w:spacing w:before="20" w:after="20" w:line="288" w:lineRule="auto"/>
+              <w:ind w:left="227"/>
+              <w:jc w:val="left"/>
+            </w:pPr>
+            <w:r>
+              <w:rPr>
+                <w:sz w:val="16"/>
+              </w:rPr>
+              <w:t>•  1. Matriks Uji Kelayakan Awal (Tabel: Vendor, Kepatuhan Regulasi Data, Status Lolos/Diskualifikasi).</w:t>
+            </w:r>
+          </w:p>
+          <w:p>
+            <w:pPr>
+              <w:spacing w:before="20" w:after="20" w:line="288" w:lineRule="auto"/>
+              <w:ind w:left="227"/>
+              <w:jc w:val="left"/>
+            </w:pPr>
+            <w:r>
+              <w:rPr>
+                <w:sz w:val="16"/>
+              </w:rPr>
+              <w:t>•  2. Tabel Komparasi Kuantitatif &amp; TCO 1 Tahun (Kolom: Vendor, Biaya/Bulan, TCO 12 Bulan, Latensi, RTO, RPO).</w:t>
+            </w:r>
+          </w:p>
+          <w:p>
+            <w:pPr>
+              <w:spacing w:before="20" w:after="20" w:line="288" w:lineRule="auto"/>
+              <w:ind w:left="227"/>
+              <w:jc w:val="left"/>
+            </w:pPr>
+            <w:r>
+              <w:rPr>
+                <w:sz w:val="16"/>
+              </w:rPr>
+              <w:t>•  3. Analisis Trade-Off &amp; Skenario Kegagalan (Dampak downtime finansial vs penghematan biaya).</w:t>
+            </w:r>
+          </w:p>
+          <w:p>
+            <w:pPr>
+              <w:spacing w:before="20" w:after="20" w:line="288" w:lineRule="auto"/>
+              <w:ind w:left="227"/>
+              <w:jc w:val="left"/>
+            </w:pPr>
+            <w:r>
+              <w:rPr>
+                <w:sz w:val="16"/>
+              </w:rPr>
+              <w:t>•  4. Rekomendasi Arsitektur Terpilih &amp; Skema Optimasi Biaya.</w:t>
+            </w:r>
+          </w:p>
+          <w:p>
+            <w:pPr>
+              <w:spacing w:before="20" w:after="20" w:line="288" w:lineRule="auto"/>
+              <w:ind w:left="227"/>
+              <w:jc w:val="left"/>
+            </w:pPr>
+            <w:r>
+              <w:rPr>
+                <w:sz w:val="16"/>
+              </w:rPr>
+              <w:t>•  5. Rencana Mitigasi Risiko &amp; Roadmap Cutover 4 Fase (Preparation, PoC, Cutover Zero-Downtime, Post-Audit).</w:t>
+            </w:r>
+          </w:p>
+          <w:p>
+            <w:pPr>
+              <w:spacing w:before="40" w:after="40" w:line="300" w:lineRule="auto"/>
+              <w:jc w:val="left"/>
             </w:pPr>
             <w:r>
               <w:rPr>
                 <w:b/>
                 <w:sz w:val="17"/>
               </w:rPr>
-              <w:t>Validasi:</w:t>
-              <w:br/>
+              <w:t xml:space="preserve">Validasi: </w:t>
             </w:r>
             <w:r>
               <w:rPr>
@@ -1834,7 +1997,7 @@
     </w:tbl>
     <w:sectPr>
       <w:pgSz w:w="11906" w:h="16838"/>
-      <w:pgMar w:top="1134" w:right="1134" w:bottom="1134" w:left="1134" w:header="720" w:footer="720" w:gutter="0"/>
+      <w:pgMar w:top="1020" w:right="1020" w:bottom="1020" w:left="1020" w:header="720" w:footer="720" w:gutter="0"/>
       <w:cols w:space="720"/>
       <w:docGrid w:linePitch="360"/>
     </w:sectPr>

</xml_diff>

<commit_message>
belajar: sinkronisasi otomatis memori neuron dan pengetahuan (2026-08-27 08:36:24)
</commit_message>
<xml_diff>
--- a/Panduan Struktur Prompt AI.docx
+++ b/Panduan Struktur Prompt AI.docx
@@ -4,7 +4,7 @@
   <w:body>
     <w:p>
       <w:pPr>
-        <w:spacing w:after="40" w:before="0"/>
+        <w:spacing w:before="0" w:after="60" w:line="360" w:lineRule="auto"/>
         <w:jc w:val="center"/>
       </w:pPr>
       <w:r>
@@ -17,25 +17,25 @@
     </w:p>
     <w:p>
       <w:pPr>
-        <w:spacing w:after="240"/>
+        <w:spacing w:before="0" w:after="280" w:line="360" w:lineRule="auto"/>
         <w:jc w:val="center"/>
       </w:pPr>
       <w:r>
         <w:rPr>
-          <w:color w:val="505050"/>
-          <w:sz w:val="18"/>
+          <w:color w:val="464646"/>
+          <w:sz w:val="19"/>
         </w:rPr>
         <w:t>Format Baku dan Panduan Komponen Prompt Sederhana hingga Kompleks</w:t>
       </w:r>
     </w:p>
     <w:p>
       <w:pPr>
-        <w:spacing w:before="80" w:after="80"/>
+        <w:spacing w:before="120" w:after="80" w:line="360" w:lineRule="auto"/>
       </w:pPr>
       <w:r>
         <w:rPr>
           <w:b/>
-          <w:sz w:val="21"/>
+          <w:sz w:val="22"/>
         </w:rPr>
         <w:t>1. TABEL 7 ELEMEN DASAR PROMPT AI</w:t>
       </w:r>
@@ -47,10 +47,10 @@
         <w:tblLook w:firstColumn="1" w:firstRow="1" w:lastColumn="0" w:lastRow="0" w:noHBand="0" w:noVBand="1" w:val="04A0"/>
       </w:tblPr>
       <w:tblGrid>
-        <w:gridCol w:w="2466"/>
-        <w:gridCol w:w="2466"/>
-        <w:gridCol w:w="2466"/>
-        <w:gridCol w:w="2466"/>
+        <w:gridCol w:w="2409"/>
+        <w:gridCol w:w="2409"/>
+        <w:gridCol w:w="2409"/>
+        <w:gridCol w:w="2409"/>
       </w:tblGrid>
       <w:tr>
         <w:tc>
@@ -64,21 +64,21 @@
               <w:right w:val="single" w:sz="4" w:space="0" w:color="000000"/>
             </w:tcBorders>
             <w:tcMar>
-              <w:top w:w="80" w:type="dxa"/>
-              <w:left w:w="100" w:type="dxa"/>
-              <w:bottom w:w="80" w:type="dxa"/>
-              <w:right w:w="100" w:type="dxa"/>
+              <w:top w:w="100" w:type="dxa"/>
+              <w:left w:w="120" w:type="dxa"/>
+              <w:bottom w:w="100" w:type="dxa"/>
+              <w:right w:w="120" w:type="dxa"/>
             </w:tcMar>
           </w:tcPr>
           <w:p>
             <w:pPr>
-              <w:spacing w:before="20" w:after="20" w:line="288" w:lineRule="auto"/>
+              <w:spacing w:before="40" w:after="40" w:line="360" w:lineRule="auto"/>
               <w:jc w:val="center"/>
             </w:pPr>
             <w:r>
               <w:rPr>
                 <w:b/>
-                <w:sz w:val="17"/>
+                <w:sz w:val="18"/>
               </w:rPr>
               <w:t>No</w:t>
             </w:r>
@@ -95,21 +95,21 @@
               <w:right w:val="single" w:sz="4" w:space="0" w:color="000000"/>
             </w:tcBorders>
             <w:tcMar>
-              <w:top w:w="80" w:type="dxa"/>
-              <w:left w:w="100" w:type="dxa"/>
-              <w:bottom w:w="80" w:type="dxa"/>
-              <w:right w:w="100" w:type="dxa"/>
+              <w:top w:w="100" w:type="dxa"/>
+              <w:left w:w="120" w:type="dxa"/>
+              <w:bottom w:w="100" w:type="dxa"/>
+              <w:right w:w="120" w:type="dxa"/>
             </w:tcMar>
           </w:tcPr>
           <w:p>
             <w:pPr>
-              <w:spacing w:before="20" w:after="20" w:line="288" w:lineRule="auto"/>
+              <w:spacing w:before="40" w:after="40" w:line="360" w:lineRule="auto"/>
               <w:jc w:val="left"/>
             </w:pPr>
             <w:r>
               <w:rPr>
                 <w:b/>
-                <w:sz w:val="17"/>
+                <w:sz w:val="18"/>
               </w:rPr>
               <w:t>Elemen</w:t>
             </w:r>
@@ -117,7 +117,7 @@
         </w:tc>
         <w:tc>
           <w:tcPr>
-            <w:tcW w:type="dxa" w:w="3628"/>
+            <w:tcW w:type="dxa" w:w="3572"/>
             <w:vAlign w:val="top"/>
             <w:tcBorders>
               <w:top w:val="single" w:sz="4" w:space="0" w:color="000000"/>
@@ -126,21 +126,21 @@
               <w:right w:val="single" w:sz="4" w:space="0" w:color="000000"/>
             </w:tcBorders>
             <w:tcMar>
-              <w:top w:w="80" w:type="dxa"/>
-              <w:left w:w="100" w:type="dxa"/>
-              <w:bottom w:w="80" w:type="dxa"/>
-              <w:right w:w="100" w:type="dxa"/>
+              <w:top w:w="100" w:type="dxa"/>
+              <w:left w:w="120" w:type="dxa"/>
+              <w:bottom w:w="100" w:type="dxa"/>
+              <w:right w:w="120" w:type="dxa"/>
             </w:tcMar>
           </w:tcPr>
           <w:p>
             <w:pPr>
-              <w:spacing w:before="20" w:after="20" w:line="288" w:lineRule="auto"/>
+              <w:spacing w:before="40" w:after="40" w:line="360" w:lineRule="auto"/>
               <w:jc w:val="left"/>
             </w:pPr>
             <w:r>
               <w:rPr>
                 <w:b/>
-                <w:sz w:val="17"/>
+                <w:sz w:val="18"/>
               </w:rPr>
               <w:t>Fungsi &amp; Definisi</w:t>
             </w:r>
@@ -148,7 +148,7 @@
         </w:tc>
         <w:tc>
           <w:tcPr>
-            <w:tcW w:type="dxa" w:w="3855"/>
+            <w:tcW w:type="dxa" w:w="3685"/>
             <w:vAlign w:val="top"/>
             <w:tcBorders>
               <w:top w:val="single" w:sz="4" w:space="0" w:color="000000"/>
@@ -157,21 +157,21 @@
               <w:right w:val="single" w:sz="4" w:space="0" w:color="000000"/>
             </w:tcBorders>
             <w:tcMar>
-              <w:top w:w="80" w:type="dxa"/>
-              <w:left w:w="100" w:type="dxa"/>
-              <w:bottom w:w="80" w:type="dxa"/>
-              <w:right w:w="100" w:type="dxa"/>
+              <w:top w:w="100" w:type="dxa"/>
+              <w:left w:w="120" w:type="dxa"/>
+              <w:bottom w:w="100" w:type="dxa"/>
+              <w:right w:w="120" w:type="dxa"/>
             </w:tcMar>
           </w:tcPr>
           <w:p>
             <w:pPr>
-              <w:spacing w:before="20" w:after="20" w:line="288" w:lineRule="auto"/>
+              <w:spacing w:before="40" w:after="40" w:line="360" w:lineRule="auto"/>
               <w:jc w:val="left"/>
             </w:pPr>
             <w:r>
               <w:rPr>
                 <w:b/>
-                <w:sz w:val="17"/>
+                <w:sz w:val="18"/>
               </w:rPr>
               <w:t>Cara Pengisian</w:t>
             </w:r>
@@ -190,20 +190,20 @@
               <w:right w:val="single" w:sz="4" w:space="0" w:color="000000"/>
             </w:tcBorders>
             <w:tcMar>
-              <w:top w:w="80" w:type="dxa"/>
-              <w:left w:w="100" w:type="dxa"/>
-              <w:bottom w:w="80" w:type="dxa"/>
-              <w:right w:w="100" w:type="dxa"/>
+              <w:top w:w="100" w:type="dxa"/>
+              <w:left w:w="120" w:type="dxa"/>
+              <w:bottom w:w="100" w:type="dxa"/>
+              <w:right w:w="120" w:type="dxa"/>
             </w:tcMar>
           </w:tcPr>
           <w:p>
             <w:pPr>
-              <w:spacing w:before="20" w:after="20" w:line="288" w:lineRule="auto"/>
+              <w:spacing w:before="40" w:after="40" w:line="360" w:lineRule="auto"/>
               <w:jc w:val="center"/>
             </w:pPr>
             <w:r>
               <w:rPr>
-                <w:sz w:val="16"/>
+                <w:sz w:val="17"/>
               </w:rPr>
               <w:t>1</w:t>
             </w:r>
@@ -220,21 +220,21 @@
               <w:right w:val="single" w:sz="4" w:space="0" w:color="000000"/>
             </w:tcBorders>
             <w:tcMar>
-              <w:top w:w="80" w:type="dxa"/>
-              <w:left w:w="100" w:type="dxa"/>
-              <w:bottom w:w="80" w:type="dxa"/>
-              <w:right w:w="100" w:type="dxa"/>
+              <w:top w:w="100" w:type="dxa"/>
+              <w:left w:w="120" w:type="dxa"/>
+              <w:bottom w:w="100" w:type="dxa"/>
+              <w:right w:w="120" w:type="dxa"/>
             </w:tcMar>
           </w:tcPr>
           <w:p>
             <w:pPr>
-              <w:spacing w:before="20" w:after="20" w:line="288" w:lineRule="auto"/>
+              <w:spacing w:before="40" w:after="40" w:line="360" w:lineRule="auto"/>
               <w:jc w:val="left"/>
             </w:pPr>
             <w:r>
               <w:rPr>
                 <w:b/>
-                <w:sz w:val="16"/>
+                <w:sz w:val="17"/>
               </w:rPr>
               <w:t>Konteks</w:t>
             </w:r>
@@ -242,7 +242,7 @@
         </w:tc>
         <w:tc>
           <w:tcPr>
-            <w:tcW w:type="dxa" w:w="3628"/>
+            <w:tcW w:type="dxa" w:w="3572"/>
             <w:vAlign w:val="top"/>
             <w:tcBorders>
               <w:top w:val="single" w:sz="4" w:space="0" w:color="000000"/>
@@ -251,20 +251,20 @@
               <w:right w:val="single" w:sz="4" w:space="0" w:color="000000"/>
             </w:tcBorders>
             <w:tcMar>
-              <w:top w:w="80" w:type="dxa"/>
-              <w:left w:w="100" w:type="dxa"/>
-              <w:bottom w:w="80" w:type="dxa"/>
-              <w:right w:w="100" w:type="dxa"/>
+              <w:top w:w="100" w:type="dxa"/>
+              <w:left w:w="120" w:type="dxa"/>
+              <w:bottom w:w="100" w:type="dxa"/>
+              <w:right w:w="120" w:type="dxa"/>
             </w:tcMar>
           </w:tcPr>
           <w:p>
             <w:pPr>
-              <w:spacing w:before="20" w:after="20" w:line="288" w:lineRule="auto"/>
+              <w:spacing w:before="40" w:after="40" w:line="360" w:lineRule="auto"/>
               <w:jc w:val="left"/>
             </w:pPr>
             <w:r>
               <w:rPr>
-                <w:sz w:val="16"/>
+                <w:sz w:val="17"/>
               </w:rPr>
               <w:t>Situasi kerja, latar belakang, dan tujuan spesifik yang ingin dicapai.</w:t>
             </w:r>
@@ -272,7 +272,7 @@
         </w:tc>
         <w:tc>
           <w:tcPr>
-            <w:tcW w:type="dxa" w:w="3855"/>
+            <w:tcW w:type="dxa" w:w="3685"/>
             <w:vAlign w:val="top"/>
             <w:tcBorders>
               <w:top w:val="single" w:sz="4" w:space="0" w:color="000000"/>
@@ -281,20 +281,20 @@
               <w:right w:val="single" w:sz="4" w:space="0" w:color="000000"/>
             </w:tcBorders>
             <w:tcMar>
-              <w:top w:w="80" w:type="dxa"/>
-              <w:left w:w="100" w:type="dxa"/>
-              <w:bottom w:w="80" w:type="dxa"/>
-              <w:right w:w="100" w:type="dxa"/>
+              <w:top w:w="100" w:type="dxa"/>
+              <w:left w:w="120" w:type="dxa"/>
+              <w:bottom w:w="100" w:type="dxa"/>
+              <w:right w:w="120" w:type="dxa"/>
             </w:tcMar>
           </w:tcPr>
           <w:p>
             <w:pPr>
-              <w:spacing w:before="20" w:after="20" w:line="288" w:lineRule="auto"/>
+              <w:spacing w:before="40" w:after="40" w:line="360" w:lineRule="auto"/>
               <w:jc w:val="left"/>
             </w:pPr>
             <w:r>
               <w:rPr>
-                <w:sz w:val="16"/>
+                <w:sz w:val="17"/>
               </w:rPr>
               <w:t>Jelaskan situasi riil, batasan domain, dan target output yang dibutuhkan.</w:t>
             </w:r>
@@ -313,20 +313,20 @@
               <w:right w:val="single" w:sz="4" w:space="0" w:color="000000"/>
             </w:tcBorders>
             <w:tcMar>
-              <w:top w:w="80" w:type="dxa"/>
-              <w:left w:w="100" w:type="dxa"/>
-              <w:bottom w:w="80" w:type="dxa"/>
-              <w:right w:w="100" w:type="dxa"/>
+              <w:top w:w="100" w:type="dxa"/>
+              <w:left w:w="120" w:type="dxa"/>
+              <w:bottom w:w="100" w:type="dxa"/>
+              <w:right w:w="120" w:type="dxa"/>
             </w:tcMar>
           </w:tcPr>
           <w:p>
             <w:pPr>
-              <w:spacing w:before="20" w:after="20" w:line="288" w:lineRule="auto"/>
+              <w:spacing w:before="40" w:after="40" w:line="360" w:lineRule="auto"/>
               <w:jc w:val="center"/>
             </w:pPr>
             <w:r>
               <w:rPr>
-                <w:sz w:val="16"/>
+                <w:sz w:val="17"/>
               </w:rPr>
               <w:t>2</w:t>
             </w:r>
@@ -343,21 +343,21 @@
               <w:right w:val="single" w:sz="4" w:space="0" w:color="000000"/>
             </w:tcBorders>
             <w:tcMar>
-              <w:top w:w="80" w:type="dxa"/>
-              <w:left w:w="100" w:type="dxa"/>
-              <w:bottom w:w="80" w:type="dxa"/>
-              <w:right w:w="100" w:type="dxa"/>
+              <w:top w:w="100" w:type="dxa"/>
+              <w:left w:w="120" w:type="dxa"/>
+              <w:bottom w:w="100" w:type="dxa"/>
+              <w:right w:w="120" w:type="dxa"/>
             </w:tcMar>
           </w:tcPr>
           <w:p>
             <w:pPr>
-              <w:spacing w:before="20" w:after="20" w:line="288" w:lineRule="auto"/>
+              <w:spacing w:before="40" w:after="40" w:line="360" w:lineRule="auto"/>
               <w:jc w:val="left"/>
             </w:pPr>
             <w:r>
               <w:rPr>
                 <w:b/>
-                <w:sz w:val="16"/>
+                <w:sz w:val="17"/>
               </w:rPr>
               <w:t>Peran</w:t>
             </w:r>
@@ -365,7 +365,7 @@
         </w:tc>
         <w:tc>
           <w:tcPr>
-            <w:tcW w:type="dxa" w:w="3628"/>
+            <w:tcW w:type="dxa" w:w="3572"/>
             <w:vAlign w:val="top"/>
             <w:tcBorders>
               <w:top w:val="single" w:sz="4" w:space="0" w:color="000000"/>
@@ -374,20 +374,20 @@
               <w:right w:val="single" w:sz="4" w:space="0" w:color="000000"/>
             </w:tcBorders>
             <w:tcMar>
-              <w:top w:w="80" w:type="dxa"/>
-              <w:left w:w="100" w:type="dxa"/>
-              <w:bottom w:w="80" w:type="dxa"/>
-              <w:right w:w="100" w:type="dxa"/>
+              <w:top w:w="100" w:type="dxa"/>
+              <w:left w:w="120" w:type="dxa"/>
+              <w:bottom w:w="100" w:type="dxa"/>
+              <w:right w:w="120" w:type="dxa"/>
             </w:tcMar>
           </w:tcPr>
           <w:p>
             <w:pPr>
-              <w:spacing w:before="20" w:after="20" w:line="288" w:lineRule="auto"/>
+              <w:spacing w:before="40" w:after="40" w:line="360" w:lineRule="auto"/>
               <w:jc w:val="left"/>
             </w:pPr>
             <w:r>
               <w:rPr>
-                <w:sz w:val="16"/>
+                <w:sz w:val="17"/>
               </w:rPr>
               <w:t>Persona, tingkat keahlian, atau sudut pandang profesional yang ditugaskan ke AI.</w:t>
             </w:r>
@@ -395,7 +395,7 @@
         </w:tc>
         <w:tc>
           <w:tcPr>
-            <w:tcW w:type="dxa" w:w="3855"/>
+            <w:tcW w:type="dxa" w:w="3685"/>
             <w:vAlign w:val="top"/>
             <w:tcBorders>
               <w:top w:val="single" w:sz="4" w:space="0" w:color="000000"/>
@@ -404,20 +404,20 @@
               <w:right w:val="single" w:sz="4" w:space="0" w:color="000000"/>
             </w:tcBorders>
             <w:tcMar>
-              <w:top w:w="80" w:type="dxa"/>
-              <w:left w:w="100" w:type="dxa"/>
-              <w:bottom w:w="80" w:type="dxa"/>
-              <w:right w:w="100" w:type="dxa"/>
+              <w:top w:w="100" w:type="dxa"/>
+              <w:left w:w="120" w:type="dxa"/>
+              <w:bottom w:w="100" w:type="dxa"/>
+              <w:right w:w="120" w:type="dxa"/>
             </w:tcMar>
           </w:tcPr>
           <w:p>
             <w:pPr>
-              <w:spacing w:before="20" w:after="20" w:line="288" w:lineRule="auto"/>
+              <w:spacing w:before="40" w:after="40" w:line="360" w:lineRule="auto"/>
               <w:jc w:val="left"/>
             </w:pPr>
             <w:r>
               <w:rPr>
-                <w:sz w:val="16"/>
+                <w:sz w:val="17"/>
               </w:rPr>
               <w:t>Tentukan persona ahli (contoh: Principal Architect, Analis Data, Sekretaris).</w:t>
             </w:r>
@@ -436,20 +436,20 @@
               <w:right w:val="single" w:sz="4" w:space="0" w:color="000000"/>
             </w:tcBorders>
             <w:tcMar>
-              <w:top w:w="80" w:type="dxa"/>
-              <w:left w:w="100" w:type="dxa"/>
-              <w:bottom w:w="80" w:type="dxa"/>
-              <w:right w:w="100" w:type="dxa"/>
+              <w:top w:w="100" w:type="dxa"/>
+              <w:left w:w="120" w:type="dxa"/>
+              <w:bottom w:w="100" w:type="dxa"/>
+              <w:right w:w="120" w:type="dxa"/>
             </w:tcMar>
           </w:tcPr>
           <w:p>
             <w:pPr>
-              <w:spacing w:before="20" w:after="20" w:line="288" w:lineRule="auto"/>
+              <w:spacing w:before="40" w:after="40" w:line="360" w:lineRule="auto"/>
               <w:jc w:val="center"/>
             </w:pPr>
             <w:r>
               <w:rPr>
-                <w:sz w:val="16"/>
+                <w:sz w:val="17"/>
               </w:rPr>
               <w:t>3</w:t>
             </w:r>
@@ -466,21 +466,21 @@
               <w:right w:val="single" w:sz="4" w:space="0" w:color="000000"/>
             </w:tcBorders>
             <w:tcMar>
-              <w:top w:w="80" w:type="dxa"/>
-              <w:left w:w="100" w:type="dxa"/>
-              <w:bottom w:w="80" w:type="dxa"/>
-              <w:right w:w="100" w:type="dxa"/>
+              <w:top w:w="100" w:type="dxa"/>
+              <w:left w:w="120" w:type="dxa"/>
+              <w:bottom w:w="100" w:type="dxa"/>
+              <w:right w:w="120" w:type="dxa"/>
             </w:tcMar>
           </w:tcPr>
           <w:p>
             <w:pPr>
-              <w:spacing w:before="20" w:after="20" w:line="288" w:lineRule="auto"/>
+              <w:spacing w:before="40" w:after="40" w:line="360" w:lineRule="auto"/>
               <w:jc w:val="left"/>
             </w:pPr>
             <w:r>
               <w:rPr>
                 <w:b/>
-                <w:sz w:val="16"/>
+                <w:sz w:val="17"/>
               </w:rPr>
               <w:t>Tugas</w:t>
             </w:r>
@@ -488,7 +488,7 @@
         </w:tc>
         <w:tc>
           <w:tcPr>
-            <w:tcW w:type="dxa" w:w="3628"/>
+            <w:tcW w:type="dxa" w:w="3572"/>
             <w:vAlign w:val="top"/>
             <w:tcBorders>
               <w:top w:val="single" w:sz="4" w:space="0" w:color="000000"/>
@@ -497,20 +497,20 @@
               <w:right w:val="single" w:sz="4" w:space="0" w:color="000000"/>
             </w:tcBorders>
             <w:tcMar>
-              <w:top w:w="80" w:type="dxa"/>
-              <w:left w:w="100" w:type="dxa"/>
-              <w:bottom w:w="80" w:type="dxa"/>
-              <w:right w:w="100" w:type="dxa"/>
+              <w:top w:w="100" w:type="dxa"/>
+              <w:left w:w="120" w:type="dxa"/>
+              <w:bottom w:w="100" w:type="dxa"/>
+              <w:right w:w="120" w:type="dxa"/>
             </w:tcMar>
           </w:tcPr>
           <w:p>
             <w:pPr>
-              <w:spacing w:before="20" w:after="20" w:line="288" w:lineRule="auto"/>
+              <w:spacing w:before="40" w:after="40" w:line="360" w:lineRule="auto"/>
               <w:jc w:val="left"/>
             </w:pPr>
             <w:r>
               <w:rPr>
-                <w:sz w:val="16"/>
+                <w:sz w:val="17"/>
               </w:rPr>
               <w:t>Instruksi pekerjaan spesifik yang wajib dikerjakan oleh AI.</w:t>
             </w:r>
@@ -518,7 +518,7 @@
         </w:tc>
         <w:tc>
           <w:tcPr>
-            <w:tcW w:type="dxa" w:w="3855"/>
+            <w:tcW w:type="dxa" w:w="3685"/>
             <w:vAlign w:val="top"/>
             <w:tcBorders>
               <w:top w:val="single" w:sz="4" w:space="0" w:color="000000"/>
@@ -527,20 +527,20 @@
               <w:right w:val="single" w:sz="4" w:space="0" w:color="000000"/>
             </w:tcBorders>
             <w:tcMar>
-              <w:top w:w="80" w:type="dxa"/>
-              <w:left w:w="100" w:type="dxa"/>
-              <w:bottom w:w="80" w:type="dxa"/>
-              <w:right w:w="100" w:type="dxa"/>
+              <w:top w:w="100" w:type="dxa"/>
+              <w:left w:w="120" w:type="dxa"/>
+              <w:bottom w:w="100" w:type="dxa"/>
+              <w:right w:w="120" w:type="dxa"/>
             </w:tcMar>
           </w:tcPr>
           <w:p>
             <w:pPr>
-              <w:spacing w:before="20" w:after="20" w:line="288" w:lineRule="auto"/>
+              <w:spacing w:before="40" w:after="40" w:line="360" w:lineRule="auto"/>
               <w:jc w:val="left"/>
             </w:pPr>
             <w:r>
               <w:rPr>
-                <w:sz w:val="16"/>
+                <w:sz w:val="17"/>
               </w:rPr>
               <w:t>Gunakan kata kerja aksi operasional: analisis, bandingkan, hitung, susun.</w:t>
             </w:r>
@@ -559,20 +559,20 @@
               <w:right w:val="single" w:sz="4" w:space="0" w:color="000000"/>
             </w:tcBorders>
             <w:tcMar>
-              <w:top w:w="80" w:type="dxa"/>
-              <w:left w:w="100" w:type="dxa"/>
-              <w:bottom w:w="80" w:type="dxa"/>
-              <w:right w:w="100" w:type="dxa"/>
+              <w:top w:w="100" w:type="dxa"/>
+              <w:left w:w="120" w:type="dxa"/>
+              <w:bottom w:w="100" w:type="dxa"/>
+              <w:right w:w="120" w:type="dxa"/>
             </w:tcMar>
           </w:tcPr>
           <w:p>
             <w:pPr>
-              <w:spacing w:before="20" w:after="20" w:line="288" w:lineRule="auto"/>
+              <w:spacing w:before="40" w:after="40" w:line="360" w:lineRule="auto"/>
               <w:jc w:val="center"/>
             </w:pPr>
             <w:r>
               <w:rPr>
-                <w:sz w:val="16"/>
+                <w:sz w:val="17"/>
               </w:rPr>
               <w:t>4</w:t>
             </w:r>
@@ -589,21 +589,21 @@
               <w:right w:val="single" w:sz="4" w:space="0" w:color="000000"/>
             </w:tcBorders>
             <w:tcMar>
-              <w:top w:w="80" w:type="dxa"/>
-              <w:left w:w="100" w:type="dxa"/>
-              <w:bottom w:w="80" w:type="dxa"/>
-              <w:right w:w="100" w:type="dxa"/>
+              <w:top w:w="100" w:type="dxa"/>
+              <w:left w:w="120" w:type="dxa"/>
+              <w:bottom w:w="100" w:type="dxa"/>
+              <w:right w:w="120" w:type="dxa"/>
             </w:tcMar>
           </w:tcPr>
           <w:p>
             <w:pPr>
-              <w:spacing w:before="20" w:after="20" w:line="288" w:lineRule="auto"/>
+              <w:spacing w:before="40" w:after="40" w:line="360" w:lineRule="auto"/>
               <w:jc w:val="left"/>
             </w:pPr>
             <w:r>
               <w:rPr>
                 <w:b/>
-                <w:sz w:val="16"/>
+                <w:sz w:val="17"/>
               </w:rPr>
               <w:t>Input</w:t>
             </w:r>
@@ -611,7 +611,7 @@
         </w:tc>
         <w:tc>
           <w:tcPr>
-            <w:tcW w:type="dxa" w:w="3628"/>
+            <w:tcW w:type="dxa" w:w="3572"/>
             <w:vAlign w:val="top"/>
             <w:tcBorders>
               <w:top w:val="single" w:sz="4" w:space="0" w:color="000000"/>
@@ -620,20 +620,20 @@
               <w:right w:val="single" w:sz="4" w:space="0" w:color="000000"/>
             </w:tcBorders>
             <w:tcMar>
-              <w:top w:w="80" w:type="dxa"/>
-              <w:left w:w="100" w:type="dxa"/>
-              <w:bottom w:w="80" w:type="dxa"/>
-              <w:right w:w="100" w:type="dxa"/>
+              <w:top w:w="100" w:type="dxa"/>
+              <w:left w:w="120" w:type="dxa"/>
+              <w:bottom w:w="100" w:type="dxa"/>
+              <w:right w:w="120" w:type="dxa"/>
             </w:tcMar>
           </w:tcPr>
           <w:p>
             <w:pPr>
-              <w:spacing w:before="20" w:after="20" w:line="288" w:lineRule="auto"/>
+              <w:spacing w:before="40" w:after="40" w:line="360" w:lineRule="auto"/>
               <w:jc w:val="left"/>
             </w:pPr>
             <w:r>
               <w:rPr>
-                <w:sz w:val="16"/>
+                <w:sz w:val="17"/>
               </w:rPr>
               <w:t>Data mentah, spesifikasi, matriks angka, atau catatan acuan.</w:t>
             </w:r>
@@ -641,7 +641,7 @@
         </w:tc>
         <w:tc>
           <w:tcPr>
-            <w:tcW w:type="dxa" w:w="3855"/>
+            <w:tcW w:type="dxa" w:w="3685"/>
             <w:vAlign w:val="top"/>
             <w:tcBorders>
               <w:top w:val="single" w:sz="4" w:space="0" w:color="000000"/>
@@ -650,20 +650,20 @@
               <w:right w:val="single" w:sz="4" w:space="0" w:color="000000"/>
             </w:tcBorders>
             <w:tcMar>
-              <w:top w:w="80" w:type="dxa"/>
-              <w:left w:w="100" w:type="dxa"/>
-              <w:bottom w:w="80" w:type="dxa"/>
-              <w:right w:w="100" w:type="dxa"/>
+              <w:top w:w="100" w:type="dxa"/>
+              <w:left w:w="120" w:type="dxa"/>
+              <w:bottom w:w="100" w:type="dxa"/>
+              <w:right w:w="120" w:type="dxa"/>
             </w:tcMar>
           </w:tcPr>
           <w:p>
             <w:pPr>
-              <w:spacing w:before="20" w:after="20" w:line="288" w:lineRule="auto"/>
+              <w:spacing w:before="40" w:after="40" w:line="360" w:lineRule="auto"/>
               <w:jc w:val="left"/>
             </w:pPr>
             <w:r>
               <w:rPr>
-                <w:sz w:val="16"/>
+                <w:sz w:val="17"/>
               </w:rPr>
               <w:t>Sertakan seluruh data relevan; larang AI membuat data fiktif.</w:t>
             </w:r>
@@ -682,20 +682,20 @@
               <w:right w:val="single" w:sz="4" w:space="0" w:color="000000"/>
             </w:tcBorders>
             <w:tcMar>
-              <w:top w:w="80" w:type="dxa"/>
-              <w:left w:w="100" w:type="dxa"/>
-              <w:bottom w:w="80" w:type="dxa"/>
-              <w:right w:w="100" w:type="dxa"/>
+              <w:top w:w="100" w:type="dxa"/>
+              <w:left w:w="120" w:type="dxa"/>
+              <w:bottom w:w="100" w:type="dxa"/>
+              <w:right w:w="120" w:type="dxa"/>
             </w:tcMar>
           </w:tcPr>
           <w:p>
             <w:pPr>
-              <w:spacing w:before="20" w:after="20" w:line="288" w:lineRule="auto"/>
+              <w:spacing w:before="40" w:after="40" w:line="360" w:lineRule="auto"/>
               <w:jc w:val="center"/>
             </w:pPr>
             <w:r>
               <w:rPr>
-                <w:sz w:val="16"/>
+                <w:sz w:val="17"/>
               </w:rPr>
               <w:t>5</w:t>
             </w:r>
@@ -712,21 +712,21 @@
               <w:right w:val="single" w:sz="4" w:space="0" w:color="000000"/>
             </w:tcBorders>
             <w:tcMar>
-              <w:top w:w="80" w:type="dxa"/>
-              <w:left w:w="100" w:type="dxa"/>
-              <w:bottom w:w="80" w:type="dxa"/>
-              <w:right w:w="100" w:type="dxa"/>
+              <w:top w:w="100" w:type="dxa"/>
+              <w:left w:w="120" w:type="dxa"/>
+              <w:bottom w:w="100" w:type="dxa"/>
+              <w:right w:w="120" w:type="dxa"/>
             </w:tcMar>
           </w:tcPr>
           <w:p>
             <w:pPr>
-              <w:spacing w:before="20" w:after="20" w:line="288" w:lineRule="auto"/>
+              <w:spacing w:before="40" w:after="40" w:line="360" w:lineRule="auto"/>
               <w:jc w:val="left"/>
             </w:pPr>
             <w:r>
               <w:rPr>
                 <w:b/>
-                <w:sz w:val="16"/>
+                <w:sz w:val="17"/>
               </w:rPr>
               <w:t>Kriteria / Batasan</w:t>
             </w:r>
@@ -734,7 +734,7 @@
         </w:tc>
         <w:tc>
           <w:tcPr>
-            <w:tcW w:type="dxa" w:w="3628"/>
+            <w:tcW w:type="dxa" w:w="3572"/>
             <w:vAlign w:val="top"/>
             <w:tcBorders>
               <w:top w:val="single" w:sz="4" w:space="0" w:color="000000"/>
@@ -743,20 +743,20 @@
               <w:right w:val="single" w:sz="4" w:space="0" w:color="000000"/>
             </w:tcBorders>
             <w:tcMar>
-              <w:top w:w="80" w:type="dxa"/>
-              <w:left w:w="100" w:type="dxa"/>
-              <w:bottom w:w="80" w:type="dxa"/>
-              <w:right w:w="100" w:type="dxa"/>
+              <w:top w:w="100" w:type="dxa"/>
+              <w:left w:w="120" w:type="dxa"/>
+              <w:bottom w:w="100" w:type="dxa"/>
+              <w:right w:w="120" w:type="dxa"/>
             </w:tcMar>
           </w:tcPr>
           <w:p>
             <w:pPr>
-              <w:spacing w:before="20" w:after="20" w:line="288" w:lineRule="auto"/>
+              <w:spacing w:before="40" w:after="40" w:line="360" w:lineRule="auto"/>
               <w:jc w:val="left"/>
             </w:pPr>
             <w:r>
               <w:rPr>
-                <w:sz w:val="16"/>
+                <w:sz w:val="17"/>
               </w:rPr>
               <w:t>Aturan ketat, kriteria kelayakan, batasan biaya/hukum, dan larangan halusinasi.</w:t>
             </w:r>
@@ -764,7 +764,7 @@
         </w:tc>
         <w:tc>
           <w:tcPr>
-            <w:tcW w:type="dxa" w:w="3855"/>
+            <w:tcW w:type="dxa" w:w="3685"/>
             <w:vAlign w:val="top"/>
             <w:tcBorders>
               <w:top w:val="single" w:sz="4" w:space="0" w:color="000000"/>
@@ -773,20 +773,20 @@
               <w:right w:val="single" w:sz="4" w:space="0" w:color="000000"/>
             </w:tcBorders>
             <w:tcMar>
-              <w:top w:w="80" w:type="dxa"/>
-              <w:left w:w="100" w:type="dxa"/>
-              <w:bottom w:w="80" w:type="dxa"/>
-              <w:right w:w="100" w:type="dxa"/>
+              <w:top w:w="100" w:type="dxa"/>
+              <w:left w:w="120" w:type="dxa"/>
+              <w:bottom w:w="100" w:type="dxa"/>
+              <w:right w:w="120" w:type="dxa"/>
             </w:tcMar>
           </w:tcPr>
           <w:p>
             <w:pPr>
-              <w:spacing w:before="20" w:after="20" w:line="288" w:lineRule="auto"/>
+              <w:spacing w:before="40" w:after="40" w:line="360" w:lineRule="auto"/>
               <w:jc w:val="left"/>
             </w:pPr>
             <w:r>
               <w:rPr>
-                <w:sz w:val="16"/>
+                <w:sz w:val="17"/>
               </w:rPr>
               <w:t>Tetapkan parameter eliminasi, batas toleransi error, dan nada komunikasi.</w:t>
             </w:r>
@@ -805,20 +805,20 @@
               <w:right w:val="single" w:sz="4" w:space="0" w:color="000000"/>
             </w:tcBorders>
             <w:tcMar>
-              <w:top w:w="80" w:type="dxa"/>
-              <w:left w:w="100" w:type="dxa"/>
-              <w:bottom w:w="80" w:type="dxa"/>
-              <w:right w:w="100" w:type="dxa"/>
+              <w:top w:w="100" w:type="dxa"/>
+              <w:left w:w="120" w:type="dxa"/>
+              <w:bottom w:w="100" w:type="dxa"/>
+              <w:right w:w="120" w:type="dxa"/>
             </w:tcMar>
           </w:tcPr>
           <w:p>
             <w:pPr>
-              <w:spacing w:before="20" w:after="20" w:line="288" w:lineRule="auto"/>
+              <w:spacing w:before="40" w:after="40" w:line="360" w:lineRule="auto"/>
               <w:jc w:val="center"/>
             </w:pPr>
             <w:r>
               <w:rPr>
-                <w:sz w:val="16"/>
+                <w:sz w:val="17"/>
               </w:rPr>
               <w:t>6</w:t>
             </w:r>
@@ -835,21 +835,21 @@
               <w:right w:val="single" w:sz="4" w:space="0" w:color="000000"/>
             </w:tcBorders>
             <w:tcMar>
-              <w:top w:w="80" w:type="dxa"/>
-              <w:left w:w="100" w:type="dxa"/>
-              <w:bottom w:w="80" w:type="dxa"/>
-              <w:right w:w="100" w:type="dxa"/>
+              <w:top w:w="100" w:type="dxa"/>
+              <w:left w:w="120" w:type="dxa"/>
+              <w:bottom w:w="100" w:type="dxa"/>
+              <w:right w:w="120" w:type="dxa"/>
             </w:tcMar>
           </w:tcPr>
           <w:p>
             <w:pPr>
-              <w:spacing w:before="20" w:after="20" w:line="288" w:lineRule="auto"/>
+              <w:spacing w:before="40" w:after="40" w:line="360" w:lineRule="auto"/>
               <w:jc w:val="left"/>
             </w:pPr>
             <w:r>
               <w:rPr>
                 <w:b/>
-                <w:sz w:val="16"/>
+                <w:sz w:val="17"/>
               </w:rPr>
               <w:t>Format Output</w:t>
             </w:r>
@@ -857,7 +857,7 @@
         </w:tc>
         <w:tc>
           <w:tcPr>
-            <w:tcW w:type="dxa" w:w="3628"/>
+            <w:tcW w:type="dxa" w:w="3572"/>
             <w:vAlign w:val="top"/>
             <w:tcBorders>
               <w:top w:val="single" w:sz="4" w:space="0" w:color="000000"/>
@@ -866,20 +866,20 @@
               <w:right w:val="single" w:sz="4" w:space="0" w:color="000000"/>
             </w:tcBorders>
             <w:tcMar>
-              <w:top w:w="80" w:type="dxa"/>
-              <w:left w:w="100" w:type="dxa"/>
-              <w:bottom w:w="80" w:type="dxa"/>
-              <w:right w:w="100" w:type="dxa"/>
+              <w:top w:w="100" w:type="dxa"/>
+              <w:left w:w="120" w:type="dxa"/>
+              <w:bottom w:w="100" w:type="dxa"/>
+              <w:right w:w="120" w:type="dxa"/>
             </w:tcMar>
           </w:tcPr>
           <w:p>
             <w:pPr>
-              <w:spacing w:before="20" w:after="20" w:line="288" w:lineRule="auto"/>
+              <w:spacing w:before="40" w:after="40" w:line="360" w:lineRule="auto"/>
               <w:jc w:val="left"/>
             </w:pPr>
             <w:r>
               <w:rPr>
-                <w:sz w:val="16"/>
+                <w:sz w:val="17"/>
               </w:rPr>
               <w:t>Susunan struktur dokumen, template tabel, urutan bab, atau format data.</w:t>
             </w:r>
@@ -887,7 +887,7 @@
         </w:tc>
         <w:tc>
           <w:tcPr>
-            <w:tcW w:type="dxa" w:w="3855"/>
+            <w:tcW w:type="dxa" w:w="3685"/>
             <w:vAlign w:val="top"/>
             <w:tcBorders>
               <w:top w:val="single" w:sz="4" w:space="0" w:color="000000"/>
@@ -896,20 +896,20 @@
               <w:right w:val="single" w:sz="4" w:space="0" w:color="000000"/>
             </w:tcBorders>
             <w:tcMar>
-              <w:top w:w="80" w:type="dxa"/>
-              <w:left w:w="100" w:type="dxa"/>
-              <w:bottom w:w="80" w:type="dxa"/>
-              <w:right w:w="100" w:type="dxa"/>
+              <w:top w:w="100" w:type="dxa"/>
+              <w:left w:w="120" w:type="dxa"/>
+              <w:bottom w:w="100" w:type="dxa"/>
+              <w:right w:w="120" w:type="dxa"/>
             </w:tcMar>
           </w:tcPr>
           <w:p>
             <w:pPr>
-              <w:spacing w:before="20" w:after="20" w:line="288" w:lineRule="auto"/>
+              <w:spacing w:before="40" w:after="40" w:line="360" w:lineRule="auto"/>
               <w:jc w:val="left"/>
             </w:pPr>
             <w:r>
               <w:rPr>
-                <w:sz w:val="16"/>
+                <w:sz w:val="17"/>
               </w:rPr>
               <w:t>Tentukan pembagian bab, tabel komparasi, poin rekomendasi, atau format tabel.</w:t>
             </w:r>
@@ -928,20 +928,20 @@
               <w:right w:val="single" w:sz="4" w:space="0" w:color="000000"/>
             </w:tcBorders>
             <w:tcMar>
-              <w:top w:w="80" w:type="dxa"/>
-              <w:left w:w="100" w:type="dxa"/>
-              <w:bottom w:w="80" w:type="dxa"/>
-              <w:right w:w="100" w:type="dxa"/>
+              <w:top w:w="100" w:type="dxa"/>
+              <w:left w:w="120" w:type="dxa"/>
+              <w:bottom w:w="100" w:type="dxa"/>
+              <w:right w:w="120" w:type="dxa"/>
             </w:tcMar>
           </w:tcPr>
           <w:p>
             <w:pPr>
-              <w:spacing w:before="20" w:after="20" w:line="288" w:lineRule="auto"/>
+              <w:spacing w:before="40" w:after="40" w:line="360" w:lineRule="auto"/>
               <w:jc w:val="center"/>
             </w:pPr>
             <w:r>
               <w:rPr>
-                <w:sz w:val="16"/>
+                <w:sz w:val="17"/>
               </w:rPr>
               <w:t>7</w:t>
             </w:r>
@@ -958,21 +958,21 @@
               <w:right w:val="single" w:sz="4" w:space="0" w:color="000000"/>
             </w:tcBorders>
             <w:tcMar>
-              <w:top w:w="80" w:type="dxa"/>
-              <w:left w:w="100" w:type="dxa"/>
-              <w:bottom w:w="80" w:type="dxa"/>
-              <w:right w:w="100" w:type="dxa"/>
+              <w:top w:w="100" w:type="dxa"/>
+              <w:left w:w="120" w:type="dxa"/>
+              <w:bottom w:w="100" w:type="dxa"/>
+              <w:right w:w="120" w:type="dxa"/>
             </w:tcMar>
           </w:tcPr>
           <w:p>
             <w:pPr>
-              <w:spacing w:before="20" w:after="20" w:line="288" w:lineRule="auto"/>
+              <w:spacing w:before="40" w:after="40" w:line="360" w:lineRule="auto"/>
               <w:jc w:val="left"/>
             </w:pPr>
             <w:r>
               <w:rPr>
                 <w:b/>
-                <w:sz w:val="16"/>
+                <w:sz w:val="17"/>
               </w:rPr>
               <w:t>Validasi</w:t>
             </w:r>
@@ -980,7 +980,7 @@
         </w:tc>
         <w:tc>
           <w:tcPr>
-            <w:tcW w:type="dxa" w:w="3628"/>
+            <w:tcW w:type="dxa" w:w="3572"/>
             <w:vAlign w:val="top"/>
             <w:tcBorders>
               <w:top w:val="single" w:sz="4" w:space="0" w:color="000000"/>
@@ -989,20 +989,20 @@
               <w:right w:val="single" w:sz="4" w:space="0" w:color="000000"/>
             </w:tcBorders>
             <w:tcMar>
-              <w:top w:w="80" w:type="dxa"/>
-              <w:left w:w="100" w:type="dxa"/>
-              <w:bottom w:w="80" w:type="dxa"/>
-              <w:right w:w="100" w:type="dxa"/>
+              <w:top w:w="100" w:type="dxa"/>
+              <w:left w:w="120" w:type="dxa"/>
+              <w:bottom w:w="100" w:type="dxa"/>
+              <w:right w:w="120" w:type="dxa"/>
             </w:tcMar>
           </w:tcPr>
           <w:p>
             <w:pPr>
-              <w:spacing w:before="20" w:after="20" w:line="288" w:lineRule="auto"/>
+              <w:spacing w:before="40" w:after="40" w:line="360" w:lineRule="auto"/>
               <w:jc w:val="left"/>
             </w:pPr>
             <w:r>
               <w:rPr>
-                <w:sz w:val="16"/>
+                <w:sz w:val="17"/>
               </w:rPr>
               <w:t>Perintah verifikasi mandiri agar AI mengecek kembali kepatuhan hasil terhadap input.</w:t>
             </w:r>
@@ -1010,7 +1010,7 @@
         </w:tc>
         <w:tc>
           <w:tcPr>
-            <w:tcW w:type="dxa" w:w="3855"/>
+            <w:tcW w:type="dxa" w:w="3685"/>
             <w:vAlign w:val="top"/>
             <w:tcBorders>
               <w:top w:val="single" w:sz="4" w:space="0" w:color="000000"/>
@@ -1019,20 +1019,20 @@
               <w:right w:val="single" w:sz="4" w:space="0" w:color="000000"/>
             </w:tcBorders>
             <w:tcMar>
-              <w:top w:w="80" w:type="dxa"/>
-              <w:left w:w="100" w:type="dxa"/>
-              <w:bottom w:w="80" w:type="dxa"/>
-              <w:right w:w="100" w:type="dxa"/>
+              <w:top w:w="100" w:type="dxa"/>
+              <w:left w:w="120" w:type="dxa"/>
+              <w:bottom w:w="100" w:type="dxa"/>
+              <w:right w:w="120" w:type="dxa"/>
             </w:tcMar>
           </w:tcPr>
           <w:p>
             <w:pPr>
-              <w:spacing w:before="20" w:after="20" w:line="288" w:lineRule="auto"/>
+              <w:spacing w:before="40" w:after="40" w:line="360" w:lineRule="auto"/>
               <w:jc w:val="left"/>
             </w:pPr>
             <w:r>
               <w:rPr>
-                <w:sz w:val="16"/>
+                <w:sz w:val="17"/>
               </w:rPr>
               <w:t>Instruksikan AI memvalidasi angka, kepatuhan kriteria, dan konsistensi data.</w:t>
             </w:r>
@@ -1042,12 +1042,12 @@
     </w:tbl>
     <w:p>
       <w:pPr>
-        <w:spacing w:before="240" w:after="80"/>
+        <w:spacing w:before="280" w:after="80" w:line="360" w:lineRule="auto"/>
       </w:pPr>
       <w:r>
         <w:rPr>
           <w:b/>
-          <w:sz w:val="21"/>
+          <w:sz w:val="22"/>
         </w:rPr>
         <w:t>2. POLA / TEMPLATE BAKU PROMPT</w:t>
       </w:r>
@@ -1059,12 +1059,12 @@
         <w:tblLook w:firstColumn="1" w:firstRow="1" w:lastColumn="0" w:lastRow="0" w:noHBand="0" w:noVBand="1" w:val="04A0"/>
       </w:tblPr>
       <w:tblGrid>
-        <w:gridCol w:w="9866"/>
+        <w:gridCol w:w="9638"/>
       </w:tblGrid>
       <w:tr>
         <w:tc>
           <w:tcPr>
-            <w:tcW w:type="dxa" w:w="9865"/>
+            <w:tcW w:type="dxa" w:w="9638"/>
             <w:tcBorders>
               <w:top w:val="single" w:sz="6" w:space="0" w:color="000000"/>
               <w:left w:val="single" w:sz="6" w:space="0" w:color="000000"/>
@@ -1072,15 +1072,15 @@
               <w:right w:val="single" w:sz="6" w:space="0" w:color="000000"/>
             </w:tcBorders>
             <w:tcMar>
-              <w:top w:w="100" w:type="dxa"/>
-              <w:left w:w="130" w:type="dxa"/>
-              <w:bottom w:w="100" w:type="dxa"/>
-              <w:right w:w="130" w:type="dxa"/>
+              <w:top w:w="130" w:type="dxa"/>
+              <w:left w:w="150" w:type="dxa"/>
+              <w:bottom w:w="130" w:type="dxa"/>
+              <w:right w:w="150" w:type="dxa"/>
             </w:tcMar>
           </w:tcPr>
           <w:p>
             <w:pPr>
-              <w:spacing w:before="40" w:after="40" w:line="312" w:lineRule="auto"/>
+              <w:spacing w:before="60" w:after="60" w:line="360" w:lineRule="auto"/>
               <w:jc w:val="left"/>
             </w:pPr>
             <w:r>
@@ -1099,7 +1099,7 @@
           </w:p>
           <w:p>
             <w:pPr>
-              <w:spacing w:before="40" w:after="40" w:line="312" w:lineRule="auto"/>
+              <w:spacing w:before="60" w:after="60" w:line="360" w:lineRule="auto"/>
               <w:jc w:val="left"/>
             </w:pPr>
             <w:r>
@@ -1118,7 +1118,7 @@
           </w:p>
           <w:p>
             <w:pPr>
-              <w:spacing w:before="40" w:after="40" w:line="312" w:lineRule="auto"/>
+              <w:spacing w:before="60" w:after="60" w:line="360" w:lineRule="auto"/>
               <w:jc w:val="left"/>
             </w:pPr>
             <w:r>
@@ -1137,7 +1137,7 @@
           </w:p>
           <w:p>
             <w:pPr>
-              <w:spacing w:before="40" w:after="40" w:line="312" w:lineRule="auto"/>
+              <w:spacing w:before="60" w:after="60" w:line="360" w:lineRule="auto"/>
               <w:jc w:val="left"/>
             </w:pPr>
             <w:r>
@@ -1156,7 +1156,7 @@
           </w:p>
           <w:p>
             <w:pPr>
-              <w:spacing w:before="40" w:after="40" w:line="312" w:lineRule="auto"/>
+              <w:spacing w:before="60" w:after="60" w:line="360" w:lineRule="auto"/>
               <w:jc w:val="left"/>
             </w:pPr>
             <w:r>
@@ -1175,7 +1175,7 @@
           </w:p>
           <w:p>
             <w:pPr>
-              <w:spacing w:before="40" w:after="40" w:line="312" w:lineRule="auto"/>
+              <w:spacing w:before="60" w:after="60" w:line="360" w:lineRule="auto"/>
               <w:jc w:val="left"/>
             </w:pPr>
             <w:r>
@@ -1194,7 +1194,7 @@
           </w:p>
           <w:p>
             <w:pPr>
-              <w:spacing w:before="40" w:after="40" w:line="312" w:lineRule="auto"/>
+              <w:spacing w:before="60" w:after="60" w:line="360" w:lineRule="auto"/>
               <w:jc w:val="left"/>
             </w:pPr>
             <w:r>
@@ -1221,38 +1221,38 @@
     </w:p>
     <w:p>
       <w:pPr>
-        <w:spacing w:after="40"/>
+        <w:spacing w:before="0" w:after="60" w:line="360" w:lineRule="auto"/>
         <w:jc w:val="center"/>
       </w:pPr>
       <w:r>
         <w:rPr>
           <w:b/>
-          <w:sz w:val="27"/>
+          <w:sz w:val="28"/>
         </w:rPr>
         <w:t>CONTOH PENERAPAN DASAR (SEDERHANA)</w:t>
       </w:r>
     </w:p>
     <w:p>
       <w:pPr>
-        <w:spacing w:after="200"/>
+        <w:spacing w:before="0" w:after="240" w:line="360" w:lineRule="auto"/>
         <w:jc w:val="center"/>
       </w:pPr>
       <w:r>
         <w:rPr>
-          <w:color w:val="505050"/>
-          <w:sz w:val="18"/>
+          <w:color w:val="464646"/>
+          <w:sz w:val="19"/>
         </w:rPr>
         <w:t>Kasus Sehari-hari yang Mudah Dipahami dan Dipraktikkan</w:t>
       </w:r>
     </w:p>
     <w:p>
       <w:pPr>
-        <w:spacing w:before="80" w:after="80"/>
+        <w:spacing w:before="120" w:after="80" w:line="360" w:lineRule="auto"/>
       </w:pPr>
       <w:r>
         <w:rPr>
           <w:b/>
-          <w:sz w:val="20"/>
+          <w:sz w:val="21"/>
         </w:rPr>
         <w:t>3. CONTOH KASUS SEDERHANA 1: MEMBUAT PESAN WHATSAPP PENGINGAT RAPAT</w:t>
       </w:r>
@@ -1264,12 +1264,12 @@
         <w:tblLook w:firstColumn="1" w:firstRow="1" w:lastColumn="0" w:lastRow="0" w:noHBand="0" w:noVBand="1" w:val="04A0"/>
       </w:tblPr>
       <w:tblGrid>
-        <w:gridCol w:w="9866"/>
+        <w:gridCol w:w="9638"/>
       </w:tblGrid>
       <w:tr>
         <w:tc>
           <w:tcPr>
-            <w:tcW w:type="dxa" w:w="9865"/>
+            <w:tcW w:type="dxa" w:w="9638"/>
             <w:tcBorders>
               <w:top w:val="single" w:sz="4" w:space="0" w:color="000000"/>
               <w:left w:val="single" w:sz="4" w:space="0" w:color="000000"/>
@@ -1277,15 +1277,15 @@
               <w:right w:val="single" w:sz="4" w:space="0" w:color="000000"/>
             </w:tcBorders>
             <w:tcMar>
-              <w:top w:w="90" w:type="dxa"/>
-              <w:left w:w="120" w:type="dxa"/>
-              <w:bottom w:w="90" w:type="dxa"/>
-              <w:right w:w="120" w:type="dxa"/>
+              <w:top w:w="120" w:type="dxa"/>
+              <w:left w:w="140" w:type="dxa"/>
+              <w:bottom w:w="120" w:type="dxa"/>
+              <w:right w:w="140" w:type="dxa"/>
             </w:tcMar>
           </w:tcPr>
           <w:p>
             <w:pPr>
-              <w:spacing w:before="40" w:after="40" w:line="300" w:lineRule="auto"/>
+              <w:spacing w:before="60" w:after="60" w:line="360" w:lineRule="auto"/>
               <w:jc w:val="left"/>
             </w:pPr>
             <w:r>
@@ -1304,7 +1304,7 @@
           </w:p>
           <w:p>
             <w:pPr>
-              <w:spacing w:before="40" w:after="40" w:line="300" w:lineRule="auto"/>
+              <w:spacing w:before="60" w:after="60" w:line="360" w:lineRule="auto"/>
               <w:jc w:val="left"/>
             </w:pPr>
             <w:r>
@@ -1323,7 +1323,7 @@
           </w:p>
           <w:p>
             <w:pPr>
-              <w:spacing w:before="40" w:after="40" w:line="300" w:lineRule="auto"/>
+              <w:spacing w:before="60" w:after="60" w:line="360" w:lineRule="auto"/>
               <w:jc w:val="left"/>
             </w:pPr>
             <w:r>
@@ -1342,7 +1342,7 @@
           </w:p>
           <w:p>
             <w:pPr>
-              <w:spacing w:before="40" w:after="40" w:line="300" w:lineRule="auto"/>
+              <w:spacing w:before="60" w:after="60" w:line="360" w:lineRule="auto"/>
               <w:jc w:val="left"/>
             </w:pPr>
             <w:r>
@@ -1355,59 +1355,59 @@
           </w:p>
           <w:p>
             <w:pPr>
-              <w:spacing w:before="20" w:after="20" w:line="288" w:lineRule="auto"/>
-              <w:ind w:left="227"/>
+              <w:spacing w:before="40" w:after="40" w:line="360" w:lineRule="auto"/>
+              <w:ind w:left="283"/>
               <w:jc w:val="left"/>
             </w:pPr>
             <w:r>
               <w:rPr>
-                <w:sz w:val="16"/>
+                <w:sz w:val="17"/>
               </w:rPr>
               <w:t>•  Agenda: Pembahasan progres kerja mingguan.</w:t>
             </w:r>
           </w:p>
           <w:p>
             <w:pPr>
-              <w:spacing w:before="20" w:after="20" w:line="288" w:lineRule="auto"/>
-              <w:ind w:left="227"/>
+              <w:spacing w:before="40" w:after="40" w:line="360" w:lineRule="auto"/>
+              <w:ind w:left="283"/>
               <w:jc w:val="left"/>
             </w:pPr>
             <w:r>
               <w:rPr>
-                <w:sz w:val="16"/>
+                <w:sz w:val="17"/>
               </w:rPr>
               <w:t>•  Hari/Tanggal: Senin, 31 Agustus 2026 | Jam: 09.00 - 10.00 WIB.</w:t>
             </w:r>
           </w:p>
           <w:p>
             <w:pPr>
-              <w:spacing w:before="20" w:after="20" w:line="288" w:lineRule="auto"/>
-              <w:ind w:left="227"/>
+              <w:spacing w:before="40" w:after="40" w:line="360" w:lineRule="auto"/>
+              <w:ind w:left="283"/>
               <w:jc w:val="left"/>
             </w:pPr>
             <w:r>
               <w:rPr>
-                <w:sz w:val="16"/>
+                <w:sz w:val="17"/>
               </w:rPr>
               <w:t>•  Tempat: Ruang Rapat Lt. 2 (atau link Google Meet bagi yang WFH).</w:t>
             </w:r>
           </w:p>
           <w:p>
             <w:pPr>
-              <w:spacing w:before="20" w:after="20" w:line="288" w:lineRule="auto"/>
-              <w:ind w:left="227"/>
+              <w:spacing w:before="40" w:after="40" w:line="360" w:lineRule="auto"/>
+              <w:ind w:left="283"/>
               <w:jc w:val="left"/>
             </w:pPr>
             <w:r>
               <w:rPr>
-                <w:sz w:val="16"/>
+                <w:sz w:val="17"/>
               </w:rPr>
               <w:t>•  Bawaan: Laptop dan catatan progres masing-masing.</w:t>
             </w:r>
           </w:p>
           <w:p>
             <w:pPr>
-              <w:spacing w:before="40" w:after="40" w:line="300" w:lineRule="auto"/>
+              <w:spacing w:before="60" w:after="60" w:line="360" w:lineRule="auto"/>
               <w:jc w:val="left"/>
             </w:pPr>
             <w:r>
@@ -1426,7 +1426,7 @@
           </w:p>
           <w:p>
             <w:pPr>
-              <w:spacing w:before="40" w:after="40" w:line="300" w:lineRule="auto"/>
+              <w:spacing w:before="60" w:after="60" w:line="360" w:lineRule="auto"/>
               <w:jc w:val="left"/>
             </w:pPr>
             <w:r>
@@ -1445,7 +1445,7 @@
           </w:p>
           <w:p>
             <w:pPr>
-              <w:spacing w:before="40" w:after="40" w:line="300" w:lineRule="auto"/>
+              <w:spacing w:before="60" w:after="60" w:line="360" w:lineRule="auto"/>
               <w:jc w:val="left"/>
             </w:pPr>
             <w:r>
@@ -1467,12 +1467,12 @@
     </w:tbl>
     <w:p>
       <w:pPr>
-        <w:spacing w:before="200" w:after="80"/>
+        <w:spacing w:before="240" w:after="80" w:line="360" w:lineRule="auto"/>
       </w:pPr>
       <w:r>
         <w:rPr>
           <w:b/>
-          <w:sz w:val="20"/>
+          <w:sz w:val="21"/>
         </w:rPr>
         <w:t>4. CONTOH KASUS SEDERHANA 2: MERAPIKAN CATATAN TUGAS MENJADI DAFTAR PRIORITAS</w:t>
       </w:r>
@@ -1484,12 +1484,12 @@
         <w:tblLook w:firstColumn="1" w:firstRow="1" w:lastColumn="0" w:lastRow="0" w:noHBand="0" w:noVBand="1" w:val="04A0"/>
       </w:tblPr>
       <w:tblGrid>
-        <w:gridCol w:w="9866"/>
+        <w:gridCol w:w="9638"/>
       </w:tblGrid>
       <w:tr>
         <w:tc>
           <w:tcPr>
-            <w:tcW w:type="dxa" w:w="9865"/>
+            <w:tcW w:type="dxa" w:w="9638"/>
             <w:tcBorders>
               <w:top w:val="single" w:sz="4" w:space="0" w:color="000000"/>
               <w:left w:val="single" w:sz="4" w:space="0" w:color="000000"/>
@@ -1497,15 +1497,15 @@
               <w:right w:val="single" w:sz="4" w:space="0" w:color="000000"/>
             </w:tcBorders>
             <w:tcMar>
-              <w:top w:w="90" w:type="dxa"/>
-              <w:left w:w="120" w:type="dxa"/>
-              <w:bottom w:w="90" w:type="dxa"/>
-              <w:right w:w="120" w:type="dxa"/>
+              <w:top w:w="120" w:type="dxa"/>
+              <w:left w:w="140" w:type="dxa"/>
+              <w:bottom w:w="120" w:type="dxa"/>
+              <w:right w:w="140" w:type="dxa"/>
             </w:tcMar>
           </w:tcPr>
           <w:p>
             <w:pPr>
-              <w:spacing w:before="40" w:after="40" w:line="300" w:lineRule="auto"/>
+              <w:spacing w:before="60" w:after="60" w:line="360" w:lineRule="auto"/>
               <w:jc w:val="left"/>
             </w:pPr>
             <w:r>
@@ -1524,7 +1524,7 @@
           </w:p>
           <w:p>
             <w:pPr>
-              <w:spacing w:before="40" w:after="40" w:line="300" w:lineRule="auto"/>
+              <w:spacing w:before="60" w:after="60" w:line="360" w:lineRule="auto"/>
               <w:jc w:val="left"/>
             </w:pPr>
             <w:r>
@@ -1543,7 +1543,7 @@
           </w:p>
           <w:p>
             <w:pPr>
-              <w:spacing w:before="40" w:after="40" w:line="300" w:lineRule="auto"/>
+              <w:spacing w:before="60" w:after="60" w:line="360" w:lineRule="auto"/>
               <w:jc w:val="left"/>
             </w:pPr>
             <w:r>
@@ -1562,7 +1562,7 @@
           </w:p>
           <w:p>
             <w:pPr>
-              <w:spacing w:before="40" w:after="40" w:line="300" w:lineRule="auto"/>
+              <w:spacing w:before="60" w:after="60" w:line="360" w:lineRule="auto"/>
               <w:jc w:val="left"/>
             </w:pPr>
             <w:r>
@@ -1581,7 +1581,7 @@
           </w:p>
           <w:p>
             <w:pPr>
-              <w:spacing w:before="40" w:after="40" w:line="300" w:lineRule="auto"/>
+              <w:spacing w:before="60" w:after="60" w:line="360" w:lineRule="auto"/>
               <w:jc w:val="left"/>
             </w:pPr>
             <w:r>
@@ -1600,7 +1600,7 @@
           </w:p>
           <w:p>
             <w:pPr>
-              <w:spacing w:before="40" w:after="40" w:line="300" w:lineRule="auto"/>
+              <w:spacing w:before="60" w:after="60" w:line="360" w:lineRule="auto"/>
               <w:jc w:val="left"/>
             </w:pPr>
             <w:r>
@@ -1619,7 +1619,7 @@
           </w:p>
           <w:p>
             <w:pPr>
-              <w:spacing w:before="40" w:after="40" w:line="300" w:lineRule="auto"/>
+              <w:spacing w:before="60" w:after="60" w:line="360" w:lineRule="auto"/>
               <w:jc w:val="left"/>
             </w:pPr>
             <w:r>
@@ -1646,38 +1646,38 @@
     </w:p>
     <w:p>
       <w:pPr>
-        <w:spacing w:after="40"/>
+        <w:spacing w:before="0" w:after="60" w:line="360" w:lineRule="auto"/>
         <w:jc w:val="center"/>
       </w:pPr>
       <w:r>
         <w:rPr>
           <w:b/>
-          <w:sz w:val="27"/>
+          <w:sz w:val="28"/>
         </w:rPr>
         <w:t>CONTOH PENERAPAN TINGKAT LANJUT (KOMPLEKS)</w:t>
       </w:r>
     </w:p>
     <w:p>
       <w:pPr>
-        <w:spacing w:after="200"/>
+        <w:spacing w:before="0" w:after="240" w:line="360" w:lineRule="auto"/>
         <w:jc w:val="center"/>
       </w:pPr>
       <w:r>
         <w:rPr>
-          <w:color w:val="505050"/>
-          <w:sz w:val="18"/>
+          <w:color w:val="464646"/>
+          <w:sz w:val="19"/>
         </w:rPr>
         <w:t>Kasus Multi-Kriteria, Analisis Teknis, Kepatuhan Regulasi &amp; Mitigasi Risiko</w:t>
       </w:r>
     </w:p>
     <w:p>
       <w:pPr>
-        <w:spacing w:before="80" w:after="80"/>
+        <w:spacing w:before="120" w:after="80" w:line="360" w:lineRule="auto"/>
       </w:pPr>
       <w:r>
         <w:rPr>
           <w:b/>
-          <w:sz w:val="20"/>
+          <w:sz w:val="21"/>
         </w:rPr>
         <w:t>5. CONTOH KASUS KOMPLEKS: EVALUASI MULTI-VENDOR MIGRASI CLOUD &amp; ANALISIS RISIKO SLA</w:t>
       </w:r>
@@ -1689,12 +1689,12 @@
         <w:tblLook w:firstColumn="1" w:firstRow="1" w:lastColumn="0" w:lastRow="0" w:noHBand="0" w:noVBand="1" w:val="04A0"/>
       </w:tblPr>
       <w:tblGrid>
-        <w:gridCol w:w="9866"/>
+        <w:gridCol w:w="9638"/>
       </w:tblGrid>
       <w:tr>
         <w:tc>
           <w:tcPr>
-            <w:tcW w:type="dxa" w:w="9865"/>
+            <w:tcW w:type="dxa" w:w="9638"/>
             <w:tcBorders>
               <w:top w:val="single" w:sz="4" w:space="0" w:color="000000"/>
               <w:left w:val="single" w:sz="4" w:space="0" w:color="000000"/>
@@ -1702,15 +1702,15 @@
               <w:right w:val="single" w:sz="4" w:space="0" w:color="000000"/>
             </w:tcBorders>
             <w:tcMar>
-              <w:top w:w="90" w:type="dxa"/>
-              <w:left w:w="120" w:type="dxa"/>
-              <w:bottom w:w="90" w:type="dxa"/>
-              <w:right w:w="120" w:type="dxa"/>
+              <w:top w:w="120" w:type="dxa"/>
+              <w:left w:w="140" w:type="dxa"/>
+              <w:bottom w:w="120" w:type="dxa"/>
+              <w:right w:w="140" w:type="dxa"/>
             </w:tcMar>
           </w:tcPr>
           <w:p>
             <w:pPr>
-              <w:spacing w:before="40" w:after="40" w:line="300" w:lineRule="auto"/>
+              <w:spacing w:before="60" w:after="60" w:line="360" w:lineRule="auto"/>
               <w:jc w:val="left"/>
             </w:pPr>
             <w:r>
@@ -1729,7 +1729,7 @@
           </w:p>
           <w:p>
             <w:pPr>
-              <w:spacing w:before="40" w:after="40" w:line="300" w:lineRule="auto"/>
+              <w:spacing w:before="60" w:after="60" w:line="360" w:lineRule="auto"/>
               <w:jc w:val="left"/>
             </w:pPr>
             <w:r>
@@ -1748,7 +1748,7 @@
           </w:p>
           <w:p>
             <w:pPr>
-              <w:spacing w:before="40" w:after="40" w:line="300" w:lineRule="auto"/>
+              <w:spacing w:before="60" w:after="60" w:line="360" w:lineRule="auto"/>
               <w:jc w:val="left"/>
             </w:pPr>
             <w:r>
@@ -1767,7 +1767,7 @@
           </w:p>
           <w:p>
             <w:pPr>
-              <w:spacing w:before="40" w:after="40" w:line="300" w:lineRule="auto"/>
+              <w:spacing w:before="60" w:after="60" w:line="360" w:lineRule="auto"/>
               <w:jc w:val="left"/>
             </w:pPr>
             <w:r>
@@ -1780,72 +1780,72 @@
           </w:p>
           <w:p>
             <w:pPr>
-              <w:spacing w:before="20" w:after="20" w:line="288" w:lineRule="auto"/>
-              <w:ind w:left="227"/>
+              <w:spacing w:before="40" w:after="40" w:line="360" w:lineRule="auto"/>
+              <w:ind w:left="283"/>
               <w:jc w:val="left"/>
             </w:pPr>
             <w:r>
               <w:rPr>
-                <w:sz w:val="16"/>
+                <w:sz w:val="17"/>
               </w:rPr>
               <w:t>•  Batas Anggaran: Maksimal $1.500/bulan ($18.000/tahun).</w:t>
             </w:r>
           </w:p>
           <w:p>
             <w:pPr>
-              <w:spacing w:before="20" w:after="20" w:line="288" w:lineRule="auto"/>
-              <w:ind w:left="227"/>
+              <w:spacing w:before="40" w:after="40" w:line="360" w:lineRule="auto"/>
+              <w:ind w:left="283"/>
               <w:jc w:val="left"/>
             </w:pPr>
             <w:r>
               <w:rPr>
-                <w:sz w:val="16"/>
+                <w:sz w:val="17"/>
               </w:rPr>
               <w:t>•  Regulasi Wajib: Data nasabah finansial wajib bertempat fisik di dalam wilayah Republik Indonesia (PP PSTE).</w:t>
             </w:r>
           </w:p>
           <w:p>
             <w:pPr>
-              <w:spacing w:before="20" w:after="20" w:line="288" w:lineRule="auto"/>
-              <w:ind w:left="227"/>
+              <w:spacing w:before="40" w:after="40" w:line="360" w:lineRule="auto"/>
+              <w:ind w:left="283"/>
               <w:jc w:val="left"/>
             </w:pPr>
             <w:r>
               <w:rPr>
-                <w:sz w:val="16"/>
+                <w:sz w:val="17"/>
               </w:rPr>
               <w:t>•  Vendor A (Lokal Tier-3): Biaya $1.200/bln, Latensi 15ms (Jakarta DC), RTO 15 menit, RPO 5 menit, Lokasi Data: Indonesia, Backup: Otomatis harian, Multi-AZ: Tidak.</w:t>
             </w:r>
           </w:p>
           <w:p>
             <w:pPr>
-              <w:spacing w:before="20" w:after="20" w:line="288" w:lineRule="auto"/>
-              <w:ind w:left="227"/>
+              <w:spacing w:before="40" w:after="40" w:line="360" w:lineRule="auto"/>
+              <w:ind w:left="283"/>
               <w:jc w:val="left"/>
             </w:pPr>
             <w:r>
               <w:rPr>
-                <w:sz w:val="16"/>
+                <w:sz w:val="17"/>
               </w:rPr>
               <w:t>•  Vendor B (Global Provider X): Biaya $850/bln, Latensi 65ms (Singapura DC), RTO 1 jam, RPO 30 menit, Lokasi Data: Singapura, Backup: Manual mingguan, Multi-AZ: Ya.</w:t>
             </w:r>
           </w:p>
           <w:p>
             <w:pPr>
-              <w:spacing w:before="20" w:after="20" w:line="288" w:lineRule="auto"/>
-              <w:ind w:left="227"/>
+              <w:spacing w:before="40" w:after="40" w:line="360" w:lineRule="auto"/>
+              <w:ind w:left="283"/>
               <w:jc w:val="left"/>
             </w:pPr>
             <w:r>
               <w:rPr>
-                <w:sz w:val="16"/>
+                <w:sz w:val="17"/>
               </w:rPr>
               <w:t>•  Vendor C (Enterprise Multi-Zone): Biaya $2.100/bln, Latensi 12ms (Jakarta-Surabaya Dual DC), RTO 2 menit, RPO 0 detik (Sync Multi-AZ), Lokasi Data: Indonesia, Compliance: SOC 2 &amp; PCI-DSS.</w:t>
             </w:r>
           </w:p>
           <w:p>
             <w:pPr>
-              <w:spacing w:before="40" w:after="40" w:line="300" w:lineRule="auto"/>
+              <w:spacing w:before="60" w:after="60" w:line="360" w:lineRule="auto"/>
               <w:jc w:val="left"/>
             </w:pPr>
             <w:r>
@@ -1858,46 +1858,46 @@
           </w:p>
           <w:p>
             <w:pPr>
-              <w:spacing w:before="20" w:after="20" w:line="288" w:lineRule="auto"/>
-              <w:ind w:left="227"/>
+              <w:spacing w:before="40" w:after="40" w:line="360" w:lineRule="auto"/>
+              <w:ind w:left="283"/>
               <w:jc w:val="left"/>
             </w:pPr>
             <w:r>
               <w:rPr>
-                <w:sz w:val="16"/>
+                <w:sz w:val="17"/>
               </w:rPr>
               <w:t>•  Eliminasi Mutlak: Diskualifikasi langsung vendor yang melanggar hukum data residency Indonesia tanpa pengecualian.</w:t>
             </w:r>
           </w:p>
           <w:p>
             <w:pPr>
-              <w:spacing w:before="20" w:after="20" w:line="288" w:lineRule="auto"/>
-              <w:ind w:left="227"/>
+              <w:spacing w:before="40" w:after="40" w:line="360" w:lineRule="auto"/>
+              <w:ind w:left="283"/>
               <w:jc w:val="left"/>
             </w:pPr>
             <w:r>
               <w:rPr>
-                <w:sz w:val="16"/>
+                <w:sz w:val="17"/>
               </w:rPr>
               <w:t>•  Kepatuhan Anggaran: Jika opsi terbaik melebihi anggaran $1.500/bln, rancang skema optimasi/hybrid agar pengeluaran riil masuk toleransi anggaran.</w:t>
             </w:r>
           </w:p>
           <w:p>
             <w:pPr>
-              <w:spacing w:before="20" w:after="20" w:line="288" w:lineRule="auto"/>
-              <w:ind w:left="227"/>
+              <w:spacing w:before="40" w:after="40" w:line="360" w:lineRule="auto"/>
+              <w:ind w:left="283"/>
               <w:jc w:val="left"/>
             </w:pPr>
             <w:r>
               <w:rPr>
-                <w:sz w:val="16"/>
+                <w:sz w:val="17"/>
               </w:rPr>
               <w:t>•  Objektivitas: Tuliskan perhitungan matematika TCO secara transparan tanpa angka perkiraan bebas. Hindari bahasa marketing.</w:t>
             </w:r>
           </w:p>
           <w:p>
             <w:pPr>
-              <w:spacing w:before="40" w:after="40" w:line="300" w:lineRule="auto"/>
+              <w:spacing w:before="60" w:after="60" w:line="360" w:lineRule="auto"/>
               <w:jc w:val="left"/>
             </w:pPr>
             <w:r>
@@ -1910,72 +1910,72 @@
           </w:p>
           <w:p>
             <w:pPr>
-              <w:spacing w:before="20" w:after="20" w:line="288" w:lineRule="auto"/>
-              <w:ind w:left="227"/>
+              <w:spacing w:before="40" w:after="40" w:line="360" w:lineRule="auto"/>
+              <w:ind w:left="283"/>
               <w:jc w:val="left"/>
             </w:pPr>
             <w:r>
               <w:rPr>
-                <w:sz w:val="16"/>
+                <w:sz w:val="17"/>
               </w:rPr>
               <w:t>•  1. Matriks Uji Kelayakan Awal (Tabel: Vendor, Kepatuhan Regulasi Data, Status Lolos/Diskualifikasi).</w:t>
             </w:r>
           </w:p>
           <w:p>
             <w:pPr>
-              <w:spacing w:before="20" w:after="20" w:line="288" w:lineRule="auto"/>
-              <w:ind w:left="227"/>
+              <w:spacing w:before="40" w:after="40" w:line="360" w:lineRule="auto"/>
+              <w:ind w:left="283"/>
               <w:jc w:val="left"/>
             </w:pPr>
             <w:r>
               <w:rPr>
-                <w:sz w:val="16"/>
+                <w:sz w:val="17"/>
               </w:rPr>
               <w:t>•  2. Tabel Komparasi Kuantitatif &amp; TCO 1 Tahun (Kolom: Vendor, Biaya/Bulan, TCO 12 Bulan, Latensi, RTO, RPO).</w:t>
             </w:r>
           </w:p>
           <w:p>
             <w:pPr>
-              <w:spacing w:before="20" w:after="20" w:line="288" w:lineRule="auto"/>
-              <w:ind w:left="227"/>
+              <w:spacing w:before="40" w:after="40" w:line="360" w:lineRule="auto"/>
+              <w:ind w:left="283"/>
               <w:jc w:val="left"/>
             </w:pPr>
             <w:r>
               <w:rPr>
-                <w:sz w:val="16"/>
+                <w:sz w:val="17"/>
               </w:rPr>
               <w:t>•  3. Analisis Trade-Off &amp; Skenario Kegagalan (Dampak downtime finansial vs penghematan biaya).</w:t>
             </w:r>
           </w:p>
           <w:p>
             <w:pPr>
-              <w:spacing w:before="20" w:after="20" w:line="288" w:lineRule="auto"/>
-              <w:ind w:left="227"/>
+              <w:spacing w:before="40" w:after="40" w:line="360" w:lineRule="auto"/>
+              <w:ind w:left="283"/>
               <w:jc w:val="left"/>
             </w:pPr>
             <w:r>
               <w:rPr>
-                <w:sz w:val="16"/>
+                <w:sz w:val="17"/>
               </w:rPr>
               <w:t>•  4. Rekomendasi Arsitektur Terpilih &amp; Skema Optimasi Biaya.</w:t>
             </w:r>
           </w:p>
           <w:p>
             <w:pPr>
-              <w:spacing w:before="20" w:after="20" w:line="288" w:lineRule="auto"/>
-              <w:ind w:left="227"/>
+              <w:spacing w:before="40" w:after="40" w:line="360" w:lineRule="auto"/>
+              <w:ind w:left="283"/>
               <w:jc w:val="left"/>
             </w:pPr>
             <w:r>
               <w:rPr>
-                <w:sz w:val="16"/>
+                <w:sz w:val="17"/>
               </w:rPr>
               <w:t>•  5. Rencana Mitigasi Risiko &amp; Roadmap Cutover 4 Fase (Preparation, PoC, Cutover Zero-Downtime, Post-Audit).</w:t>
             </w:r>
           </w:p>
           <w:p>
             <w:pPr>
-              <w:spacing w:before="40" w:after="40" w:line="300" w:lineRule="auto"/>
+              <w:spacing w:before="60" w:after="60" w:line="360" w:lineRule="auto"/>
               <w:jc w:val="left"/>
             </w:pPr>
             <w:r>
@@ -1997,7 +1997,7 @@
     </w:tbl>
     <w:sectPr>
       <w:pgSz w:w="11906" w:h="16838"/>
-      <w:pgMar w:top="1020" w:right="1020" w:bottom="1020" w:left="1020" w:header="720" w:footer="720" w:gutter="0"/>
+      <w:pgMar w:top="1134" w:right="1134" w:bottom="1134" w:left="1134" w:header="720" w:footer="720" w:gutter="0"/>
       <w:cols w:space="720"/>
       <w:docGrid w:linePitch="360"/>
     </w:sectPr>
@@ -2368,6 +2368,9 @@
     <w:name w:val="Normal"/>
     <w:qFormat/>
     <w:rsid w:val="00FC693F"/>
+    <w:pPr>
+      <w:spacing w:line="360" w:lineRule="auto"/>
+    </w:pPr>
     <w:rPr>
       <w:rFonts w:ascii="Arial" w:hAnsi="Arial"/>
       <w:color w:val="000000"/>

</xml_diff>